<commit_message>
docs: réglages GitHub à reproduire (protection de main, secret scanning)
Ces réglages ne sont pas dans le dépôt : un fork ou un transfert ne les
copie pas. Documentés pour une équipe qui reprend le projet.
</commit_message>
<xml_diff>
--- a/docs/passation/Lab-Horizon-dossier-de-passation.docx
+++ b/docs/passation/Lab-Horizon-dossier-de-passation.docx
@@ -8398,15 +8398,6 @@
           <w:sz w:val="22"/>
         </w:rPr>
         <w:t xml:space="preserve">npm install</w:t>
-      </w:r>
-      <w:r>
-        <w:rPr>
-          <w:rStyle w:val="NormalTok"/>
-          <w:rFonts w:ascii="Consolas" w:hAnsi="Consolas" w:cs="Consolas" w:eastAsia="Consolas"/>
-          <w:b w:val="0"/>
-          <w:color w:val="0A192F"/>
-          <w:sz w:val="22"/>
-        </w:rPr>
         <w:br/>
       </w:r>
       <w:r>
@@ -13581,6 +13572,665 @@
       </w:r>
     </w:p>
     <w:bookmarkEnd w:id="55"/>
+    <w:p>
+      <w:pPr>
+        <w:pStyle w:val="Titre2"/>
+        <w:spacing w:before="280" w:after="120" w:line="276" w:lineRule="auto"/>
+        <w:ind w:left="0" w:right="0"/>
+      </w:pPr>
+      <w:r>
+        <w:rPr>
+          <w:rFonts w:ascii="Segoe UI" w:hAnsi="Segoe UI" w:cs="Segoe UI" w:eastAsia="Segoe UI"/>
+          <w:b/>
+          <w:color w:val="007A8C"/>
+          <w:sz w:val="32"/>
+        </w:rPr>
+        <w:t xml:space="preserve">Réglages GitHub à reproduire</w:t>
+      </w:r>
+    </w:p>
+    <w:p>
+      <w:pPr>
+        <w:pStyle w:val="FirstParagraph"/>
+        <w:spacing w:before="40" w:after="160" w:line="324" w:lineRule="auto"/>
+        <w:ind w:left="0" w:right="0"/>
+      </w:pPr>
+      <w:r>
+        <w:rPr>
+          <w:rFonts w:ascii="Segoe UI" w:hAnsi="Segoe UI" w:cs="Segoe UI" w:eastAsia="Segoe UI"/>
+          <w:b w:val="0"/>
+          <w:color w:val="0A192F"/>
+          <w:sz w:val="26"/>
+        </w:rPr>
+        <w:t xml:space="preserve">Une partie de la protection n’est pas dans le dépôt : ce sont des réglages du dépôt GitHub. Un fork, un transfert ou un nouveau dépôt ne les copie pas. Sans eux, la CI tourne mais ne bloque plus rien, et un secret peut être poussé.</w:t>
+      </w:r>
+    </w:p>
+    <w:tbl>
+      <w:tblPr>
+        <w:tblW w:w="5000" w:type="pct"/>
+        <w:tblLayout w:type="autofit"/>
+        <w:tblLook w:val="0020" w:firstRow="1" w:lastRow="0" w:firstColumn="0" w:lastColumn="0" w:noHBand="0" w:noVBand="0"/>
+        <w:tblBorders>
+          <w:top w:val="single" w:sz="6" w:space="0" w:color="C5CED6"/>
+          <w:left w:val="single" w:sz="6" w:space="0" w:color="C5CED6"/>
+          <w:bottom w:val="single" w:sz="6" w:space="0" w:color="C5CED6"/>
+          <w:right w:val="single" w:sz="6" w:space="0" w:color="C5CED6"/>
+          <w:insideH w:val="single" w:sz="6" w:space="0" w:color="C5CED6"/>
+          <w:insideV w:val="single" w:sz="6" w:space="0" w:color="C5CED6"/>
+        </w:tblBorders>
+      </w:tblPr>
+      <w:tblGrid>
+        <w:gridCol w:w="2169"/>
+        <w:gridCol w:w="2168"/>
+        <w:gridCol w:w="5639"/>
+      </w:tblGrid>
+      <w:tr>
+        <w:trPr>
+          <w:tblHeader/>
+        </w:trPr>
+        <w:tc>
+          <w:tcPr>
+            <w:tcW w:w="1721" w:type="dxa"/>
+            <w:shd w:val="clear" w:color="auto" w:fill="02223F"/>
+            <w:tcMar>
+              <w:top w:w="80" w:type="dxa"/>
+              <w:left w:w="120" w:type="dxa"/>
+              <w:bottom w:w="80" w:type="dxa"/>
+              <w:right w:w="120" w:type="dxa"/>
+            </w:tcMar>
+          </w:tcPr>
+          <w:p>
+            <w:pPr>
+              <w:pStyle w:val="Compact"/>
+              <w:spacing w:before="20" w:after="20" w:line="276" w:lineRule="auto"/>
+              <w:ind w:left="0" w:right="0"/>
+              <w:rPr>
+                <w:kern w:val="2"/>
+                <w:lang w:val="fr-NC" w:eastAsia="fr-NC"/>
+                <w14:ligatures w14:val="standardContextual"/>
+              </w:rPr>
+            </w:pPr>
+            <w:r>
+              <w:rPr>
+                <w:rFonts w:ascii="Segoe UI" w:hAnsi="Segoe UI" w:cs="Segoe UI" w:eastAsia="Segoe UI"/>
+                <w:b/>
+                <w:color w:val="FFFFFF"/>
+                <w:sz w:val="24"/>
+                <w:szCs w:val="20"/>
+                <w:lang w:val="fr-FR"/>
+              </w:rPr>
+              <w:t xml:space="preserve">Réglage</w:t>
+            </w:r>
+          </w:p>
+        </w:tc>
+        <w:tc>
+          <w:tcPr>
+            <w:tcW w:w="1721" w:type="dxa"/>
+            <w:shd w:val="clear" w:color="auto" w:fill="02223F"/>
+            <w:tcMar>
+              <w:top w:w="80" w:type="dxa"/>
+              <w:left w:w="120" w:type="dxa"/>
+              <w:bottom w:w="80" w:type="dxa"/>
+              <w:right w:w="120" w:type="dxa"/>
+            </w:tcMar>
+          </w:tcPr>
+          <w:p>
+            <w:pPr>
+              <w:pStyle w:val="Compact"/>
+              <w:spacing w:before="20" w:after="20" w:line="276" w:lineRule="auto"/>
+              <w:ind w:left="0" w:right="0"/>
+              <w:rPr>
+                <w:kern w:val="2"/>
+                <w:lang w:val="fr-NC" w:eastAsia="fr-NC"/>
+                <w14:ligatures w14:val="standardContextual"/>
+              </w:rPr>
+            </w:pPr>
+            <w:r>
+              <w:rPr>
+                <w:rFonts w:ascii="Segoe UI" w:hAnsi="Segoe UI" w:cs="Segoe UI" w:eastAsia="Segoe UI"/>
+                <w:b/>
+                <w:color w:val="FFFFFF"/>
+                <w:sz w:val="24"/>
+                <w:szCs w:val="20"/>
+                <w:lang w:val="fr-FR"/>
+              </w:rPr>
+              <w:t xml:space="preserve">Où (Settings)</w:t>
+            </w:r>
+          </w:p>
+        </w:tc>
+        <w:tc>
+          <w:tcPr>
+            <w:tcW w:w="4476" w:type="dxa"/>
+            <w:shd w:val="clear" w:color="auto" w:fill="02223F"/>
+            <w:tcMar>
+              <w:top w:w="80" w:type="dxa"/>
+              <w:left w:w="120" w:type="dxa"/>
+              <w:bottom w:w="80" w:type="dxa"/>
+              <w:right w:w="120" w:type="dxa"/>
+            </w:tcMar>
+          </w:tcPr>
+          <w:p>
+            <w:pPr>
+              <w:pStyle w:val="Compact"/>
+              <w:spacing w:before="20" w:after="20" w:line="276" w:lineRule="auto"/>
+              <w:ind w:left="0" w:right="0"/>
+              <w:rPr>
+                <w:kern w:val="2"/>
+                <w:lang w:val="fr-NC" w:eastAsia="fr-NC"/>
+                <w14:ligatures w14:val="standardContextual"/>
+              </w:rPr>
+            </w:pPr>
+            <w:r>
+              <w:rPr>
+                <w:rFonts w:ascii="Segoe UI" w:hAnsi="Segoe UI" w:cs="Segoe UI" w:eastAsia="Segoe UI"/>
+                <w:b/>
+                <w:color w:val="FFFFFF"/>
+                <w:sz w:val="24"/>
+                <w:szCs w:val="20"/>
+                <w:lang w:val="fr-FR"/>
+              </w:rPr>
+              <w:t xml:space="preserve">Valeur</w:t>
+            </w:r>
+          </w:p>
+        </w:tc>
+      </w:tr>
+      <w:tr>
+        <w:tc>
+          <w:tcPr>
+            <w:tcW w:w="1721" w:type="dxa"/>
+            <w:hideMark/>
+            <w:shd w:val="clear" w:color="auto" w:fill="FFFFFF"/>
+            <w:tcMar>
+              <w:top w:w="80" w:type="dxa"/>
+              <w:left w:w="120" w:type="dxa"/>
+              <w:bottom w:w="80" w:type="dxa"/>
+              <w:right w:w="120" w:type="dxa"/>
+            </w:tcMar>
+          </w:tcPr>
+          <w:p>
+            <w:pPr>
+              <w:pStyle w:val="Compact"/>
+              <w:spacing w:before="20" w:beforeAutospacing="1" w:after="20" w:afterAutospacing="1" w:line="276" w:lineRule="auto"/>
+              <w:ind w:left="0" w:right="0"/>
+            </w:pPr>
+            <w:r>
+              <w:rPr>
+                <w:rFonts w:ascii="Segoe UI" w:hAnsi="Segoe UI" w:cs="Segoe UI" w:eastAsia="Segoe UI"/>
+                <w:b w:val="0"/>
+                <w:color w:val="0A192F"/>
+                <w:sz w:val="24"/>
+                <w:szCs w:val="20"/>
+                <w:lang w:val="fr-FR"/>
+              </w:rPr>
+              <w:t xml:space="preserve">Protection de </w:t>
+            </w:r>
+            <w:r>
+              <w:rPr>
+                <w:rStyle w:val="VerbatimChar"/>
+                <w:rFonts w:ascii="Segoe UI" w:hAnsi="Segoe UI" w:cs="Segoe UI" w:eastAsia="Segoe UI"/>
+                <w:b w:val="0"/>
+                <w:color w:val="0A192F"/>
+                <w:sz w:val="24"/>
+                <w:szCs w:val="20"/>
+                <w:lang w:val="fr-FR"/>
+              </w:rPr>
+              <w:t xml:space="preserve">main</w:t>
+            </w:r>
+          </w:p>
+        </w:tc>
+        <w:tc>
+          <w:tcPr>
+            <w:tcW w:w="1721" w:type="dxa"/>
+            <w:hideMark/>
+            <w:shd w:val="clear" w:color="auto" w:fill="FFFFFF"/>
+            <w:tcMar>
+              <w:top w:w="80" w:type="dxa"/>
+              <w:left w:w="120" w:type="dxa"/>
+              <w:bottom w:w="80" w:type="dxa"/>
+              <w:right w:w="120" w:type="dxa"/>
+            </w:tcMar>
+          </w:tcPr>
+          <w:p>
+            <w:pPr>
+              <w:pStyle w:val="Compact"/>
+              <w:spacing w:before="20" w:beforeAutospacing="1" w:after="20" w:afterAutospacing="1" w:line="276" w:lineRule="auto"/>
+              <w:ind w:left="0" w:right="0"/>
+            </w:pPr>
+            <w:r>
+              <w:rPr>
+                <w:rFonts w:ascii="Segoe UI" w:hAnsi="Segoe UI" w:cs="Segoe UI" w:eastAsia="Segoe UI"/>
+                <w:b w:val="0"/>
+                <w:color w:val="0A192F"/>
+                <w:sz w:val="24"/>
+                <w:szCs w:val="20"/>
+                <w:lang w:val="fr-FR"/>
+              </w:rPr>
+              <w:t xml:space="preserve">Branches → règle sur </w:t>
+            </w:r>
+            <w:r>
+              <w:rPr>
+                <w:rStyle w:val="VerbatimChar"/>
+                <w:rFonts w:ascii="Segoe UI" w:hAnsi="Segoe UI" w:cs="Segoe UI" w:eastAsia="Segoe UI"/>
+                <w:b w:val="0"/>
+                <w:color w:val="0A192F"/>
+                <w:sz w:val="24"/>
+                <w:szCs w:val="20"/>
+                <w:lang w:val="fr-FR"/>
+              </w:rPr>
+              <w:t xml:space="preserve">main</w:t>
+            </w:r>
+          </w:p>
+        </w:tc>
+        <w:tc>
+          <w:tcPr>
+            <w:tcW w:w="4476" w:type="dxa"/>
+            <w:hideMark/>
+            <w:shd w:val="clear" w:color="auto" w:fill="FFFFFF"/>
+            <w:tcMar>
+              <w:top w:w="80" w:type="dxa"/>
+              <w:left w:w="120" w:type="dxa"/>
+              <w:bottom w:w="80" w:type="dxa"/>
+              <w:right w:w="120" w:type="dxa"/>
+            </w:tcMar>
+          </w:tcPr>
+          <w:p>
+            <w:pPr>
+              <w:pStyle w:val="Compact"/>
+              <w:spacing w:before="20" w:beforeAutospacing="1" w:after="20" w:afterAutospacing="1" w:line="276" w:lineRule="auto"/>
+              <w:ind w:left="0" w:right="0"/>
+            </w:pPr>
+            <w:r>
+              <w:rPr>
+                <w:rFonts w:ascii="Segoe UI" w:hAnsi="Segoe UI" w:cs="Segoe UI" w:eastAsia="Segoe UI"/>
+                <w:b w:val="0"/>
+                <w:color w:val="0A192F"/>
+                <w:sz w:val="24"/>
+                <w:szCs w:val="20"/>
+                <w:lang w:val="fr-FR"/>
+              </w:rPr>
+              <w:t xml:space="preserve">Pull request obligatoire ; contrôles requis : </w:t>
+            </w:r>
+            <w:r>
+              <w:rPr>
+                <w:rStyle w:val="VerbatimChar"/>
+                <w:rFonts w:ascii="Segoe UI" w:hAnsi="Segoe UI" w:cs="Segoe UI" w:eastAsia="Segoe UI"/>
+                <w:b w:val="0"/>
+                <w:color w:val="0A192F"/>
+                <w:sz w:val="24"/>
+                <w:szCs w:val="20"/>
+                <w:lang w:val="fr-FR"/>
+              </w:rPr>
+              <w:t xml:space="preserve">Front — qualité &amp; tests</w:t>
+            </w:r>
+            <w:r>
+              <w:rPr>
+                <w:rFonts w:ascii="Segoe UI" w:hAnsi="Segoe UI" w:cs="Segoe UI" w:eastAsia="Segoe UI"/>
+                <w:b w:val="0"/>
+                <w:color w:val="0A192F"/>
+                <w:sz w:val="24"/>
+                <w:szCs w:val="20"/>
+                <w:lang w:val="fr-FR"/>
+              </w:rPr>
+              <w:t xml:space="preserve">, </w:t>
+            </w:r>
+            <w:r>
+              <w:rPr>
+                <w:rStyle w:val="VerbatimChar"/>
+                <w:rFonts w:ascii="Segoe UI" w:hAnsi="Segoe UI" w:cs="Segoe UI" w:eastAsia="Segoe UI"/>
+                <w:b w:val="0"/>
+                <w:color w:val="0A192F"/>
+                <w:sz w:val="24"/>
+                <w:szCs w:val="20"/>
+                <w:lang w:val="fr-FR"/>
+              </w:rPr>
+              <w:t xml:space="preserve">Back — tests</w:t>
+            </w:r>
+            <w:r>
+              <w:rPr>
+                <w:rFonts w:ascii="Segoe UI" w:hAnsi="Segoe UI" w:cs="Segoe UI" w:eastAsia="Segoe UI"/>
+                <w:b w:val="0"/>
+                <w:color w:val="0A192F"/>
+                <w:sz w:val="24"/>
+                <w:szCs w:val="20"/>
+                <w:lang w:val="fr-FR"/>
+              </w:rPr>
+              <w:t xml:space="preserve">, </w:t>
+            </w:r>
+            <w:r>
+              <w:rPr>
+                <w:rStyle w:val="VerbatimChar"/>
+                <w:rFonts w:ascii="Segoe UI" w:hAnsi="Segoe UI" w:cs="Segoe UI" w:eastAsia="Segoe UI"/>
+                <w:b w:val="0"/>
+                <w:color w:val="0A192F"/>
+                <w:sz w:val="24"/>
+                <w:szCs w:val="20"/>
+                <w:lang w:val="fr-FR"/>
+              </w:rPr>
+              <w:t xml:space="preserve">Sécurité — secrets &amp; dépendances</w:t>
+            </w:r>
+            <w:r>
+              <w:rPr>
+                <w:rFonts w:ascii="Segoe UI" w:hAnsi="Segoe UI" w:cs="Segoe UI" w:eastAsia="Segoe UI"/>
+                <w:b w:val="0"/>
+                <w:color w:val="0A192F"/>
+                <w:sz w:val="24"/>
+                <w:szCs w:val="20"/>
+                <w:lang w:val="fr-FR"/>
+              </w:rPr>
+              <w:t xml:space="preserve">, </w:t>
+            </w:r>
+            <w:r>
+              <w:rPr>
+                <w:rStyle w:val="VerbatimChar"/>
+                <w:rFonts w:ascii="Segoe UI" w:hAnsi="Segoe UI" w:cs="Segoe UI" w:eastAsia="Segoe UI"/>
+                <w:b w:val="0"/>
+                <w:color w:val="0A192F"/>
+                <w:sz w:val="24"/>
+                <w:szCs w:val="20"/>
+                <w:lang w:val="fr-FR"/>
+              </w:rPr>
+              <w:t xml:space="preserve">Docker — images, config &amp; smoke prod</w:t>
+            </w:r>
+            <w:r>
+              <w:rPr>
+                <w:rFonts w:ascii="Segoe UI" w:hAnsi="Segoe UI" w:cs="Segoe UI" w:eastAsia="Segoe UI"/>
+                <w:b w:val="0"/>
+                <w:color w:val="0A192F"/>
+                <w:sz w:val="24"/>
+                <w:szCs w:val="20"/>
+                <w:lang w:val="fr-FR"/>
+              </w:rPr>
+              <w:t xml:space="preserve">, </w:t>
+            </w:r>
+            <w:r>
+              <w:rPr>
+                <w:rStyle w:val="VerbatimChar"/>
+                <w:rFonts w:ascii="Segoe UI" w:hAnsi="Segoe UI" w:cs="Segoe UI" w:eastAsia="Segoe UI"/>
+                <w:b w:val="0"/>
+                <w:color w:val="0A192F"/>
+                <w:sz w:val="24"/>
+                <w:szCs w:val="20"/>
+                <w:lang w:val="fr-FR"/>
+              </w:rPr>
+              <w:t xml:space="preserve">Dépendances — revue de PR</w:t>
+            </w:r>
+            <w:r>
+              <w:rPr>
+                <w:rFonts w:ascii="Segoe UI" w:hAnsi="Segoe UI" w:cs="Segoe UI" w:eastAsia="Segoe UI"/>
+                <w:b w:val="0"/>
+                <w:color w:val="0A192F"/>
+                <w:sz w:val="24"/>
+                <w:szCs w:val="20"/>
+                <w:lang w:val="fr-FR"/>
+              </w:rPr>
+              <w:t xml:space="preserve"> ; branche à jour avant merge ; appliquer aux administrateurs ; force-push et suppression interdits ; conversations résolues</w:t>
+            </w:r>
+          </w:p>
+        </w:tc>
+      </w:tr>
+      <w:tr>
+        <w:tc>
+          <w:tcPr>
+            <w:tcW w:w="1721" w:type="dxa"/>
+            <w:hideMark/>
+            <w:shd w:val="clear" w:color="auto" w:fill="F3ECDA"/>
+            <w:tcMar>
+              <w:top w:w="80" w:type="dxa"/>
+              <w:left w:w="120" w:type="dxa"/>
+              <w:bottom w:w="80" w:type="dxa"/>
+              <w:right w:w="120" w:type="dxa"/>
+            </w:tcMar>
+          </w:tcPr>
+          <w:p>
+            <w:pPr>
+              <w:pStyle w:val="Compact"/>
+              <w:spacing w:before="20" w:beforeAutospacing="1" w:after="20" w:afterAutospacing="1" w:line="276" w:lineRule="auto"/>
+              <w:ind w:left="0" w:right="0"/>
+            </w:pPr>
+            <w:r>
+              <w:rPr>
+                <w:rFonts w:ascii="Segoe UI" w:hAnsi="Segoe UI" w:cs="Segoe UI" w:eastAsia="Segoe UI"/>
+                <w:b w:val="0"/>
+                <w:color w:val="0A192F"/>
+                <w:sz w:val="24"/>
+                <w:szCs w:val="20"/>
+                <w:lang w:val="fr-FR"/>
+              </w:rPr>
+              <w:t xml:space="preserve">Secret scanning et push protection</w:t>
+            </w:r>
+          </w:p>
+        </w:tc>
+        <w:tc>
+          <w:tcPr>
+            <w:tcW w:w="1721" w:type="dxa"/>
+            <w:hideMark/>
+            <w:shd w:val="clear" w:color="auto" w:fill="F3ECDA"/>
+            <w:tcMar>
+              <w:top w:w="80" w:type="dxa"/>
+              <w:left w:w="120" w:type="dxa"/>
+              <w:bottom w:w="80" w:type="dxa"/>
+              <w:right w:w="120" w:type="dxa"/>
+            </w:tcMar>
+          </w:tcPr>
+          <w:p>
+            <w:pPr>
+              <w:pStyle w:val="Compact"/>
+              <w:spacing w:before="20" w:beforeAutospacing="1" w:after="20" w:afterAutospacing="1" w:line="276" w:lineRule="auto"/>
+              <w:ind w:left="0" w:right="0"/>
+            </w:pPr>
+            <w:r>
+              <w:rPr>
+                <w:rFonts w:ascii="Segoe UI" w:hAnsi="Segoe UI" w:cs="Segoe UI" w:eastAsia="Segoe UI"/>
+                <w:b w:val="0"/>
+                <w:color w:val="0A192F"/>
+                <w:sz w:val="24"/>
+                <w:szCs w:val="20"/>
+                <w:lang w:val="fr-FR"/>
+              </w:rPr>
+              <w:t xml:space="preserve">Code security</w:t>
+            </w:r>
+          </w:p>
+        </w:tc>
+        <w:tc>
+          <w:tcPr>
+            <w:tcW w:w="4476" w:type="dxa"/>
+            <w:hideMark/>
+            <w:shd w:val="clear" w:color="auto" w:fill="F3ECDA"/>
+            <w:tcMar>
+              <w:top w:w="80" w:type="dxa"/>
+              <w:left w:w="120" w:type="dxa"/>
+              <w:bottom w:w="80" w:type="dxa"/>
+              <w:right w:w="120" w:type="dxa"/>
+            </w:tcMar>
+          </w:tcPr>
+          <w:p>
+            <w:pPr>
+              <w:pStyle w:val="Compact"/>
+              <w:spacing w:before="20" w:beforeAutospacing="1" w:after="20" w:afterAutospacing="1" w:line="276" w:lineRule="auto"/>
+              <w:ind w:left="0" w:right="0"/>
+            </w:pPr>
+            <w:r>
+              <w:rPr>
+                <w:rFonts w:ascii="Segoe UI" w:hAnsi="Segoe UI" w:cs="Segoe UI" w:eastAsia="Segoe UI"/>
+                <w:b w:val="0"/>
+                <w:color w:val="0A192F"/>
+                <w:sz w:val="24"/>
+                <w:szCs w:val="20"/>
+                <w:lang w:val="fr-FR"/>
+              </w:rPr>
+              <w:t xml:space="preserve">Activés</w:t>
+            </w:r>
+          </w:p>
+        </w:tc>
+      </w:tr>
+      <w:tr>
+        <w:tc>
+          <w:tcPr>
+            <w:tcW w:w="1721" w:type="dxa"/>
+            <w:hideMark/>
+            <w:shd w:val="clear" w:color="auto" w:fill="FFFFFF"/>
+            <w:tcMar>
+              <w:top w:w="80" w:type="dxa"/>
+              <w:left w:w="120" w:type="dxa"/>
+              <w:bottom w:w="80" w:type="dxa"/>
+              <w:right w:w="120" w:type="dxa"/>
+            </w:tcMar>
+          </w:tcPr>
+          <w:p>
+            <w:pPr>
+              <w:pStyle w:val="Compact"/>
+              <w:spacing w:before="20" w:beforeAutospacing="1" w:after="20" w:afterAutospacing="1" w:line="276" w:lineRule="auto"/>
+              <w:ind w:left="0" w:right="0"/>
+            </w:pPr>
+            <w:r>
+              <w:rPr>
+                <w:rFonts w:ascii="Segoe UI" w:hAnsi="Segoe UI" w:cs="Segoe UI" w:eastAsia="Segoe UI"/>
+                <w:b w:val="0"/>
+                <w:color w:val="0A192F"/>
+                <w:sz w:val="24"/>
+                <w:szCs w:val="20"/>
+                <w:lang w:val="fr-FR"/>
+              </w:rPr>
+              <w:t xml:space="preserve">Alertes Dependabot et mises à jour de sécurité</w:t>
+            </w:r>
+          </w:p>
+        </w:tc>
+        <w:tc>
+          <w:tcPr>
+            <w:tcW w:w="1721" w:type="dxa"/>
+            <w:hideMark/>
+            <w:shd w:val="clear" w:color="auto" w:fill="FFFFFF"/>
+            <w:tcMar>
+              <w:top w:w="80" w:type="dxa"/>
+              <w:left w:w="120" w:type="dxa"/>
+              <w:bottom w:w="80" w:type="dxa"/>
+              <w:right w:w="120" w:type="dxa"/>
+            </w:tcMar>
+          </w:tcPr>
+          <w:p>
+            <w:pPr>
+              <w:pStyle w:val="Compact"/>
+              <w:spacing w:before="20" w:beforeAutospacing="1" w:after="20" w:afterAutospacing="1" w:line="276" w:lineRule="auto"/>
+              <w:ind w:left="0" w:right="0"/>
+            </w:pPr>
+            <w:r>
+              <w:rPr>
+                <w:rFonts w:ascii="Segoe UI" w:hAnsi="Segoe UI" w:cs="Segoe UI" w:eastAsia="Segoe UI"/>
+                <w:b w:val="0"/>
+                <w:color w:val="0A192F"/>
+                <w:sz w:val="24"/>
+                <w:szCs w:val="20"/>
+                <w:lang w:val="fr-FR"/>
+              </w:rPr>
+              <w:t xml:space="preserve">Code security</w:t>
+            </w:r>
+          </w:p>
+        </w:tc>
+        <w:tc>
+          <w:tcPr>
+            <w:tcW w:w="4476" w:type="dxa"/>
+            <w:hideMark/>
+            <w:shd w:val="clear" w:color="auto" w:fill="FFFFFF"/>
+            <w:tcMar>
+              <w:top w:w="80" w:type="dxa"/>
+              <w:left w:w="120" w:type="dxa"/>
+              <w:bottom w:w="80" w:type="dxa"/>
+              <w:right w:w="120" w:type="dxa"/>
+            </w:tcMar>
+          </w:tcPr>
+          <w:p>
+            <w:pPr>
+              <w:pStyle w:val="Compact"/>
+              <w:spacing w:before="20" w:beforeAutospacing="1" w:after="20" w:afterAutospacing="1" w:line="276" w:lineRule="auto"/>
+              <w:ind w:left="0" w:right="0"/>
+            </w:pPr>
+            <w:r>
+              <w:rPr>
+                <w:rFonts w:ascii="Segoe UI" w:hAnsi="Segoe UI" w:cs="Segoe UI" w:eastAsia="Segoe UI"/>
+                <w:b w:val="0"/>
+                <w:color w:val="0A192F"/>
+                <w:sz w:val="24"/>
+                <w:szCs w:val="20"/>
+                <w:lang w:val="fr-FR"/>
+              </w:rPr>
+              <w:t xml:space="preserve">Activées (active aussi le graphe de dépendances, requis par la revue de PR)</w:t>
+            </w:r>
+          </w:p>
+        </w:tc>
+      </w:tr>
+    </w:tbl>
+    <w:p>
+      <w:pPr>
+        <w:pStyle w:val="BodyText"/>
+        <w:spacing w:before="40" w:after="160" w:line="324" w:lineRule="auto"/>
+        <w:ind w:left="0" w:right="0"/>
+      </w:pPr>
+      <w:r>
+        <w:rPr>
+          <w:rFonts w:ascii="Segoe UI" w:hAnsi="Segoe UI" w:cs="Segoe UI" w:eastAsia="Segoe UI"/>
+          <w:b w:val="0"/>
+          <w:color w:val="0A192F"/>
+          <w:sz w:val="26"/>
+        </w:rPr>
+        <w:t xml:space="preserve">Les contrôles requis n’apparaissent dans la liste qu’après un premier passage de la CI sur le nouveau dépôt. Vérification : un </w:t>
+      </w:r>
+      <w:r>
+        <w:rPr>
+          <w:rStyle w:val="VerbatimChar"/>
+          <w:rFonts w:ascii="Segoe UI" w:hAnsi="Segoe UI" w:cs="Segoe UI" w:eastAsia="Segoe UI"/>
+          <w:b w:val="0"/>
+          <w:color w:val="0A192F"/>
+          <w:sz w:val="26"/>
+        </w:rPr>
+        <w:t xml:space="preserve">git push</w:t>
+      </w:r>
+      <w:r>
+        <w:rPr>
+          <w:rFonts w:ascii="Segoe UI" w:hAnsi="Segoe UI" w:cs="Segoe UI" w:eastAsia="Segoe UI"/>
+          <w:b w:val="0"/>
+          <w:color w:val="0A192F"/>
+          <w:sz w:val="26"/>
+        </w:rPr>
+        <w:t xml:space="preserve"> direct sur </w:t>
+      </w:r>
+      <w:r>
+        <w:rPr>
+          <w:rStyle w:val="VerbatimChar"/>
+          <w:rFonts w:ascii="Segoe UI" w:hAnsi="Segoe UI" w:cs="Segoe UI" w:eastAsia="Segoe UI"/>
+          <w:b w:val="0"/>
+          <w:color w:val="0A192F"/>
+          <w:sz w:val="26"/>
+        </w:rPr>
+        <w:t xml:space="preserve">main</w:t>
+      </w:r>
+      <w:r>
+        <w:rPr>
+          <w:rFonts w:ascii="Segoe UI" w:hAnsi="Segoe UI" w:cs="Segoe UI" w:eastAsia="Segoe UI"/>
+          <w:b w:val="0"/>
+          <w:color w:val="0A192F"/>
+          <w:sz w:val="26"/>
+        </w:rPr>
+        <w:t xml:space="preserve"> doit être refusé (</w:t>
+      </w:r>
+      <w:r>
+        <w:rPr>
+          <w:rStyle w:val="VerbatimChar"/>
+          <w:rFonts w:ascii="Segoe UI" w:hAnsi="Segoe UI" w:cs="Segoe UI" w:eastAsia="Segoe UI"/>
+          <w:b w:val="0"/>
+          <w:color w:val="0A192F"/>
+          <w:sz w:val="26"/>
+        </w:rPr>
+        <w:t xml:space="preserve">GH006 Protected branch update failed</w:t>
+      </w:r>
+      <w:r>
+        <w:rPr>
+          <w:rFonts w:ascii="Segoe UI" w:hAnsi="Segoe UI" w:cs="Segoe UI" w:eastAsia="Segoe UI"/>
+          <w:b w:val="0"/>
+          <w:color w:val="0A192F"/>
+          <w:sz w:val="26"/>
+        </w:rPr>
+        <w:t xml:space="preserve">).</w:t>
+      </w:r>
+    </w:p>
     <w:p>
       <w:pPr>
         <w:pStyle w:val="Titre2"/>

</xml_diff>

<commit_message>
feat(docker): HTTPS sur le front et cookies de session Secure, sans domaine requis
Le nginx du front termine le TLS (TLS 1.2/1.3, HTTP/2) et le HTTP ne fait plus
que rediriger. Certificat fourni par le serveur s'il existe, sinon auto-signé
généré au premier démarrage et conservé dans le volume frontend-certs
(TLS_SAN pour ajouter l'IP ou le nom du serveur). HSTS réglable, à 0 par défaut.

SESSION_SECURE_COOKIE passe à true par défaut dans docker-compose.yml et
.env.docker.example. Aucun fichier de backend/ modifié.

La CI vérifie la redirection, le refus de TLS 1.1, les cookies Secure et
HttpOnly, et rejoue les smoke tests recherche + auth à travers HTTPS en
vérifiant le certificat. Docs de passation (md + docx) et TESTING.md à jour.
</commit_message>
<xml_diff>
--- a/docs/passation/Lab-Horizon-dossier-de-passation.docx
+++ b/docs/passation/Lab-Horizon-dossier-de-passation.docx
@@ -7143,16 +7143,16 @@
           <w:color w:val="0A192F"/>
           <w:sz w:val="26"/>
         </w:rPr>
-        <w:t>http://localhost:8080</w:t>
-      </w:r>
-      <w:r>
-        <w:rPr>
-          <w:rFonts w:ascii="Segoe UI" w:hAnsi="Segoe UI" w:cs="Segoe UI" w:eastAsia="Segoe UI"/>
-          <w:b w:val="0"/>
-          <w:color w:val="0A192F"/>
-          <w:sz w:val="26"/>
-        </w:rPr>
-        <w:t xml:space="preserve">. Nginx, dans l’image front, transmet </w:t>
+        <w:t xml:space="preserve">https://localhost:8443</w:t>
+      </w:r>
+      <w:r>
+        <w:rPr>
+          <w:rFonts w:ascii="Segoe UI" w:hAnsi="Segoe UI" w:cs="Segoe UI" w:eastAsia="Segoe UI"/>
+          <w:b w:val="0"/>
+          <w:color w:val="0A192F"/>
+          <w:sz w:val="26"/>
+        </w:rPr>
+        <w:t xml:space="preserve"> (</w:t>
       </w:r>
       <w:r>
         <w:rPr>
@@ -7162,7 +7162,26 @@
           <w:color w:val="0A192F"/>
           <w:sz w:val="26"/>
         </w:rPr>
-        <w:t>/api</w:t>
+        <w:t xml:space="preserve">http://localhost:8080</w:t>
+      </w:r>
+      <w:r>
+        <w:rPr>
+          <w:rFonts w:ascii="Segoe UI" w:hAnsi="Segoe UI" w:cs="Segoe UI" w:eastAsia="Segoe UI"/>
+          <w:b w:val="0"/>
+          <w:color w:val="0A192F"/>
+          <w:sz w:val="26"/>
+        </w:rPr>
+        <w:t xml:space="preserve"> y redirige). Nginx, dans l’image front, porte le certificat TLS et transmet </w:t>
+      </w:r>
+      <w:r>
+        <w:rPr>
+          <w:rStyle w:val="VerbatimChar"/>
+          <w:rFonts w:ascii="Segoe UI" w:hAnsi="Segoe UI" w:cs="Segoe UI" w:eastAsia="Segoe UI"/>
+          <w:b w:val="0"/>
+          <w:color w:val="0A192F"/>
+          <w:sz w:val="26"/>
+        </w:rPr>
+        <w:t xml:space="preserve">/api</w:t>
       </w:r>
       <w:r>
         <w:rPr>
@@ -7181,7 +7200,7 @@
           <w:color w:val="0A192F"/>
           <w:sz w:val="26"/>
         </w:rPr>
-        <w:t>/sanctum</w:t>
+        <w:t xml:space="preserve">/sanctum</w:t>
       </w:r>
       <w:r>
         <w:rPr>
@@ -7200,7 +7219,7 @@
           <w:color w:val="0A192F"/>
           <w:sz w:val="26"/>
         </w:rPr>
-        <w:t>/files</w:t>
+        <w:t xml:space="preserve">/files</w:t>
       </w:r>
       <w:r>
         <w:rPr>
@@ -7219,7 +7238,7 @@
           <w:color w:val="0A192F"/>
           <w:sz w:val="26"/>
         </w:rPr>
-        <w:t>mysql</w:t>
+        <w:t xml:space="preserve">mysql</w:t>
       </w:r>
       <w:r>
         <w:rPr>
@@ -7238,7 +7257,7 @@
           <w:color w:val="0A192F"/>
           <w:sz w:val="26"/>
         </w:rPr>
-        <w:t>redis</w:t>
+        <w:t xml:space="preserve">redis</w:t>
       </w:r>
       <w:r>
         <w:rPr>
@@ -7257,7 +7276,7 @@
           <w:color w:val="0A192F"/>
           <w:sz w:val="26"/>
         </w:rPr>
-        <w:t>localhost</w:t>
+        <w:t xml:space="preserve">localhost</w:t>
       </w:r>
       <w:r>
         <w:rPr>
@@ -7276,7 +7295,7 @@
           <w:color w:val="0A192F"/>
           <w:sz w:val="26"/>
         </w:rPr>
-        <w:t>http://lm-studio:1234/v1</w:t>
+        <w:t xml:space="preserve">http://lm-studio:1234/v1</w:t>
       </w:r>
       <w:r>
         <w:rPr>
@@ -8812,7 +8831,7 @@
                 <w:szCs w:val="20"/>
                 <w:lang w:val="fr-FR"/>
               </w:rPr>
-              <w:t>http://localhost:8080</w:t>
+              <w:t xml:space="preserve">https://localhost:8443</w:t>
             </w:r>
           </w:p>
         </w:tc>
@@ -8843,7 +8862,30 @@
                 <w:szCs w:val="20"/>
                 <w:lang w:val="fr-FR"/>
               </w:rPr>
-              <w:t>Site (entrée unique)</w:t>
+              <w:t xml:space="preserve">Site (entrée unique). </w:t>
+            </w:r>
+            <w:r>
+              <w:rPr>
+                <w:rStyle w:val="VerbatimChar"/>
+                <w:rFonts w:ascii="Segoe UI" w:hAnsi="Segoe UI" w:cs="Segoe UI" w:eastAsia="Segoe UI"/>
+                <w:b w:val="0"/>
+                <w:color w:val="0A192F"/>
+                <w:sz w:val="24"/>
+                <w:szCs w:val="20"/>
+                <w:lang w:val="fr-FR"/>
+              </w:rPr>
+              <w:t xml:space="preserve">http://localhost:8080</w:t>
+            </w:r>
+            <w:r>
+              <w:rPr>
+                <w:rFonts w:ascii="Segoe UI" w:hAnsi="Segoe UI" w:cs="Segoe UI" w:eastAsia="Segoe UI"/>
+                <w:b w:val="0"/>
+                <w:color w:val="0A192F"/>
+                <w:sz w:val="24"/>
+                <w:szCs w:val="20"/>
+                <w:lang w:val="fr-FR"/>
+              </w:rPr>
+              <w:t xml:space="preserve"> y redirige</w:t>
             </w:r>
           </w:p>
         </w:tc>
@@ -9281,6 +9323,354 @@
           <w:sz w:val="26"/>
         </w:rPr>
         <w:t>.</w:t>
+      </w:r>
+    </w:p>
+    <w:p>
+      <w:pPr>
+        <w:pStyle w:val="Titre2"/>
+        <w:spacing w:before="280" w:after="120" w:line="276" w:lineRule="auto"/>
+        <w:ind w:left="0" w:right="0"/>
+      </w:pPr>
+      <w:r>
+        <w:rPr>
+          <w:rFonts w:ascii="Segoe UI" w:hAnsi="Segoe UI" w:cs="Segoe UI" w:eastAsia="Segoe UI"/>
+          <w:b/>
+          <w:color w:val="007A8C"/>
+          <w:sz w:val="32"/>
+        </w:rPr>
+        <w:t xml:space="preserve">HTTPS</w:t>
+      </w:r>
+    </w:p>
+    <w:p>
+      <w:pPr>
+        <w:pStyle w:val="FirstParagraph"/>
+        <w:spacing w:before="40" w:after="160" w:line="324" w:lineRule="auto"/>
+        <w:ind w:left="0" w:right="0"/>
+      </w:pPr>
+      <w:r>
+        <w:rPr>
+          <w:rFonts w:ascii="Segoe UI" w:hAnsi="Segoe UI" w:cs="Segoe UI" w:eastAsia="Segoe UI"/>
+          <w:b w:val="0"/>
+          <w:color w:val="0A192F"/>
+          <w:sz w:val="26"/>
+        </w:rPr>
+        <w:t xml:space="preserve">Le site n’est servi qu’en HTTPS, même sans nom de domaine. Le Nginx du front porte le certificat ; le HTTP ne fait que rediriger. Les cookies de session sont marqués </w:t>
+      </w:r>
+      <w:r>
+        <w:rPr>
+          <w:rStyle w:val="VerbatimChar"/>
+          <w:rFonts w:ascii="Segoe UI" w:hAnsi="Segoe UI" w:cs="Segoe UI" w:eastAsia="Segoe UI"/>
+          <w:b w:val="0"/>
+          <w:color w:val="0A192F"/>
+          <w:sz w:val="26"/>
+        </w:rPr>
+        <w:t xml:space="preserve">Secure</w:t>
+      </w:r>
+      <w:r>
+        <w:rPr>
+          <w:rFonts w:ascii="Segoe UI" w:hAnsi="Segoe UI" w:cs="Segoe UI" w:eastAsia="Segoe UI"/>
+          <w:b w:val="0"/>
+          <w:color w:val="0A192F"/>
+          <w:sz w:val="26"/>
+        </w:rPr>
+        <w:t xml:space="preserve"> et </w:t>
+      </w:r>
+      <w:r>
+        <w:rPr>
+          <w:rStyle w:val="VerbatimChar"/>
+          <w:rFonts w:ascii="Segoe UI" w:hAnsi="Segoe UI" w:cs="Segoe UI" w:eastAsia="Segoe UI"/>
+          <w:b w:val="0"/>
+          <w:color w:val="0A192F"/>
+          <w:sz w:val="26"/>
+        </w:rPr>
+        <w:t xml:space="preserve">HttpOnly</w:t>
+      </w:r>
+      <w:r>
+        <w:rPr>
+          <w:rFonts w:ascii="Segoe UI" w:hAnsi="Segoe UI" w:cs="Segoe UI" w:eastAsia="Segoe UI"/>
+          <w:b w:val="0"/>
+          <w:color w:val="0A192F"/>
+          <w:sz w:val="26"/>
+        </w:rPr>
+        <w:t xml:space="preserve"> : le navigateur ne les envoie jamais en clair.</w:t>
+      </w:r>
+    </w:p>
+    <w:p>
+      <w:pPr>
+        <w:pStyle w:val="BodyText"/>
+        <w:spacing w:before="40" w:after="160" w:line="324" w:lineRule="auto"/>
+        <w:ind w:left="0" w:right="0"/>
+      </w:pPr>
+      <w:r>
+        <w:rPr>
+          <w:rFonts w:ascii="Segoe UI" w:hAnsi="Segoe UI" w:cs="Segoe UI" w:eastAsia="Segoe UI"/>
+          <w:b w:val="0"/>
+          <w:color w:val="0A192F"/>
+          <w:sz w:val="26"/>
+        </w:rPr>
+        <w:t xml:space="preserve">Sans certificat fourni, le conteneur en génère un auto-signé au premier démarrage et le garde dans le volume </w:t>
+      </w:r>
+      <w:r>
+        <w:rPr>
+          <w:rStyle w:val="VerbatimChar"/>
+          <w:rFonts w:ascii="Segoe UI" w:hAnsi="Segoe UI" w:cs="Segoe UI" w:eastAsia="Segoe UI"/>
+          <w:b w:val="0"/>
+          <w:color w:val="0A192F"/>
+          <w:sz w:val="26"/>
+        </w:rPr>
+        <w:t xml:space="preserve">frontend-certs</w:t>
+      </w:r>
+      <w:r>
+        <w:rPr>
+          <w:rFonts w:ascii="Segoe UI" w:hAnsi="Segoe UI" w:cs="Segoe UI" w:eastAsia="Segoe UI"/>
+          <w:b w:val="0"/>
+          <w:color w:val="0A192F"/>
+          <w:sz w:val="26"/>
+        </w:rPr>
+        <w:t xml:space="preserve">. Le navigateur affiche une alerte « connexion non privée » : c’est attendu, l’accepter une fois. Le chiffrement est réel, seule l’identité du serveur n’est pas garantie par une autorité.</w:t>
+      </w:r>
+    </w:p>
+    <w:p>
+      <w:pPr>
+        <w:pStyle w:val="BodyText"/>
+        <w:spacing w:before="40" w:after="160" w:line="324" w:lineRule="auto"/>
+        <w:ind w:left="0" w:right="0"/>
+      </w:pPr>
+      <w:r>
+        <w:rPr>
+          <w:rFonts w:ascii="Segoe UI" w:hAnsi="Segoe UI" w:cs="Segoe UI" w:eastAsia="Segoe UI"/>
+          <w:b w:val="0"/>
+          <w:color w:val="0A192F"/>
+          <w:sz w:val="26"/>
+        </w:rPr>
+        <w:t xml:space="preserve">Pour joindre le site par l’adresse du serveur (ex. </w:t>
+      </w:r>
+      <w:r>
+        <w:rPr>
+          <w:rStyle w:val="VerbatimChar"/>
+          <w:rFonts w:ascii="Segoe UI" w:hAnsi="Segoe UI" w:cs="Segoe UI" w:eastAsia="Segoe UI"/>
+          <w:b w:val="0"/>
+          <w:color w:val="0A192F"/>
+          <w:sz w:val="26"/>
+        </w:rPr>
+        <w:t xml:space="preserve">https://192.168.1.20</w:t>
+      </w:r>
+      <w:r>
+        <w:rPr>
+          <w:rFonts w:ascii="Segoe UI" w:hAnsi="Segoe UI" w:cs="Segoe UI" w:eastAsia="Segoe UI"/>
+          <w:b w:val="0"/>
+          <w:color w:val="0A192F"/>
+          <w:sz w:val="26"/>
+        </w:rPr>
+        <w:t xml:space="preserve">), l’ajouter au certificat avant le premier démarrage :</w:t>
+      </w:r>
+    </w:p>
+    <w:p>
+      <w:pPr>
+        <w:pStyle w:val="SourceCode"/>
+        <w:spacing w:before="80" w:after="200" w:line="288" w:lineRule="auto"/>
+        <w:ind w:left="198" w:right="142"/>
+        <w:shd w:val="clear" w:color="auto" w:fill="EEF0FA"/>
+        <w:pBdr>
+          <w:left w:val="single" w:sz="18" w:space="8" w:color="007A8C"/>
+        </w:pBdr>
+      </w:pPr>
+      <w:r>
+        <w:rPr>
+          <w:rStyle w:val="NormalTok"/>
+          <w:rFonts w:ascii="Consolas" w:hAnsi="Consolas" w:cs="Consolas" w:eastAsia="Consolas"/>
+          <w:b w:val="0"/>
+          <w:color w:val="0A192F"/>
+          <w:sz w:val="22"/>
+        </w:rPr>
+        <w:t xml:space="preserve">TLS_SAN=IP:192.168.1.20</w:t>
+      </w:r>
+      <w:r>
+        <w:rPr>
+          <w:rStyle w:val="NormalTok"/>
+          <w:rFonts w:ascii="Consolas" w:hAnsi="Consolas" w:cs="Consolas" w:eastAsia="Consolas"/>
+          <w:b w:val="0"/>
+          <w:color w:val="0A192F"/>
+          <w:sz w:val="22"/>
+        </w:rPr>
+        <w:br/>
+      </w:r>
+      <w:r>
+        <w:rPr>
+          <w:rStyle w:val="NormalTok"/>
+          <w:rFonts w:ascii="Consolas" w:hAnsi="Consolas" w:cs="Consolas" w:eastAsia="Consolas"/>
+          <w:b w:val="0"/>
+          <w:color w:val="0A192F"/>
+          <w:sz w:val="22"/>
+        </w:rPr>
+        <w:t xml:space="preserve">HTTPS_PORT=443</w:t>
+      </w:r>
+      <w:r>
+        <w:rPr>
+          <w:rStyle w:val="NormalTok"/>
+          <w:rFonts w:ascii="Consolas" w:hAnsi="Consolas" w:cs="Consolas" w:eastAsia="Consolas"/>
+          <w:b w:val="0"/>
+          <w:color w:val="0A192F"/>
+          <w:sz w:val="22"/>
+        </w:rPr>
+        <w:br/>
+      </w:r>
+      <w:r>
+        <w:rPr>
+          <w:rStyle w:val="NormalTok"/>
+          <w:rFonts w:ascii="Consolas" w:hAnsi="Consolas" w:cs="Consolas" w:eastAsia="Consolas"/>
+          <w:b w:val="0"/>
+          <w:color w:val="0A192F"/>
+          <w:sz w:val="22"/>
+        </w:rPr>
+        <w:t xml:space="preserve">HTTP_PORT=80</w:t>
+      </w:r>
+      <w:r>
+        <w:rPr>
+          <w:rStyle w:val="NormalTok"/>
+          <w:rFonts w:ascii="Consolas" w:hAnsi="Consolas" w:cs="Consolas" w:eastAsia="Consolas"/>
+          <w:b w:val="0"/>
+          <w:color w:val="0A192F"/>
+          <w:sz w:val="22"/>
+        </w:rPr>
+        <w:br/>
+      </w:r>
+      <w:r>
+        <w:rPr>
+          <w:rStyle w:val="NormalTok"/>
+          <w:rFonts w:ascii="Consolas" w:hAnsi="Consolas" w:cs="Consolas" w:eastAsia="Consolas"/>
+          <w:b w:val="0"/>
+          <w:color w:val="0A192F"/>
+          <w:sz w:val="22"/>
+        </w:rPr>
+        <w:t xml:space="preserve">APP_URL=https://192.168.1.20</w:t>
+      </w:r>
+    </w:p>
+    <w:p>
+      <w:pPr>
+        <w:pStyle w:val="FirstParagraph"/>
+        <w:spacing w:before="40" w:after="160" w:line="324" w:lineRule="auto"/>
+        <w:ind w:left="0" w:right="0"/>
+      </w:pPr>
+      <w:r>
+        <w:rPr>
+          <w:rFonts w:ascii="Segoe UI" w:hAnsi="Segoe UI" w:cs="Segoe UI" w:eastAsia="Segoe UI"/>
+          <w:b w:val="0"/>
+          <w:color w:val="0A192F"/>
+          <w:sz w:val="26"/>
+        </w:rPr>
+        <w:t xml:space="preserve">Puis reporter cette origine dans </w:t>
+      </w:r>
+      <w:r>
+        <w:rPr>
+          <w:rStyle w:val="VerbatimChar"/>
+          <w:rFonts w:ascii="Segoe UI" w:hAnsi="Segoe UI" w:cs="Segoe UI" w:eastAsia="Segoe UI"/>
+          <w:b w:val="0"/>
+          <w:color w:val="0A192F"/>
+          <w:sz w:val="26"/>
+        </w:rPr>
+        <w:t xml:space="preserve">SANCTUM_STATEFUL_DOMAINS</w:t>
+      </w:r>
+      <w:r>
+        <w:rPr>
+          <w:rFonts w:ascii="Segoe UI" w:hAnsi="Segoe UI" w:cs="Segoe UI" w:eastAsia="Segoe UI"/>
+          <w:b w:val="0"/>
+          <w:color w:val="0A192F"/>
+          <w:sz w:val="26"/>
+        </w:rPr>
+        <w:t xml:space="preserve"> et </w:t>
+      </w:r>
+      <w:r>
+        <w:rPr>
+          <w:rStyle w:val="VerbatimChar"/>
+          <w:rFonts w:ascii="Segoe UI" w:hAnsi="Segoe UI" w:cs="Segoe UI" w:eastAsia="Segoe UI"/>
+          <w:b w:val="0"/>
+          <w:color w:val="0A192F"/>
+          <w:sz w:val="26"/>
+        </w:rPr>
+        <w:t xml:space="preserve">CORS_ALLOWED_ORIGINS</w:t>
+      </w:r>
+      <w:r>
+        <w:rPr>
+          <w:rFonts w:ascii="Segoe UI" w:hAnsi="Segoe UI" w:cs="Segoe UI" w:eastAsia="Segoe UI"/>
+          <w:b w:val="0"/>
+          <w:color w:val="0A192F"/>
+          <w:sz w:val="26"/>
+        </w:rPr>
+        <w:t xml:space="preserve">. Si le certificat existe déjà, le régénérer : </w:t>
+      </w:r>
+      <w:r>
+        <w:rPr>
+          <w:rStyle w:val="VerbatimChar"/>
+          <w:rFonts w:ascii="Segoe UI" w:hAnsi="Segoe UI" w:cs="Segoe UI" w:eastAsia="Segoe UI"/>
+          <w:b w:val="0"/>
+          <w:color w:val="0A192F"/>
+          <w:sz w:val="26"/>
+        </w:rPr>
+        <w:t xml:space="preserve">docker compose down</w:t>
+      </w:r>
+      <w:r>
+        <w:rPr>
+          <w:rFonts w:ascii="Segoe UI" w:hAnsi="Segoe UI" w:cs="Segoe UI" w:eastAsia="Segoe UI"/>
+          <w:b w:val="0"/>
+          <w:color w:val="0A192F"/>
+          <w:sz w:val="26"/>
+        </w:rPr>
+        <w:t xml:space="preserve">, </w:t>
+      </w:r>
+      <w:r>
+        <w:rPr>
+          <w:rStyle w:val="VerbatimChar"/>
+          <w:rFonts w:ascii="Segoe UI" w:hAnsi="Segoe UI" w:cs="Segoe UI" w:eastAsia="Segoe UI"/>
+          <w:b w:val="0"/>
+          <w:color w:val="0A192F"/>
+          <w:sz w:val="26"/>
+        </w:rPr>
+        <w:t xml:space="preserve">docker volume rm &lt;projet&gt;_frontend-certs</w:t>
+      </w:r>
+      <w:r>
+        <w:rPr>
+          <w:rFonts w:ascii="Segoe UI" w:hAnsi="Segoe UI" w:cs="Segoe UI" w:eastAsia="Segoe UI"/>
+          <w:b w:val="0"/>
+          <w:color w:val="0A192F"/>
+          <w:sz w:val="26"/>
+        </w:rPr>
+        <w:t xml:space="preserve">, </w:t>
+      </w:r>
+      <w:r>
+        <w:rPr>
+          <w:rStyle w:val="VerbatimChar"/>
+          <w:rFonts w:ascii="Segoe UI" w:hAnsi="Segoe UI" w:cs="Segoe UI" w:eastAsia="Segoe UI"/>
+          <w:b w:val="0"/>
+          <w:color w:val="0A192F"/>
+          <w:sz w:val="26"/>
+        </w:rPr>
+        <w:t xml:space="preserve">docker compose up -d</w:t>
+      </w:r>
+      <w:r>
+        <w:rPr>
+          <w:rFonts w:ascii="Segoe UI" w:hAnsi="Segoe UI" w:cs="Segoe UI" w:eastAsia="Segoe UI"/>
+          <w:b w:val="0"/>
+          <w:color w:val="0A192F"/>
+          <w:sz w:val="26"/>
+        </w:rPr>
+        <w:t xml:space="preserve">.</w:t>
+      </w:r>
+    </w:p>
+    <w:p>
+      <w:pPr>
+        <w:pStyle w:val="BodyText"/>
+        <w:spacing w:before="40" w:after="160" w:line="324" w:lineRule="auto"/>
+        <w:ind w:left="0" w:right="0"/>
+      </w:pPr>
+      <w:r>
+        <w:rPr>
+          <w:rFonts w:ascii="Segoe UI" w:hAnsi="Segoe UI" w:cs="Segoe UI" w:eastAsia="Segoe UI"/>
+          <w:b w:val="0"/>
+          <w:color w:val="0A192F"/>
+          <w:sz w:val="26"/>
+        </w:rPr>
+        <w:t xml:space="preserve">Le jour où un nom de domaine existe, voir « Mettre un vrai certificat » dans 04 — Plan de maintenance.</w:t>
       </w:r>
     </w:p>
     <w:p>
@@ -10764,6 +11154,219 @@
                 <w:szCs w:val="20"/>
                 <w:lang w:val="fr-FR"/>
               </w:rPr>
+              <w:t xml:space="preserve">Alerte « connexion non privée »</w:t>
+            </w:r>
+          </w:p>
+        </w:tc>
+        <w:tc>
+          <w:tcPr>
+            <w:tcW w:w="3846" w:type="dxa"/>
+            <w:hideMark/>
+            <w:shd w:val="clear" w:color="auto" w:fill="FFFFFF"/>
+            <w:tcMar>
+              <w:top w:w="80" w:type="dxa"/>
+              <w:left w:w="120" w:type="dxa"/>
+              <w:bottom w:w="80" w:type="dxa"/>
+              <w:right w:w="120" w:type="dxa"/>
+            </w:tcMar>
+          </w:tcPr>
+          <w:p>
+            <w:pPr>
+              <w:pStyle w:val="Compact"/>
+              <w:spacing w:before="20" w:beforeAutospacing="1" w:after="20" w:afterAutospacing="1" w:line="276" w:lineRule="auto"/>
+              <w:ind w:left="0" w:right="0"/>
+            </w:pPr>
+            <w:r>
+              <w:rPr>
+                <w:rFonts w:ascii="Segoe UI" w:hAnsi="Segoe UI" w:cs="Segoe UI" w:eastAsia="Segoe UI"/>
+                <w:b w:val="0"/>
+                <w:color w:val="0A192F"/>
+                <w:sz w:val="24"/>
+                <w:szCs w:val="20"/>
+                <w:lang w:val="fr-FR"/>
+              </w:rPr>
+              <w:t xml:space="preserve">Certificat auto-signé</w:t>
+            </w:r>
+          </w:p>
+        </w:tc>
+        <w:tc>
+          <w:tcPr>
+            <w:tcW w:w="1810" w:type="dxa"/>
+            <w:hideMark/>
+            <w:shd w:val="clear" w:color="auto" w:fill="FFFFFF"/>
+            <w:tcMar>
+              <w:top w:w="80" w:type="dxa"/>
+              <w:left w:w="120" w:type="dxa"/>
+              <w:bottom w:w="80" w:type="dxa"/>
+              <w:right w:w="120" w:type="dxa"/>
+            </w:tcMar>
+          </w:tcPr>
+          <w:p>
+            <w:pPr>
+              <w:pStyle w:val="Compact"/>
+              <w:spacing w:before="20" w:beforeAutospacing="1" w:after="20" w:afterAutospacing="1" w:line="276" w:lineRule="auto"/>
+              <w:ind w:left="0" w:right="0"/>
+            </w:pPr>
+            <w:r>
+              <w:rPr>
+                <w:rFonts w:ascii="Segoe UI" w:hAnsi="Segoe UI" w:cs="Segoe UI" w:eastAsia="Segoe UI"/>
+                <w:b w:val="0"/>
+                <w:color w:val="0A192F"/>
+                <w:sz w:val="24"/>
+                <w:szCs w:val="19"/>
+                <w:lang w:val="fr-FR"/>
+              </w:rPr>
+              <w:t xml:space="preserve">Attendu sans domaine : accepter l’alerte une fois</w:t>
+            </w:r>
+          </w:p>
+        </w:tc>
+      </w:tr>
+      <w:tr>
+        <w:tc>
+          <w:tcPr>
+            <w:tcW w:w="2262" w:type="dxa"/>
+            <w:hideMark/>
+            <w:shd w:val="clear" w:color="auto" w:fill="F3ECDA"/>
+            <w:tcMar>
+              <w:top w:w="80" w:type="dxa"/>
+              <w:left w:w="120" w:type="dxa"/>
+              <w:bottom w:w="80" w:type="dxa"/>
+              <w:right w:w="120" w:type="dxa"/>
+            </w:tcMar>
+          </w:tcPr>
+          <w:p>
+            <w:pPr>
+              <w:pStyle w:val="Compact"/>
+              <w:spacing w:before="20" w:beforeAutospacing="1" w:after="20" w:afterAutospacing="1" w:line="276" w:lineRule="auto"/>
+              <w:ind w:left="0" w:right="0"/>
+            </w:pPr>
+            <w:r>
+              <w:rPr>
+                <w:rFonts w:ascii="Segoe UI" w:hAnsi="Segoe UI" w:cs="Segoe UI" w:eastAsia="Segoe UI"/>
+                <w:b w:val="0"/>
+                <w:color w:val="0A192F"/>
+                <w:sz w:val="24"/>
+                <w:szCs w:val="20"/>
+                <w:lang w:val="fr-FR"/>
+              </w:rPr>
+              <w:t xml:space="preserve">Alerte persistante via l’IP du serveur</w:t>
+            </w:r>
+          </w:p>
+        </w:tc>
+        <w:tc>
+          <w:tcPr>
+            <w:tcW w:w="3846" w:type="dxa"/>
+            <w:hideMark/>
+            <w:shd w:val="clear" w:color="auto" w:fill="F3ECDA"/>
+            <w:tcMar>
+              <w:top w:w="80" w:type="dxa"/>
+              <w:left w:w="120" w:type="dxa"/>
+              <w:bottom w:w="80" w:type="dxa"/>
+              <w:right w:w="120" w:type="dxa"/>
+            </w:tcMar>
+          </w:tcPr>
+          <w:p>
+            <w:pPr>
+              <w:pStyle w:val="Compact"/>
+              <w:spacing w:before="20" w:beforeAutospacing="1" w:after="20" w:afterAutospacing="1" w:line="276" w:lineRule="auto"/>
+              <w:ind w:left="0" w:right="0"/>
+            </w:pPr>
+            <w:r>
+              <w:rPr>
+                <w:rFonts w:ascii="Segoe UI" w:hAnsi="Segoe UI" w:cs="Segoe UI" w:eastAsia="Segoe UI"/>
+                <w:b w:val="0"/>
+                <w:color w:val="0A192F"/>
+                <w:sz w:val="24"/>
+                <w:szCs w:val="20"/>
+                <w:lang w:val="fr-FR"/>
+              </w:rPr>
+              <w:t xml:space="preserve">IP absente du certificat</w:t>
+            </w:r>
+          </w:p>
+        </w:tc>
+        <w:tc>
+          <w:tcPr>
+            <w:tcW w:w="1810" w:type="dxa"/>
+            <w:hideMark/>
+            <w:shd w:val="clear" w:color="auto" w:fill="F3ECDA"/>
+            <w:tcMar>
+              <w:top w:w="80" w:type="dxa"/>
+              <w:left w:w="120" w:type="dxa"/>
+              <w:bottom w:w="80" w:type="dxa"/>
+              <w:right w:w="120" w:type="dxa"/>
+            </w:tcMar>
+          </w:tcPr>
+          <w:p>
+            <w:pPr>
+              <w:pStyle w:val="Compact"/>
+              <w:spacing w:before="20" w:beforeAutospacing="1" w:after="20" w:afterAutospacing="1" w:line="276" w:lineRule="auto"/>
+              <w:ind w:left="0" w:right="0"/>
+            </w:pPr>
+            <w:r>
+              <w:rPr>
+                <w:rFonts w:ascii="Segoe UI" w:hAnsi="Segoe UI" w:cs="Segoe UI" w:eastAsia="Segoe UI"/>
+                <w:b w:val="0"/>
+                <w:color w:val="0A192F"/>
+                <w:sz w:val="24"/>
+                <w:szCs w:val="20"/>
+                <w:lang w:val="fr-FR"/>
+              </w:rPr>
+              <w:t xml:space="preserve">Renseigner </w:t>
+            </w:r>
+            <w:r>
+              <w:rPr>
+                <w:rStyle w:val="VerbatimChar"/>
+                <w:rFonts w:ascii="Segoe UI" w:hAnsi="Segoe UI" w:cs="Segoe UI" w:eastAsia="Segoe UI"/>
+                <w:b w:val="0"/>
+                <w:color w:val="0A192F"/>
+                <w:sz w:val="24"/>
+                <w:szCs w:val="20"/>
+                <w:lang w:val="fr-FR"/>
+              </w:rPr>
+              <w:t xml:space="preserve">TLS_SAN</w:t>
+            </w:r>
+            <w:r>
+              <w:rPr>
+                <w:rFonts w:ascii="Segoe UI" w:hAnsi="Segoe UI" w:cs="Segoe UI" w:eastAsia="Segoe UI"/>
+                <w:b w:val="0"/>
+                <w:color w:val="0A192F"/>
+                <w:sz w:val="24"/>
+                <w:szCs w:val="20"/>
+                <w:lang w:val="fr-FR"/>
+              </w:rPr>
+              <w:t xml:space="preserve">, régénérer le certificat (section HTTPS)</w:t>
+            </w:r>
+          </w:p>
+        </w:tc>
+      </w:tr>
+      <w:tr>
+        <w:tc>
+          <w:tcPr>
+            <w:tcW w:w="2262" w:type="dxa"/>
+            <w:hideMark/>
+            <w:shd w:val="clear" w:color="auto" w:fill="FFFFFF"/>
+            <w:tcMar>
+              <w:top w:w="80" w:type="dxa"/>
+              <w:left w:w="120" w:type="dxa"/>
+              <w:bottom w:w="80" w:type="dxa"/>
+              <w:right w:w="120" w:type="dxa"/>
+            </w:tcMar>
+          </w:tcPr>
+          <w:p>
+            <w:pPr>
+              <w:pStyle w:val="Compact"/>
+              <w:spacing w:before="20" w:beforeAutospacing="1" w:after="20" w:afterAutospacing="1" w:line="276" w:lineRule="auto"/>
+              <w:ind w:left="0" w:right="0"/>
+            </w:pPr>
+            <w:r>
+              <w:rPr>
+                <w:rFonts w:ascii="Segoe UI" w:hAnsi="Segoe UI" w:cs="Segoe UI" w:eastAsia="Segoe UI"/>
+                <w:b w:val="0"/>
+                <w:color w:val="0A192F"/>
+                <w:sz w:val="24"/>
+                <w:szCs w:val="20"/>
+                <w:lang w:val="fr-FR"/>
+              </w:rPr>
               <w:t xml:space="preserve">MySQL « port already allocated »</w:t>
             </w:r>
           </w:p>
@@ -14244,6 +14847,346 @@
           <w:color w:val="007A8C"/>
           <w:sz w:val="32"/>
         </w:rPr>
+        <w:t xml:space="preserve">Mettre un vrai certificat</w:t>
+      </w:r>
+    </w:p>
+    <w:p>
+      <w:pPr>
+        <w:pStyle w:val="FirstParagraph"/>
+        <w:spacing w:before="40" w:after="160" w:line="324" w:lineRule="auto"/>
+        <w:ind w:left="0" w:right="0"/>
+      </w:pPr>
+      <w:r>
+        <w:rPr>
+          <w:rFonts w:ascii="Segoe UI" w:hAnsi="Segoe UI" w:cs="Segoe UI" w:eastAsia="Segoe UI"/>
+          <w:b w:val="0"/>
+          <w:color w:val="0A192F"/>
+          <w:sz w:val="26"/>
+        </w:rPr>
+        <w:t xml:space="preserve">Sans domaine, le certificat auto-signé suffit (voir 02 — Lancer et relancer). Avec un domaine :</w:t>
+      </w:r>
+    </w:p>
+    <w:p>
+      <w:pPr>
+        <w:pStyle w:val="BodyText"/>
+        <w:spacing w:before="40" w:after="160" w:line="324" w:lineRule="auto"/>
+        <w:ind w:left="0" w:right="0"/>
+      </w:pPr>
+      <w:r>
+        <w:rPr>
+          <w:rFonts w:ascii="Segoe UI" w:hAnsi="Segoe UI" w:cs="Segoe UI" w:eastAsia="Segoe UI"/>
+          <w:b w:val="0"/>
+          <w:color w:val="0A192F"/>
+          <w:sz w:val="26"/>
+        </w:rPr>
+        <w:t xml:space="preserve">1. Obtenir </w:t>
+      </w:r>
+      <w:r>
+        <w:rPr>
+          <w:rStyle w:val="VerbatimChar"/>
+          <w:rFonts w:ascii="Segoe UI" w:hAnsi="Segoe UI" w:cs="Segoe UI" w:eastAsia="Segoe UI"/>
+          <w:b w:val="0"/>
+          <w:color w:val="0A192F"/>
+          <w:sz w:val="26"/>
+        </w:rPr>
+        <w:t xml:space="preserve">tls.crt</w:t>
+      </w:r>
+      <w:r>
+        <w:rPr>
+          <w:rFonts w:ascii="Segoe UI" w:hAnsi="Segoe UI" w:cs="Segoe UI" w:eastAsia="Segoe UI"/>
+          <w:b w:val="0"/>
+          <w:color w:val="0A192F"/>
+          <w:sz w:val="26"/>
+        </w:rPr>
+        <w:t xml:space="preserve"> (chaîne complète) et </w:t>
+      </w:r>
+      <w:r>
+        <w:rPr>
+          <w:rStyle w:val="VerbatimChar"/>
+          <w:rFonts w:ascii="Segoe UI" w:hAnsi="Segoe UI" w:cs="Segoe UI" w:eastAsia="Segoe UI"/>
+          <w:b w:val="0"/>
+          <w:color w:val="0A192F"/>
+          <w:sz w:val="26"/>
+        </w:rPr>
+        <w:t xml:space="preserve">tls.key</w:t>
+      </w:r>
+      <w:r>
+        <w:rPr>
+          <w:rFonts w:ascii="Segoe UI" w:hAnsi="Segoe UI" w:cs="Segoe UI" w:eastAsia="Segoe UI"/>
+          <w:b w:val="0"/>
+          <w:color w:val="0A192F"/>
+          <w:sz w:val="26"/>
+        </w:rPr>
+        <w:t xml:space="preserve"> pour ce domaine, par exemple avec Let’s Encrypt.</w:t>
+      </w:r>
+    </w:p>
+    <w:p>
+      <w:pPr>
+        <w:pStyle w:val="BodyText"/>
+        <w:spacing w:before="40" w:after="160" w:line="324" w:lineRule="auto"/>
+        <w:ind w:left="0" w:right="0"/>
+      </w:pPr>
+      <w:r>
+        <w:rPr>
+          <w:rFonts w:ascii="Segoe UI" w:hAnsi="Segoe UI" w:cs="Segoe UI" w:eastAsia="Segoe UI"/>
+          <w:b w:val="0"/>
+          <w:color w:val="0A192F"/>
+          <w:sz w:val="26"/>
+        </w:rPr>
+        <w:t xml:space="preserve">2. Les déposer dans le volume </w:t>
+      </w:r>
+      <w:r>
+        <w:rPr>
+          <w:rStyle w:val="VerbatimChar"/>
+          <w:rFonts w:ascii="Segoe UI" w:hAnsi="Segoe UI" w:cs="Segoe UI" w:eastAsia="Segoe UI"/>
+          <w:b w:val="0"/>
+          <w:color w:val="0A192F"/>
+          <w:sz w:val="26"/>
+        </w:rPr>
+        <w:t xml:space="preserve">frontend-certs</w:t>
+      </w:r>
+      <w:r>
+        <w:rPr>
+          <w:rFonts w:ascii="Segoe UI" w:hAnsi="Segoe UI" w:cs="Segoe UI" w:eastAsia="Segoe UI"/>
+          <w:b w:val="0"/>
+          <w:color w:val="0A192F"/>
+          <w:sz w:val="26"/>
+        </w:rPr>
+        <w:t xml:space="preserve">, ou monter un dossier du serveur sur </w:t>
+      </w:r>
+      <w:r>
+        <w:rPr>
+          <w:rStyle w:val="VerbatimChar"/>
+          <w:rFonts w:ascii="Segoe UI" w:hAnsi="Segoe UI" w:cs="Segoe UI" w:eastAsia="Segoe UI"/>
+          <w:b w:val="0"/>
+          <w:color w:val="0A192F"/>
+          <w:sz w:val="26"/>
+        </w:rPr>
+        <w:t xml:space="preserve">/etc/nginx/certs</w:t>
+      </w:r>
+      <w:r>
+        <w:rPr>
+          <w:rFonts w:ascii="Segoe UI" w:hAnsi="Segoe UI" w:cs="Segoe UI" w:eastAsia="Segoe UI"/>
+          <w:b w:val="0"/>
+          <w:color w:val="0A192F"/>
+          <w:sz w:val="26"/>
+        </w:rPr>
+        <w:t xml:space="preserve"> à la place du volume. Le conteneur les utilise tels quels et ne génère plus rien.</w:t>
+      </w:r>
+    </w:p>
+    <w:p>
+      <w:pPr>
+        <w:pStyle w:val="BodyText"/>
+        <w:spacing w:before="40" w:after="160" w:line="324" w:lineRule="auto"/>
+        <w:ind w:left="0" w:right="0"/>
+      </w:pPr>
+      <w:r>
+        <w:rPr>
+          <w:rFonts w:ascii="Segoe UI" w:hAnsi="Segoe UI" w:cs="Segoe UI" w:eastAsia="Segoe UI"/>
+          <w:b w:val="0"/>
+          <w:color w:val="0A192F"/>
+          <w:sz w:val="26"/>
+        </w:rPr>
+        <w:t xml:space="preserve">3. Dans </w:t>
+      </w:r>
+      <w:r>
+        <w:rPr>
+          <w:rStyle w:val="VerbatimChar"/>
+          <w:rFonts w:ascii="Segoe UI" w:hAnsi="Segoe UI" w:cs="Segoe UI" w:eastAsia="Segoe UI"/>
+          <w:b w:val="0"/>
+          <w:color w:val="0A192F"/>
+          <w:sz w:val="26"/>
+        </w:rPr>
+        <w:t xml:space="preserve">.env</w:t>
+      </w:r>
+      <w:r>
+        <w:rPr>
+          <w:rFonts w:ascii="Segoe UI" w:hAnsi="Segoe UI" w:cs="Segoe UI" w:eastAsia="Segoe UI"/>
+          <w:b w:val="0"/>
+          <w:color w:val="0A192F"/>
+          <w:sz w:val="26"/>
+        </w:rPr>
+        <w:t xml:space="preserve"> : </w:t>
+      </w:r>
+      <w:r>
+        <w:rPr>
+          <w:rStyle w:val="VerbatimChar"/>
+          <w:rFonts w:ascii="Segoe UI" w:hAnsi="Segoe UI" w:cs="Segoe UI" w:eastAsia="Segoe UI"/>
+          <w:b w:val="0"/>
+          <w:color w:val="0A192F"/>
+          <w:sz w:val="26"/>
+        </w:rPr>
+        <w:t xml:space="preserve">APP_URL</w:t>
+      </w:r>
+      <w:r>
+        <w:rPr>
+          <w:rFonts w:ascii="Segoe UI" w:hAnsi="Segoe UI" w:cs="Segoe UI" w:eastAsia="Segoe UI"/>
+          <w:b w:val="0"/>
+          <w:color w:val="0A192F"/>
+          <w:sz w:val="26"/>
+        </w:rPr>
+        <w:t xml:space="preserve">, </w:t>
+      </w:r>
+      <w:r>
+        <w:rPr>
+          <w:rStyle w:val="VerbatimChar"/>
+          <w:rFonts w:ascii="Segoe UI" w:hAnsi="Segoe UI" w:cs="Segoe UI" w:eastAsia="Segoe UI"/>
+          <w:b w:val="0"/>
+          <w:color w:val="0A192F"/>
+          <w:sz w:val="26"/>
+        </w:rPr>
+        <w:t xml:space="preserve">SANCTUM_STATEFUL_DOMAINS</w:t>
+      </w:r>
+      <w:r>
+        <w:rPr>
+          <w:rFonts w:ascii="Segoe UI" w:hAnsi="Segoe UI" w:cs="Segoe UI" w:eastAsia="Segoe UI"/>
+          <w:b w:val="0"/>
+          <w:color w:val="0A192F"/>
+          <w:sz w:val="26"/>
+        </w:rPr>
+        <w:t xml:space="preserve">, </w:t>
+      </w:r>
+      <w:r>
+        <w:rPr>
+          <w:rStyle w:val="VerbatimChar"/>
+          <w:rFonts w:ascii="Segoe UI" w:hAnsi="Segoe UI" w:cs="Segoe UI" w:eastAsia="Segoe UI"/>
+          <w:b w:val="0"/>
+          <w:color w:val="0A192F"/>
+          <w:sz w:val="26"/>
+        </w:rPr>
+        <w:t xml:space="preserve">CORS_ALLOWED_ORIGINS</w:t>
+      </w:r>
+      <w:r>
+        <w:rPr>
+          <w:rFonts w:ascii="Segoe UI" w:hAnsi="Segoe UI" w:cs="Segoe UI" w:eastAsia="Segoe UI"/>
+          <w:b w:val="0"/>
+          <w:color w:val="0A192F"/>
+          <w:sz w:val="26"/>
+        </w:rPr>
+        <w:t xml:space="preserve"> sur le domaine, </w:t>
+      </w:r>
+      <w:r>
+        <w:rPr>
+          <w:rStyle w:val="VerbatimChar"/>
+          <w:rFonts w:ascii="Segoe UI" w:hAnsi="Segoe UI" w:cs="Segoe UI" w:eastAsia="Segoe UI"/>
+          <w:b w:val="0"/>
+          <w:color w:val="0A192F"/>
+          <w:sz w:val="26"/>
+        </w:rPr>
+        <w:t xml:space="preserve">HTTPS_PORT=443</w:t>
+      </w:r>
+      <w:r>
+        <w:rPr>
+          <w:rFonts w:ascii="Segoe UI" w:hAnsi="Segoe UI" w:cs="Segoe UI" w:eastAsia="Segoe UI"/>
+          <w:b w:val="0"/>
+          <w:color w:val="0A192F"/>
+          <w:sz w:val="26"/>
+        </w:rPr>
+        <w:t xml:space="preserve">, </w:t>
+      </w:r>
+      <w:r>
+        <w:rPr>
+          <w:rStyle w:val="VerbatimChar"/>
+          <w:rFonts w:ascii="Segoe UI" w:hAnsi="Segoe UI" w:cs="Segoe UI" w:eastAsia="Segoe UI"/>
+          <w:b w:val="0"/>
+          <w:color w:val="0A192F"/>
+          <w:sz w:val="26"/>
+        </w:rPr>
+        <w:t xml:space="preserve">HTTP_PORT=80</w:t>
+      </w:r>
+      <w:r>
+        <w:rPr>
+          <w:rFonts w:ascii="Segoe UI" w:hAnsi="Segoe UI" w:cs="Segoe UI" w:eastAsia="Segoe UI"/>
+          <w:b w:val="0"/>
+          <w:color w:val="0A192F"/>
+          <w:sz w:val="26"/>
+        </w:rPr>
+        <w:t xml:space="preserve">, puis </w:t>
+      </w:r>
+      <w:r>
+        <w:rPr>
+          <w:rStyle w:val="VerbatimChar"/>
+          <w:rFonts w:ascii="Segoe UI" w:hAnsi="Segoe UI" w:cs="Segoe UI" w:eastAsia="Segoe UI"/>
+          <w:b w:val="0"/>
+          <w:color w:val="0A192F"/>
+          <w:sz w:val="26"/>
+        </w:rPr>
+        <w:t xml:space="preserve">HSTS_MAX_AGE=31536000</w:t>
+      </w:r>
+      <w:r>
+        <w:rPr>
+          <w:rFonts w:ascii="Segoe UI" w:hAnsi="Segoe UI" w:cs="Segoe UI" w:eastAsia="Segoe UI"/>
+          <w:b w:val="0"/>
+          <w:color w:val="0A192F"/>
+          <w:sz w:val="26"/>
+        </w:rPr>
+        <w:t xml:space="preserve">.</w:t>
+      </w:r>
+    </w:p>
+    <w:p>
+      <w:pPr>
+        <w:pStyle w:val="BodyText"/>
+        <w:spacing w:before="40" w:after="160" w:line="324" w:lineRule="auto"/>
+        <w:ind w:left="0" w:right="0"/>
+      </w:pPr>
+      <w:r>
+        <w:rPr>
+          <w:rFonts w:ascii="Segoe UI" w:hAnsi="Segoe UI" w:cs="Segoe UI" w:eastAsia="Segoe UI"/>
+          <w:b w:val="0"/>
+          <w:color w:val="0A192F"/>
+          <w:sz w:val="26"/>
+        </w:rPr>
+        <w:t xml:space="preserve">4. </w:t>
+      </w:r>
+      <w:r>
+        <w:rPr>
+          <w:rStyle w:val="VerbatimChar"/>
+          <w:rFonts w:ascii="Segoe UI" w:hAnsi="Segoe UI" w:cs="Segoe UI" w:eastAsia="Segoe UI"/>
+          <w:b w:val="0"/>
+          <w:color w:val="0A192F"/>
+          <w:sz w:val="26"/>
+        </w:rPr>
+        <w:t xml:space="preserve">docker compose up -d --build</w:t>
+      </w:r>
+      <w:r>
+        <w:rPr>
+          <w:rFonts w:ascii="Segoe UI" w:hAnsi="Segoe UI" w:cs="Segoe UI" w:eastAsia="Segoe UI"/>
+          <w:b w:val="0"/>
+          <w:color w:val="0A192F"/>
+          <w:sz w:val="26"/>
+        </w:rPr>
+        <w:t xml:space="preserve">.</w:t>
+      </w:r>
+    </w:p>
+    <w:p>
+      <w:pPr>
+        <w:pStyle w:val="BodyText"/>
+        <w:spacing w:before="40" w:after="160" w:line="324" w:lineRule="auto"/>
+        <w:ind w:left="0" w:right="0"/>
+      </w:pPr>
+      <w:r>
+        <w:rPr>
+          <w:rFonts w:ascii="Segoe UI" w:hAnsi="Segoe UI" w:cs="Segoe UI" w:eastAsia="Segoe UI"/>
+          <w:b w:val="0"/>
+          <w:color w:val="0A192F"/>
+          <w:sz w:val="26"/>
+        </w:rPr>
+        <w:t xml:space="preserve">HSTS reste à 0 tant que le certificat n’est pas reconnu : il oblige le navigateur à refuser le HTTP pour ce nom pendant un an.</w:t>
+      </w:r>
+    </w:p>
+    <w:p>
+      <w:pPr>
+        <w:pStyle w:val="Titre2"/>
+        <w:spacing w:before="280" w:after="120" w:line="276" w:lineRule="auto"/>
+        <w:ind w:left="0" w:right="0"/>
+      </w:pPr>
+      <w:r>
+        <w:rPr>
+          <w:rFonts w:ascii="Segoe UI" w:hAnsi="Segoe UI" w:cs="Segoe UI" w:eastAsia="Segoe UI"/>
+          <w:b/>
+          <w:color w:val="007A8C"/>
+          <w:sz w:val="32"/>
+        </w:rPr>
         <w:t>Revue de sécurité</w:t>
       </w:r>
     </w:p>
@@ -15272,6 +16215,84 @@
           <w:sz w:val="26"/>
         </w:rPr>
         <w:t xml:space="preserve">, une clé ou un certificat, et GitHub refuse le push d’un secret connu.</w:t>
+      </w:r>
+    </w:p>
+    <w:p>
+      <w:pPr>
+        <w:pStyle w:val="Compact"/>
+        <w:numPr>
+          <w:ilvl w:val="0"/>
+          <w:numId w:val="2"/>
+        </w:numPr>
+        <w:spacing w:before="20" w:after="80" w:line="312" w:lineRule="auto"/>
+        <w:ind w:left="170" w:right="0"/>
+      </w:pPr>
+      <w:r>
+        <w:rPr>
+          <w:rFonts w:ascii="Segoe UI" w:hAnsi="Segoe UI" w:cs="Segoe UI" w:eastAsia="Segoe UI"/>
+          <w:b w:val="0"/>
+          <w:color w:val="0A192F"/>
+          <w:sz w:val="26"/>
+        </w:rPr>
+        <w:t xml:space="preserve">Le certificat TLS et sa clé vivent dans le volume </w:t>
+      </w:r>
+      <w:r>
+        <w:rPr>
+          <w:rStyle w:val="VerbatimChar"/>
+          <w:rFonts w:ascii="Segoe UI" w:hAnsi="Segoe UI" w:cs="Segoe UI" w:eastAsia="Segoe UI"/>
+          <w:b w:val="0"/>
+          <w:color w:val="0A192F"/>
+          <w:sz w:val="26"/>
+        </w:rPr>
+        <w:t xml:space="preserve">frontend-certs</w:t>
+      </w:r>
+      <w:r>
+        <w:rPr>
+          <w:rFonts w:ascii="Segoe UI" w:hAnsi="Segoe UI" w:cs="Segoe UI" w:eastAsia="Segoe UI"/>
+          <w:b w:val="0"/>
+          <w:color w:val="0A192F"/>
+          <w:sz w:val="26"/>
+        </w:rPr>
+        <w:t xml:space="preserve">, jamais dans le dépôt.</w:t>
+      </w:r>
+    </w:p>
+    <w:p>
+      <w:pPr>
+        <w:pStyle w:val="Compact"/>
+        <w:numPr>
+          <w:ilvl w:val="0"/>
+          <w:numId w:val="2"/>
+        </w:numPr>
+        <w:spacing w:before="20" w:after="80" w:line="312" w:lineRule="auto"/>
+        <w:ind w:left="170" w:right="0"/>
+      </w:pPr>
+      <w:r>
+        <w:rPr>
+          <w:rFonts w:ascii="Segoe UI" w:hAnsi="Segoe UI" w:cs="Segoe UI" w:eastAsia="Segoe UI"/>
+          <w:b w:val="0"/>
+          <w:color w:val="0A192F"/>
+          <w:sz w:val="26"/>
+        </w:rPr>
+        <w:t xml:space="preserve">Ne pas passer </w:t>
+      </w:r>
+      <w:r>
+        <w:rPr>
+          <w:rStyle w:val="VerbatimChar"/>
+          <w:rFonts w:ascii="Segoe UI" w:hAnsi="Segoe UI" w:cs="Segoe UI" w:eastAsia="Segoe UI"/>
+          <w:b w:val="0"/>
+          <w:color w:val="0A192F"/>
+          <w:sz w:val="26"/>
+        </w:rPr>
+        <w:t xml:space="preserve">SESSION_SECURE_COOKIE=false</w:t>
+      </w:r>
+      <w:r>
+        <w:rPr>
+          <w:rFonts w:ascii="Segoe UI" w:hAnsi="Segoe UI" w:cs="Segoe UI" w:eastAsia="Segoe UI"/>
+          <w:b w:val="0"/>
+          <w:color w:val="0A192F"/>
+          <w:sz w:val="26"/>
+        </w:rPr>
+        <w:t xml:space="preserve"> en production : les cookies de session partiraient en clair.</w:t>
       </w:r>
     </w:p>
     <w:p>
@@ -17177,6 +18198,26 @@
         <w:spacing w:before="20" w:after="80" w:line="312" w:lineRule="auto"/>
         <w:ind w:left="170" w:right="0"/>
       </w:pPr>
+      <w:r>
+        <w:rPr>
+          <w:rFonts w:ascii="Segoe UI" w:hAnsi="Segoe UI" w:cs="Segoe UI" w:eastAsia="Segoe UI"/>
+          <w:b w:val="0"/>
+          <w:color w:val="0A192F"/>
+          <w:sz w:val="26"/>
+        </w:rPr>
+        <w:t xml:space="preserve">Le certificat HTTPS est auto-signé tant que le projet n’a pas de nom de domaine : chiffrement réel, alerte du navigateur à accepter.</w:t>
+      </w:r>
+    </w:p>
+    <w:p>
+      <w:pPr>
+        <w:pStyle w:val="Compact"/>
+        <w:numPr>
+          <w:ilvl w:val="0"/>
+          <w:numId w:val="3"/>
+        </w:numPr>
+        <w:spacing w:before="20" w:after="80" w:line="312" w:lineRule="auto"/>
+        <w:ind w:left="170" w:right="0"/>
+      </w:pPr>
       <w:bookmarkStart w:id="72" w:name="contrôles-qualité"/>
       <w:bookmarkStart w:id="73" w:name="_Toc243379755"/>
       <w:bookmarkEnd w:id="62"/>
@@ -19372,7 +20413,7 @@
                 <w:szCs w:val="20"/>
                 <w:lang w:val="fr-FR"/>
               </w:rPr>
-              <w:t xml:space="preserve">Les images de prod démarrent, le site, </w:t>
+              <w:t xml:space="preserve">Les images de prod démarrent ; le HTTP redirige vers HTTPS ; TLS 1.1 et inférieur sont refusés ; les cookies de session sont </w:t>
             </w:r>
             <w:r>
               <w:rPr>
@@ -19384,6 +20425,52 @@
                 <w:szCs w:val="20"/>
                 <w:lang w:val="fr-FR"/>
               </w:rPr>
+              <w:t xml:space="preserve">Secure</w:t>
+            </w:r>
+            <w:r>
+              <w:rPr>
+                <w:rFonts w:ascii="Segoe UI" w:hAnsi="Segoe UI" w:cs="Segoe UI" w:eastAsia="Segoe UI"/>
+                <w:b w:val="0"/>
+                <w:color w:val="0A192F"/>
+                <w:sz w:val="24"/>
+                <w:szCs w:val="20"/>
+                <w:lang w:val="fr-FR"/>
+              </w:rPr>
+              <w:t xml:space="preserve"> et </w:t>
+            </w:r>
+            <w:r>
+              <w:rPr>
+                <w:rStyle w:val="VerbatimChar"/>
+                <w:rFonts w:ascii="Segoe UI" w:hAnsi="Segoe UI" w:cs="Segoe UI" w:eastAsia="Segoe UI"/>
+                <w:b w:val="0"/>
+                <w:color w:val="0A192F"/>
+                <w:sz w:val="24"/>
+                <w:szCs w:val="20"/>
+                <w:lang w:val="fr-FR"/>
+              </w:rPr>
+              <w:t xml:space="preserve">HttpOnly</w:t>
+            </w:r>
+            <w:r>
+              <w:rPr>
+                <w:rFonts w:ascii="Segoe UI" w:hAnsi="Segoe UI" w:cs="Segoe UI" w:eastAsia="Segoe UI"/>
+                <w:b w:val="0"/>
+                <w:color w:val="0A192F"/>
+                <w:sz w:val="24"/>
+                <w:szCs w:val="20"/>
+                <w:lang w:val="fr-FR"/>
+              </w:rPr>
+              <w:t xml:space="preserve"> ; le site, </w:t>
+            </w:r>
+            <w:r>
+              <w:rPr>
+                <w:rStyle w:val="VerbatimChar"/>
+                <w:rFonts w:ascii="Segoe UI" w:hAnsi="Segoe UI" w:cs="Segoe UI" w:eastAsia="Segoe UI"/>
+                <w:b w:val="0"/>
+                <w:color w:val="0A192F"/>
+                <w:sz w:val="24"/>
+                <w:szCs w:val="20"/>
+                <w:lang w:val="fr-FR"/>
+              </w:rPr>
               <w:t xml:space="preserve">/up</w:t>
             </w:r>
             <w:r>
@@ -19395,7 +20482,7 @@
                 <w:szCs w:val="20"/>
                 <w:lang w:val="fr-FR"/>
               </w:rPr>
-              <w:t xml:space="preserve"> et l’API répondent à travers le front, la recherche et la connexion fonctionnent</w:t>
+              <w:t xml:space="preserve"> et l’API répondent, la recherche et la connexion fonctionnent</w:t>
             </w:r>
           </w:p>
         </w:tc>
@@ -19426,7 +20513,7 @@
                 <w:szCs w:val="20"/>
                 <w:lang w:val="fr-FR"/>
               </w:rPr>
-              <w:t xml:space="preserve">Tous les cas d’erreur</w:t>
+              <w:t xml:space="preserve">Que le certificat soit reconnu par le navigateur (auto-signé sans domaine)</w:t>
             </w:r>
           </w:p>
         </w:tc>

</xml_diff>

<commit_message>
fix(deploiement): corrections issues de la seconde revue red team
- restore.ps1 / backup.ps1 : tar de Windows appelé par son chemin (le tar GNU
  de Git for Windows, s'il est dans le PATH, prenait « C:\… » pour un serveur
  distant) ; chemin d'archive résolu depuis le dossier de l'appelant ; taille
  affichée en Ko sous 1 Mo.
- backup.sh / restore.sh : docker compose exec lit /dev/null (il consommait
  l'entrée standard de l'appelant, ex. ssh … 'bash -s' < script).
- restore.(sh|ps1) : redémarrage du back en fin de restauration (mot de passe
  du compte de démo réappliqué depuis le .env, migrations si archive ancienne).
- Docs (md + docx) : garder une copie du .env, dépannage « Access denied » après
  un .env recréé, plusieurs adresses autorisées, effet de la restauration.
</commit_message>
<xml_diff>
--- a/docs/passation/Lab-Horizon-dossier-de-passation.docx
+++ b/docs/passation/Lab-Horizon-dossier-de-passation.docx
@@ -11204,6 +11204,40 @@
               </w:rPr>
               <w:t xml:space="preserve">APP_URL</w:t>
             </w:r>
+            <w:r>
+              <w:rPr>
+                <w:rFonts w:ascii="Segoe UI" w:hAnsi="Segoe UI" w:cs="Segoe UI" w:eastAsia="Segoe UI"/>
+                <w:b w:val="0"/>
+                <w:color w:val="0A192F"/>
+                <w:sz w:val="24"/>
+                <w:szCs w:val="20"/>
+                <w:lang w:val="fr-FR"/>
+              </w:rPr>
+              <w:t xml:space="preserve">, réglées par </w:t>
+            </w:r>
+            <w:r>
+              <w:rPr>
+                <w:rStyle w:val="VerbatimChar"/>
+                <w:rFonts w:ascii="Segoe UI" w:hAnsi="Segoe UI" w:cs="Segoe UI" w:eastAsia="Segoe UI"/>
+                <w:b w:val="0"/>
+                <w:color w:val="0A192F"/>
+                <w:sz w:val="24"/>
+                <w:szCs w:val="20"/>
+                <w:lang w:val="fr-FR"/>
+              </w:rPr>
+              <w:t xml:space="preserve">init-env</w:t>
+            </w:r>
+            <w:r>
+              <w:rPr>
+                <w:rFonts w:ascii="Segoe UI" w:hAnsi="Segoe UI" w:cs="Segoe UI" w:eastAsia="Segoe UI"/>
+                <w:b w:val="0"/>
+                <w:color w:val="0A192F"/>
+                <w:sz w:val="24"/>
+                <w:szCs w:val="20"/>
+                <w:lang w:val="fr-FR"/>
+              </w:rPr>
+              <w:t xml:space="preserve"> (qui remplace la liste). Plusieurs adresses (IP et domaine) : les séparer par des virgules, à la main</w:t>
+            </w:r>
           </w:p>
         </w:tc>
       </w:tr>
@@ -11370,6 +11404,50 @@
           <w:sz w:val="26"/>
         </w:rPr>
         <w:t xml:space="preserve">init-env</w:t>
+      </w:r>
+      <w:r>
+        <w:rPr>
+          <w:rFonts w:ascii="Segoe UI" w:hAnsi="Segoe UI" w:cs="Segoe UI" w:eastAsia="Segoe UI"/>
+          <w:b w:val="0"/>
+          <w:color w:val="0A192F"/>
+          <w:sz w:val="26"/>
+        </w:rPr>
+        <w:t xml:space="preserve">.</w:t>
+      </w:r>
+    </w:p>
+    <w:p>
+      <w:pPr>
+        <w:pStyle w:val="BodyText"/>
+        <w:spacing w:before="40" w:after="160" w:line="324" w:lineRule="auto"/>
+        <w:ind w:left="0" w:right="0"/>
+      </w:pPr>
+      <w:r>
+        <w:rPr>
+          <w:rFonts w:ascii="Segoe UI" w:hAnsi="Segoe UI" w:cs="Segoe UI" w:eastAsia="Segoe UI"/>
+          <w:b/>
+          <w:color w:val="0A192F"/>
+          <w:sz w:val="26"/>
+        </w:rPr>
+        <w:t xml:space="preserve">Garder une copie du `.env`</w:t>
+      </w:r>
+      <w:r>
+        <w:rPr>
+          <w:rFonts w:ascii="Segoe UI" w:hAnsi="Segoe UI" w:cs="Segoe UI" w:eastAsia="Segoe UI"/>
+          <w:b w:val="0"/>
+          <w:color w:val="0A192F"/>
+          <w:sz w:val="26"/>
+        </w:rPr>
+        <w:t xml:space="preserve"> en lieu sûr, hors du serveur : il contient les secrets. Sans lui, la base existante n’est plus accessible (nouveaux mots de passe MySQL). Une sauvegarde, elle, se restaure sur une installation neuve avec un nouveau </w:t>
+      </w:r>
+      <w:r>
+        <w:rPr>
+          <w:rStyle w:val="VerbatimChar"/>
+          <w:rFonts w:ascii="Segoe UI" w:hAnsi="Segoe UI" w:cs="Segoe UI" w:eastAsia="Segoe UI"/>
+          <w:b w:val="0"/>
+          <w:color w:val="0A192F"/>
+          <w:sz w:val="26"/>
+        </w:rPr>
+        <w:t xml:space="preserve">.env</w:t>
       </w:r>
       <w:r>
         <w:rPr>
@@ -13735,14 +13813,38 @@
             </w:pPr>
             <w:r>
               <w:rPr>
-                <w:rFonts w:ascii="Segoe UI" w:hAnsi="Segoe UI" w:cs="Segoe UI" w:eastAsia="Segoe UI"/>
-                <w:b w:val="0"/>
-                <w:color w:val="0A192F"/>
-                <w:sz w:val="24"/>
-                <w:szCs w:val="20"/>
-                <w:lang w:val="fr-FR"/>
-              </w:rPr>
-              <w:t xml:space="preserve">Site arrêté après un redémarrage Windows</w:t>
+                <w:rStyle w:val="VerbatimChar"/>
+                <w:rFonts w:ascii="Segoe UI" w:hAnsi="Segoe UI" w:cs="Segoe UI" w:eastAsia="Segoe UI"/>
+                <w:b w:val="0"/>
+                <w:color w:val="0A192F"/>
+                <w:sz w:val="24"/>
+                <w:szCs w:val="20"/>
+                <w:lang w:val="fr-FR"/>
+              </w:rPr>
+              <w:t xml:space="preserve">backend</w:t>
+            </w:r>
+            <w:r>
+              <w:rPr>
+                <w:rFonts w:ascii="Segoe UI" w:hAnsi="Segoe UI" w:cs="Segoe UI" w:eastAsia="Segoe UI"/>
+                <w:b w:val="0"/>
+                <w:color w:val="0A192F"/>
+                <w:sz w:val="24"/>
+                <w:szCs w:val="20"/>
+                <w:lang w:val="fr-FR"/>
+              </w:rPr>
+              <w:t xml:space="preserve"> redémarre en boucle, logs </w:t>
+            </w:r>
+            <w:r>
+              <w:rPr>
+                <w:rStyle w:val="VerbatimChar"/>
+                <w:rFonts w:ascii="Segoe UI" w:hAnsi="Segoe UI" w:cs="Segoe UI" w:eastAsia="Segoe UI"/>
+                <w:b w:val="0"/>
+                <w:color w:val="0A192F"/>
+                <w:sz w:val="24"/>
+                <w:szCs w:val="20"/>
+                <w:lang w:val="fr-FR"/>
+              </w:rPr>
+              <w:t xml:space="preserve">Access denied for user</w:t>
             </w:r>
           </w:p>
         </w:tc>
@@ -13766,14 +13868,26 @@
             </w:pPr>
             <w:r>
               <w:rPr>
-                <w:rFonts w:ascii="Segoe UI" w:hAnsi="Segoe UI" w:cs="Segoe UI" w:eastAsia="Segoe UI"/>
-                <w:b w:val="0"/>
-                <w:color w:val="0A192F"/>
-                <w:sz w:val="24"/>
-                <w:szCs w:val="20"/>
-                <w:lang w:val="fr-FR"/>
-              </w:rPr>
-              <w:t xml:space="preserve">Docker Desktop ne démarre qu’à l’ouverture de session</w:t>
+                <w:rStyle w:val="VerbatimChar"/>
+                <w:rFonts w:ascii="Segoe UI" w:hAnsi="Segoe UI" w:cs="Segoe UI" w:eastAsia="Segoe UI"/>
+                <w:b w:val="0"/>
+                <w:color w:val="0A192F"/>
+                <w:sz w:val="24"/>
+                <w:szCs w:val="20"/>
+                <w:lang w:val="fr-FR"/>
+              </w:rPr>
+              <w:t xml:space="preserve">.env</w:t>
+            </w:r>
+            <w:r>
+              <w:rPr>
+                <w:rFonts w:ascii="Segoe UI" w:hAnsi="Segoe UI" w:cs="Segoe UI" w:eastAsia="Segoe UI"/>
+                <w:b w:val="0"/>
+                <w:color w:val="0A192F"/>
+                <w:sz w:val="24"/>
+                <w:szCs w:val="20"/>
+                <w:lang w:val="fr-FR"/>
+              </w:rPr>
+              <w:t xml:space="preserve"> recréé alors que la base existait : nouveaux mots de passe MySQL</w:t>
             </w:r>
           </w:p>
         </w:tc>
@@ -13804,7 +13918,76 @@
                 <w:szCs w:val="20"/>
                 <w:lang w:val="fr-FR"/>
               </w:rPr>
-              <w:t xml:space="preserve">Section « Redémarrage de la machine »</w:t>
+              <w:t xml:space="preserve">Remettre la copie du </w:t>
+            </w:r>
+            <w:r>
+              <w:rPr>
+                <w:rStyle w:val="VerbatimChar"/>
+                <w:rFonts w:ascii="Segoe UI" w:hAnsi="Segoe UI" w:cs="Segoe UI" w:eastAsia="Segoe UI"/>
+                <w:b w:val="0"/>
+                <w:color w:val="0A192F"/>
+                <w:sz w:val="24"/>
+                <w:szCs w:val="20"/>
+                <w:lang w:val="fr-FR"/>
+              </w:rPr>
+              <w:t xml:space="preserve">.env</w:t>
+            </w:r>
+            <w:r>
+              <w:rPr>
+                <w:rFonts w:ascii="Segoe UI" w:hAnsi="Segoe UI" w:cs="Segoe UI" w:eastAsia="Segoe UI"/>
+                <w:b w:val="0"/>
+                <w:color w:val="0A192F"/>
+                <w:sz w:val="24"/>
+                <w:szCs w:val="20"/>
+                <w:lang w:val="fr-FR"/>
+              </w:rPr>
+              <w:t xml:space="preserve">. Sans copie : </w:t>
+            </w:r>
+            <w:r>
+              <w:rPr>
+                <w:rStyle w:val="VerbatimChar"/>
+                <w:rFonts w:ascii="Segoe UI" w:hAnsi="Segoe UI" w:cs="Segoe UI" w:eastAsia="Segoe UI"/>
+                <w:b w:val="0"/>
+                <w:color w:val="0A192F"/>
+                <w:sz w:val="24"/>
+                <w:szCs w:val="20"/>
+                <w:lang w:val="fr-FR"/>
+              </w:rPr>
+              <w:t xml:space="preserve">docker compose down -v</w:t>
+            </w:r>
+            <w:r>
+              <w:rPr>
+                <w:rFonts w:ascii="Segoe UI" w:hAnsi="Segoe UI" w:cs="Segoe UI" w:eastAsia="Segoe UI"/>
+                <w:b w:val="0"/>
+                <w:color w:val="0A192F"/>
+                <w:sz w:val="24"/>
+                <w:szCs w:val="20"/>
+                <w:lang w:val="fr-FR"/>
+              </w:rPr>
+              <w:t xml:space="preserve"> (efface la base), </w:t>
+            </w:r>
+            <w:r>
+              <w:rPr>
+                <w:rStyle w:val="VerbatimChar"/>
+                <w:rFonts w:ascii="Segoe UI" w:hAnsi="Segoe UI" w:cs="Segoe UI" w:eastAsia="Segoe UI"/>
+                <w:b w:val="0"/>
+                <w:color w:val="0A192F"/>
+                <w:sz w:val="24"/>
+                <w:szCs w:val="20"/>
+                <w:lang w:val="fr-FR"/>
+              </w:rPr>
+              <w:t xml:space="preserve">docker compose up -d</w:t>
+            </w:r>
+            <w:r>
+              <w:rPr>
+                <w:rFonts w:ascii="Segoe UI" w:hAnsi="Segoe UI" w:cs="Segoe UI" w:eastAsia="Segoe UI"/>
+                <w:b w:val="0"/>
+                <w:color w:val="0A192F"/>
+                <w:sz w:val="24"/>
+                <w:szCs w:val="20"/>
+                <w:lang w:val="fr-FR"/>
+              </w:rPr>
+              <w:t xml:space="preserve">, puis restaurer la dernière sauvegarde</w:t>
             </w:r>
           </w:p>
         </w:tc>
@@ -13837,7 +14020,7 @@
                 <w:szCs w:val="20"/>
                 <w:lang w:val="fr-FR"/>
               </w:rPr>
-              <w:t xml:space="preserve">Page ancienne après un pull</w:t>
+              <w:t xml:space="preserve">Site arrêté après un redémarrage Windows</w:t>
             </w:r>
           </w:p>
         </w:tc>
@@ -13868,7 +14051,7 @@
                 <w:szCs w:val="20"/>
                 <w:lang w:val="fr-FR"/>
               </w:rPr>
-              <w:t xml:space="preserve">Images non reconstruites</w:t>
+              <w:t xml:space="preserve">Docker Desktop ne démarre qu’à l’ouverture de session</w:t>
             </w:r>
           </w:p>
         </w:tc>
@@ -13892,15 +14075,14 @@
             </w:pPr>
             <w:r>
               <w:rPr>
-                <w:rStyle w:val="VerbatimChar"/>
-                <w:rFonts w:ascii="Segoe UI" w:hAnsi="Segoe UI" w:cs="Segoe UI" w:eastAsia="Segoe UI"/>
-                <w:b w:val="0"/>
-                <w:color w:val="0A192F"/>
-                <w:sz w:val="24"/>
-                <w:szCs w:val="20"/>
-                <w:lang w:val="fr-FR"/>
-              </w:rPr>
-              <w:t xml:space="preserve">docker compose up -d --build</w:t>
+                <w:rFonts w:ascii="Segoe UI" w:hAnsi="Segoe UI" w:cs="Segoe UI" w:eastAsia="Segoe UI"/>
+                <w:b w:val="0"/>
+                <w:color w:val="0A192F"/>
+                <w:sz w:val="24"/>
+                <w:szCs w:val="20"/>
+                <w:lang w:val="fr-FR"/>
+              </w:rPr>
+              <w:t xml:space="preserve">Section « Redémarrage de la machine »</w:t>
             </w:r>
           </w:p>
         </w:tc>
@@ -13933,7 +14115,7 @@
                 <w:szCs w:val="20"/>
                 <w:lang w:val="fr-FR"/>
               </w:rPr>
-              <w:t xml:space="preserve">Login impossible depuis un autre appareil</w:t>
+              <w:t xml:space="preserve">Page ancienne après un pull</w:t>
             </w:r>
           </w:p>
         </w:tc>
@@ -13964,8 +14146,28 @@
                 <w:szCs w:val="20"/>
                 <w:lang w:val="fr-FR"/>
               </w:rPr>
-              <w:t xml:space="preserve">Adresse absente de </w:t>
-            </w:r>
+              <w:t xml:space="preserve">Images non reconstruites</w:t>
+            </w:r>
+          </w:p>
+        </w:tc>
+        <w:tc>
+          <w:tcPr>
+            <w:tcW w:w="4476" w:type="dxa"/>
+            <w:hideMark/>
+            <w:shd w:val="clear" w:color="auto" w:fill="F3ECDA"/>
+            <w:tcMar>
+              <w:top w:w="80" w:type="dxa"/>
+              <w:left w:w="120" w:type="dxa"/>
+              <w:bottom w:w="80" w:type="dxa"/>
+              <w:right w:w="120" w:type="dxa"/>
+            </w:tcMar>
+          </w:tcPr>
+          <w:p>
+            <w:pPr>
+              <w:pStyle w:val="Compact"/>
+              <w:spacing w:before="20" w:beforeAutospacing="1" w:after="20" w:afterAutospacing="1" w:line="276" w:lineRule="auto"/>
+              <w:ind w:left="0" w:right="0"/>
+            </w:pPr>
             <w:r>
               <w:rPr>
                 <w:rStyle w:val="VerbatimChar"/>
@@ -13976,95 +14178,7 @@
                 <w:szCs w:val="20"/>
                 <w:lang w:val="fr-FR"/>
               </w:rPr>
-              <w:t xml:space="preserve">SANCTUM_STATEFUL_DOMAINS</w:t>
-            </w:r>
-            <w:r>
-              <w:rPr>
-                <w:rFonts w:ascii="Segoe UI" w:hAnsi="Segoe UI" w:cs="Segoe UI" w:eastAsia="Segoe UI"/>
-                <w:b w:val="0"/>
-                <w:color w:val="0A192F"/>
-                <w:sz w:val="24"/>
-                <w:szCs w:val="20"/>
-                <w:lang w:val="fr-FR"/>
-              </w:rPr>
-              <w:t xml:space="preserve"> / </w:t>
-            </w:r>
-            <w:r>
-              <w:rPr>
-                <w:rStyle w:val="VerbatimChar"/>
-                <w:rFonts w:ascii="Segoe UI" w:hAnsi="Segoe UI" w:cs="Segoe UI" w:eastAsia="Segoe UI"/>
-                <w:b w:val="0"/>
-                <w:color w:val="0A192F"/>
-                <w:sz w:val="24"/>
-                <w:szCs w:val="20"/>
-                <w:lang w:val="fr-FR"/>
-              </w:rPr>
-              <w:t xml:space="preserve">CORS_ALLOWED_ORIGINS</w:t>
-            </w:r>
-            <w:r>
-              <w:rPr>
-                <w:rFonts w:ascii="Segoe UI" w:hAnsi="Segoe UI" w:cs="Segoe UI" w:eastAsia="Segoe UI"/>
-                <w:b w:val="0"/>
-                <w:color w:val="0A192F"/>
-                <w:sz w:val="24"/>
-                <w:szCs w:val="20"/>
-                <w:lang w:val="fr-FR"/>
-              </w:rPr>
-              <w:t xml:space="preserve">, ou isolation Wi-Fi</w:t>
-            </w:r>
-          </w:p>
-        </w:tc>
-        <w:tc>
-          <w:tcPr>
-            <w:tcW w:w="4476" w:type="dxa"/>
-            <w:hideMark/>
-            <w:shd w:val="clear" w:color="auto" w:fill="F3ECDA"/>
-            <w:tcMar>
-              <w:top w:w="80" w:type="dxa"/>
-              <w:left w:w="120" w:type="dxa"/>
-              <w:bottom w:w="80" w:type="dxa"/>
-              <w:right w:w="120" w:type="dxa"/>
-            </w:tcMar>
-          </w:tcPr>
-          <w:p>
-            <w:pPr>
-              <w:pStyle w:val="Compact"/>
-              <w:spacing w:before="20" w:beforeAutospacing="1" w:after="20" w:afterAutospacing="1" w:line="276" w:lineRule="auto"/>
-              <w:ind w:left="0" w:right="0"/>
-            </w:pPr>
-            <w:r>
-              <w:rPr>
-                <w:rFonts w:ascii="Segoe UI" w:hAnsi="Segoe UI" w:cs="Segoe UI" w:eastAsia="Segoe UI"/>
-                <w:b w:val="0"/>
-                <w:color w:val="0A192F"/>
-                <w:sz w:val="24"/>
-                <w:szCs w:val="20"/>
-                <w:lang w:val="fr-FR"/>
-              </w:rPr>
-              <w:t xml:space="preserve">Relancer </w:t>
-            </w:r>
-            <w:r>
-              <w:rPr>
-                <w:rStyle w:val="VerbatimChar"/>
-                <w:rFonts w:ascii="Segoe UI" w:hAnsi="Segoe UI" w:cs="Segoe UI" w:eastAsia="Segoe UI"/>
-                <w:b w:val="0"/>
-                <w:color w:val="0A192F"/>
-                <w:sz w:val="24"/>
-                <w:szCs w:val="20"/>
-                <w:lang w:val="fr-FR"/>
-              </w:rPr>
-              <w:t xml:space="preserve">init-env</w:t>
-            </w:r>
-            <w:r>
-              <w:rPr>
-                <w:rFonts w:ascii="Segoe UI" w:hAnsi="Segoe UI" w:cs="Segoe UI" w:eastAsia="Segoe UI"/>
-                <w:b w:val="0"/>
-                <w:color w:val="0A192F"/>
-                <w:sz w:val="24"/>
-                <w:szCs w:val="20"/>
-                <w:lang w:val="fr-FR"/>
-              </w:rPr>
-              <w:t xml:space="preserve"> avec l’adresse utilisée</w:t>
+              <w:t xml:space="preserve">docker compose up -d --build</w:t>
             </w:r>
           </w:p>
         </w:tc>
@@ -14097,7 +14211,7 @@
                 <w:szCs w:val="20"/>
                 <w:lang w:val="fr-FR"/>
               </w:rPr>
-              <w:t xml:space="preserve">Alerte « connexion non privée »</w:t>
+              <w:t xml:space="preserve">Login impossible depuis un autre appareil</w:t>
             </w:r>
           </w:p>
         </w:tc>
@@ -14128,7 +14242,53 @@
                 <w:szCs w:val="20"/>
                 <w:lang w:val="fr-FR"/>
               </w:rPr>
-              <w:t xml:space="preserve">Certificat auto-signé</w:t>
+              <w:t xml:space="preserve">Adresse absente de </w:t>
+            </w:r>
+            <w:r>
+              <w:rPr>
+                <w:rStyle w:val="VerbatimChar"/>
+                <w:rFonts w:ascii="Segoe UI" w:hAnsi="Segoe UI" w:cs="Segoe UI" w:eastAsia="Segoe UI"/>
+                <w:b w:val="0"/>
+                <w:color w:val="0A192F"/>
+                <w:sz w:val="24"/>
+                <w:szCs w:val="20"/>
+                <w:lang w:val="fr-FR"/>
+              </w:rPr>
+              <w:t xml:space="preserve">SANCTUM_STATEFUL_DOMAINS</w:t>
+            </w:r>
+            <w:r>
+              <w:rPr>
+                <w:rFonts w:ascii="Segoe UI" w:hAnsi="Segoe UI" w:cs="Segoe UI" w:eastAsia="Segoe UI"/>
+                <w:b w:val="0"/>
+                <w:color w:val="0A192F"/>
+                <w:sz w:val="24"/>
+                <w:szCs w:val="20"/>
+                <w:lang w:val="fr-FR"/>
+              </w:rPr>
+              <w:t xml:space="preserve"> / </w:t>
+            </w:r>
+            <w:r>
+              <w:rPr>
+                <w:rStyle w:val="VerbatimChar"/>
+                <w:rFonts w:ascii="Segoe UI" w:hAnsi="Segoe UI" w:cs="Segoe UI" w:eastAsia="Segoe UI"/>
+                <w:b w:val="0"/>
+                <w:color w:val="0A192F"/>
+                <w:sz w:val="24"/>
+                <w:szCs w:val="20"/>
+                <w:lang w:val="fr-FR"/>
+              </w:rPr>
+              <w:t xml:space="preserve">CORS_ALLOWED_ORIGINS</w:t>
+            </w:r>
+            <w:r>
+              <w:rPr>
+                <w:rFonts w:ascii="Segoe UI" w:hAnsi="Segoe UI" w:cs="Segoe UI" w:eastAsia="Segoe UI"/>
+                <w:b w:val="0"/>
+                <w:color w:val="0A192F"/>
+                <w:sz w:val="24"/>
+                <w:szCs w:val="20"/>
+                <w:lang w:val="fr-FR"/>
+              </w:rPr>
+              <w:t xml:space="preserve">, ou isolation Wi-Fi</w:t>
             </w:r>
           </w:p>
         </w:tc>
@@ -14159,7 +14319,30 @@
                 <w:szCs w:val="20"/>
                 <w:lang w:val="fr-FR"/>
               </w:rPr>
-              <w:t xml:space="preserve">Attendu sans domaine : accepter l’alerte une fois</w:t>
+              <w:t xml:space="preserve">Relancer </w:t>
+            </w:r>
+            <w:r>
+              <w:rPr>
+                <w:rStyle w:val="VerbatimChar"/>
+                <w:rFonts w:ascii="Segoe UI" w:hAnsi="Segoe UI" w:cs="Segoe UI" w:eastAsia="Segoe UI"/>
+                <w:b w:val="0"/>
+                <w:color w:val="0A192F"/>
+                <w:sz w:val="24"/>
+                <w:szCs w:val="20"/>
+                <w:lang w:val="fr-FR"/>
+              </w:rPr>
+              <w:t xml:space="preserve">init-env</w:t>
+            </w:r>
+            <w:r>
+              <w:rPr>
+                <w:rFonts w:ascii="Segoe UI" w:hAnsi="Segoe UI" w:cs="Segoe UI" w:eastAsia="Segoe UI"/>
+                <w:b w:val="0"/>
+                <w:color w:val="0A192F"/>
+                <w:sz w:val="24"/>
+                <w:szCs w:val="20"/>
+                <w:lang w:val="fr-FR"/>
+              </w:rPr>
+              <w:t xml:space="preserve"> avec l’adresse utilisée</w:t>
             </w:r>
           </w:p>
         </w:tc>
@@ -14192,7 +14375,7 @@
                 <w:szCs w:val="20"/>
                 <w:lang w:val="fr-FR"/>
               </w:rPr>
-              <w:t xml:space="preserve">Alerte persistante via l’IP du serveur</w:t>
+              <w:t xml:space="preserve">Alerte « connexion non privée »</w:t>
             </w:r>
           </w:p>
         </w:tc>
@@ -14223,7 +14406,7 @@
                 <w:szCs w:val="20"/>
                 <w:lang w:val="fr-FR"/>
               </w:rPr>
-              <w:t xml:space="preserve">IP absente du certificat</w:t>
+              <w:t xml:space="preserve">Certificat auto-signé</w:t>
             </w:r>
           </w:p>
         </w:tc>
@@ -14254,30 +14437,7 @@
                 <w:szCs w:val="20"/>
                 <w:lang w:val="fr-FR"/>
               </w:rPr>
-              <w:t xml:space="preserve">Relancer </w:t>
-            </w:r>
-            <w:r>
-              <w:rPr>
-                <w:rStyle w:val="VerbatimChar"/>
-                <w:rFonts w:ascii="Segoe UI" w:hAnsi="Segoe UI" w:cs="Segoe UI" w:eastAsia="Segoe UI"/>
-                <w:b w:val="0"/>
-                <w:color w:val="0A192F"/>
-                <w:sz w:val="24"/>
-                <w:szCs w:val="20"/>
-                <w:lang w:val="fr-FR"/>
-              </w:rPr>
-              <w:t xml:space="preserve">init-env</w:t>
-            </w:r>
-            <w:r>
-              <w:rPr>
-                <w:rFonts w:ascii="Segoe UI" w:hAnsi="Segoe UI" w:cs="Segoe UI" w:eastAsia="Segoe UI"/>
-                <w:b w:val="0"/>
-                <w:color w:val="0A192F"/>
-                <w:sz w:val="24"/>
-                <w:szCs w:val="20"/>
-                <w:lang w:val="fr-FR"/>
-              </w:rPr>
-              <w:t xml:space="preserve"> avec l’IP, régénérer le certificat (section HTTPS)</w:t>
+              <w:t xml:space="preserve">Attendu sans domaine : accepter l’alerte une fois</w:t>
             </w:r>
           </w:p>
         </w:tc>
@@ -14310,7 +14470,7 @@
                 <w:szCs w:val="20"/>
                 <w:lang w:val="fr-FR"/>
               </w:rPr>
-              <w:t xml:space="preserve">Le compte de démo est déconnecté après chaque redémarrage</w:t>
+              <w:t xml:space="preserve">Alerte persistante via l’IP du serveur</w:t>
             </w:r>
           </w:p>
         </w:tc>
@@ -14341,7 +14501,7 @@
                 <w:szCs w:val="20"/>
                 <w:lang w:val="fr-FR"/>
               </w:rPr>
-              <w:t xml:space="preserve">Son mot de passe est réécrit au démarrage (limite connue, côté back)</w:t>
+              <w:t xml:space="preserve">IP absente du certificat</w:t>
             </w:r>
           </w:p>
         </w:tc>
@@ -14372,7 +14532,30 @@
                 <w:szCs w:val="20"/>
                 <w:lang w:val="fr-FR"/>
               </w:rPr>
-              <w:t xml:space="preserve">Se reconnecter. Les autres comptes restent connectés</w:t>
+              <w:t xml:space="preserve">Relancer </w:t>
+            </w:r>
+            <w:r>
+              <w:rPr>
+                <w:rStyle w:val="VerbatimChar"/>
+                <w:rFonts w:ascii="Segoe UI" w:hAnsi="Segoe UI" w:cs="Segoe UI" w:eastAsia="Segoe UI"/>
+                <w:b w:val="0"/>
+                <w:color w:val="0A192F"/>
+                <w:sz w:val="24"/>
+                <w:szCs w:val="20"/>
+                <w:lang w:val="fr-FR"/>
+              </w:rPr>
+              <w:t xml:space="preserve">init-env</w:t>
+            </w:r>
+            <w:r>
+              <w:rPr>
+                <w:rFonts w:ascii="Segoe UI" w:hAnsi="Segoe UI" w:cs="Segoe UI" w:eastAsia="Segoe UI"/>
+                <w:b w:val="0"/>
+                <w:color w:val="0A192F"/>
+                <w:sz w:val="24"/>
+                <w:szCs w:val="20"/>
+                <w:lang w:val="fr-FR"/>
+              </w:rPr>
+              <w:t xml:space="preserve"> avec l’IP, régénérer le certificat (section HTTPS)</w:t>
             </w:r>
           </w:p>
         </w:tc>
@@ -14398,26 +14581,14 @@
             </w:pPr>
             <w:r>
               <w:rPr>
-                <w:rStyle w:val="VerbatimChar"/>
-                <w:rFonts w:ascii="Segoe UI" w:hAnsi="Segoe UI" w:cs="Segoe UI" w:eastAsia="Segoe UI"/>
-                <w:b w:val="0"/>
-                <w:color w:val="0A192F"/>
-                <w:sz w:val="24"/>
-                <w:szCs w:val="20"/>
-                <w:lang w:val="fr-FR"/>
-              </w:rPr>
-              <w:t xml:space="preserve">backend</w:t>
-            </w:r>
-            <w:r>
-              <w:rPr>
-                <w:rFonts w:ascii="Segoe UI" w:hAnsi="Segoe UI" w:cs="Segoe UI" w:eastAsia="Segoe UI"/>
-                <w:b w:val="0"/>
-                <w:color w:val="0A192F"/>
-                <w:sz w:val="24"/>
-                <w:szCs w:val="20"/>
-                <w:lang w:val="fr-FR"/>
-              </w:rPr>
-              <w:t xml:space="preserve"> redémarre en boucle après avoir vidé le catalogue</w:t>
+                <w:rFonts w:ascii="Segoe UI" w:hAnsi="Segoe UI" w:cs="Segoe UI" w:eastAsia="Segoe UI"/>
+                <w:b w:val="0"/>
+                <w:color w:val="0A192F"/>
+                <w:sz w:val="24"/>
+                <w:szCs w:val="20"/>
+                <w:lang w:val="fr-FR"/>
+              </w:rPr>
+              <w:t xml:space="preserve">Le compte de démo est déconnecté après chaque redémarrage</w:t>
             </w:r>
           </w:p>
         </w:tc>
@@ -14448,7 +14619,7 @@
                 <w:szCs w:val="20"/>
                 <w:lang w:val="fr-FR"/>
               </w:rPr>
-              <w:t xml:space="preserve">Le seed se relance sur une base sans publication et échoue sur le compte existant (limite connue, côté back)</w:t>
+              <w:t xml:space="preserve">Son mot de passe est réécrit au démarrage (limite connue, côté back)</w:t>
             </w:r>
           </w:p>
         </w:tc>
@@ -14479,7 +14650,7 @@
                 <w:szCs w:val="20"/>
                 <w:lang w:val="fr-FR"/>
               </w:rPr>
-              <w:t xml:space="preserve">Restaurer la dernière sauvegarde</w:t>
+              <w:t xml:space="preserve">Se reconnecter. Les autres comptes restent connectés</w:t>
             </w:r>
           </w:p>
         </w:tc>
@@ -14505,14 +14676,26 @@
             </w:pPr>
             <w:r>
               <w:rPr>
-                <w:rFonts w:ascii="Segoe UI" w:hAnsi="Segoe UI" w:cs="Segoe UI" w:eastAsia="Segoe UI"/>
-                <w:b w:val="0"/>
-                <w:color w:val="0A192F"/>
-                <w:sz w:val="24"/>
-                <w:szCs w:val="20"/>
-                <w:lang w:val="fr-FR"/>
-              </w:rPr>
-              <w:t xml:space="preserve">MySQL « port already allocated »</w:t>
+                <w:rStyle w:val="VerbatimChar"/>
+                <w:rFonts w:ascii="Segoe UI" w:hAnsi="Segoe UI" w:cs="Segoe UI" w:eastAsia="Segoe UI"/>
+                <w:b w:val="0"/>
+                <w:color w:val="0A192F"/>
+                <w:sz w:val="24"/>
+                <w:szCs w:val="20"/>
+                <w:lang w:val="fr-FR"/>
+              </w:rPr>
+              <w:t xml:space="preserve">backend</w:t>
+            </w:r>
+            <w:r>
+              <w:rPr>
+                <w:rFonts w:ascii="Segoe UI" w:hAnsi="Segoe UI" w:cs="Segoe UI" w:eastAsia="Segoe UI"/>
+                <w:b w:val="0"/>
+                <w:color w:val="0A192F"/>
+                <w:sz w:val="24"/>
+                <w:szCs w:val="20"/>
+                <w:lang w:val="fr-FR"/>
+              </w:rPr>
+              <w:t xml:space="preserve"> redémarre en boucle après avoir vidé le catalogue</w:t>
             </w:r>
           </w:p>
         </w:tc>
@@ -14543,7 +14726,7 @@
                 <w:szCs w:val="20"/>
                 <w:lang w:val="fr-FR"/>
               </w:rPr>
-              <w:t xml:space="preserve">Un MySQL Windows tient le 3306</w:t>
+              <w:t xml:space="preserve">Le seed se relance sur une base sans publication et échoue sur le compte existant (limite connue, côté back)</w:t>
             </w:r>
           </w:p>
         </w:tc>
@@ -14574,18 +14757,7 @@
                 <w:szCs w:val="20"/>
                 <w:lang w:val="fr-FR"/>
               </w:rPr>
-              <w:t xml:space="preserve">Le compose publie déjà </w:t>
-            </w:r>
-            <w:r>
-              <w:rPr>
-                <w:rFonts w:ascii="Segoe UI" w:hAnsi="Segoe UI" w:cs="Segoe UI" w:eastAsia="Segoe UI"/>
-                <w:b/>
-                <w:color w:val="0A192F"/>
-                <w:sz w:val="24"/>
-                <w:szCs w:val="20"/>
-                <w:lang w:val="fr-FR"/>
-              </w:rPr>
-              <w:t xml:space="preserve">3307</w:t>
+              <w:t xml:space="preserve">Restaurer la dernière sauvegarde</w:t>
             </w:r>
           </w:p>
         </w:tc>
@@ -14618,7 +14790,7 @@
                 <w:szCs w:val="20"/>
                 <w:lang w:val="fr-FR"/>
               </w:rPr>
-              <w:t xml:space="preserve">Vulgarisation en erreur</w:t>
+              <w:t xml:space="preserve">MySQL « port already allocated »</w:t>
             </w:r>
           </w:p>
         </w:tc>
@@ -14642,26 +14814,14 @@
             </w:pPr>
             <w:r>
               <w:rPr>
-                <w:rStyle w:val="VerbatimChar"/>
-                <w:rFonts w:ascii="Segoe UI" w:hAnsi="Segoe UI" w:cs="Segoe UI" w:eastAsia="Segoe UI"/>
-                <w:b w:val="0"/>
-                <w:color w:val="0A192F"/>
-                <w:sz w:val="24"/>
-                <w:szCs w:val="20"/>
-                <w:lang w:val="fr-FR"/>
-              </w:rPr>
-              <w:t xml:space="preserve">LLM_ENABLED=true</w:t>
-            </w:r>
-            <w:r>
-              <w:rPr>
-                <w:rFonts w:ascii="Segoe UI" w:hAnsi="Segoe UI" w:cs="Segoe UI" w:eastAsia="Segoe UI"/>
-                <w:b w:val="0"/>
-                <w:color w:val="0A192F"/>
-                <w:sz w:val="24"/>
-                <w:szCs w:val="20"/>
-                <w:lang w:val="fr-FR"/>
-              </w:rPr>
-              <w:t xml:space="preserve"> sans modèle chargé</w:t>
+                <w:rFonts w:ascii="Segoe UI" w:hAnsi="Segoe UI" w:cs="Segoe UI" w:eastAsia="Segoe UI"/>
+                <w:b w:val="0"/>
+                <w:color w:val="0A192F"/>
+                <w:sz w:val="24"/>
+                <w:szCs w:val="20"/>
+                <w:lang w:val="fr-FR"/>
+              </w:rPr>
+              <w:t xml:space="preserve">Un MySQL Windows tient le 3306</w:t>
             </w:r>
           </w:p>
         </w:tc>
@@ -14692,19 +14852,18 @@
                 <w:szCs w:val="20"/>
                 <w:lang w:val="fr-FR"/>
               </w:rPr>
-              <w:t xml:space="preserve">Charger le modèle, ou repasser </w:t>
-            </w:r>
-            <w:r>
-              <w:rPr>
-                <w:rStyle w:val="VerbatimChar"/>
-                <w:rFonts w:ascii="Segoe UI" w:hAnsi="Segoe UI" w:cs="Segoe UI" w:eastAsia="Segoe UI"/>
-                <w:b w:val="0"/>
-                <w:color w:val="0A192F"/>
-                <w:sz w:val="24"/>
-                <w:szCs w:val="20"/>
-                <w:lang w:val="fr-FR"/>
-              </w:rPr>
-              <w:t xml:space="preserve">LLM_ENABLED=false</w:t>
+              <w:t xml:space="preserve">Le compose publie déjà </w:t>
+            </w:r>
+            <w:r>
+              <w:rPr>
+                <w:rFonts w:ascii="Segoe UI" w:hAnsi="Segoe UI" w:cs="Segoe UI" w:eastAsia="Segoe UI"/>
+                <w:b/>
+                <w:color w:val="0A192F"/>
+                <w:sz w:val="24"/>
+                <w:szCs w:val="20"/>
+                <w:lang w:val="fr-FR"/>
+              </w:rPr>
+              <w:t xml:space="preserve">3307</w:t>
             </w:r>
           </w:p>
         </w:tc>
@@ -14737,6 +14896,125 @@
                 <w:szCs w:val="20"/>
                 <w:lang w:val="fr-FR"/>
               </w:rPr>
+              <w:t xml:space="preserve">Vulgarisation en erreur</w:t>
+            </w:r>
+          </w:p>
+        </w:tc>
+        <w:tc>
+          <w:tcPr>
+            <w:tcW w:w="1721" w:type="dxa"/>
+            <w:hideMark/>
+            <w:shd w:val="clear" w:color="auto" w:fill="FFFFFF"/>
+            <w:tcMar>
+              <w:top w:w="80" w:type="dxa"/>
+              <w:left w:w="120" w:type="dxa"/>
+              <w:bottom w:w="80" w:type="dxa"/>
+              <w:right w:w="120" w:type="dxa"/>
+            </w:tcMar>
+          </w:tcPr>
+          <w:p>
+            <w:pPr>
+              <w:pStyle w:val="Compact"/>
+              <w:spacing w:before="20" w:beforeAutospacing="1" w:after="20" w:afterAutospacing="1" w:line="276" w:lineRule="auto"/>
+              <w:ind w:left="0" w:right="0"/>
+            </w:pPr>
+            <w:r>
+              <w:rPr>
+                <w:rStyle w:val="VerbatimChar"/>
+                <w:rFonts w:ascii="Segoe UI" w:hAnsi="Segoe UI" w:cs="Segoe UI" w:eastAsia="Segoe UI"/>
+                <w:b w:val="0"/>
+                <w:color w:val="0A192F"/>
+                <w:sz w:val="24"/>
+                <w:szCs w:val="20"/>
+                <w:lang w:val="fr-FR"/>
+              </w:rPr>
+              <w:t xml:space="preserve">LLM_ENABLED=true</w:t>
+            </w:r>
+            <w:r>
+              <w:rPr>
+                <w:rFonts w:ascii="Segoe UI" w:hAnsi="Segoe UI" w:cs="Segoe UI" w:eastAsia="Segoe UI"/>
+                <w:b w:val="0"/>
+                <w:color w:val="0A192F"/>
+                <w:sz w:val="24"/>
+                <w:szCs w:val="20"/>
+                <w:lang w:val="fr-FR"/>
+              </w:rPr>
+              <w:t xml:space="preserve"> sans modèle chargé</w:t>
+            </w:r>
+          </w:p>
+        </w:tc>
+        <w:tc>
+          <w:tcPr>
+            <w:tcW w:w="4476" w:type="dxa"/>
+            <w:hideMark/>
+            <w:shd w:val="clear" w:color="auto" w:fill="FFFFFF"/>
+            <w:tcMar>
+              <w:top w:w="80" w:type="dxa"/>
+              <w:left w:w="120" w:type="dxa"/>
+              <w:bottom w:w="80" w:type="dxa"/>
+              <w:right w:w="120" w:type="dxa"/>
+            </w:tcMar>
+          </w:tcPr>
+          <w:p>
+            <w:pPr>
+              <w:pStyle w:val="Compact"/>
+              <w:spacing w:before="20" w:beforeAutospacing="1" w:after="20" w:afterAutospacing="1" w:line="276" w:lineRule="auto"/>
+              <w:ind w:left="0" w:right="0"/>
+            </w:pPr>
+            <w:r>
+              <w:rPr>
+                <w:rFonts w:ascii="Segoe UI" w:hAnsi="Segoe UI" w:cs="Segoe UI" w:eastAsia="Segoe UI"/>
+                <w:b w:val="0"/>
+                <w:color w:val="0A192F"/>
+                <w:sz w:val="24"/>
+                <w:szCs w:val="20"/>
+                <w:lang w:val="fr-FR"/>
+              </w:rPr>
+              <w:t xml:space="preserve">Charger le modèle, ou repasser </w:t>
+            </w:r>
+            <w:r>
+              <w:rPr>
+                <w:rStyle w:val="VerbatimChar"/>
+                <w:rFonts w:ascii="Segoe UI" w:hAnsi="Segoe UI" w:cs="Segoe UI" w:eastAsia="Segoe UI"/>
+                <w:b w:val="0"/>
+                <w:color w:val="0A192F"/>
+                <w:sz w:val="24"/>
+                <w:szCs w:val="20"/>
+                <w:lang w:val="fr-FR"/>
+              </w:rPr>
+              <w:t xml:space="preserve">LLM_ENABLED=false</w:t>
+            </w:r>
+          </w:p>
+        </w:tc>
+      </w:tr>
+      <w:tr>
+        <w:tc>
+          <w:tcPr>
+            <w:tcW w:w="1721" w:type="dxa"/>
+            <w:hideMark/>
+            <w:shd w:val="clear" w:color="auto" w:fill="F3ECDA"/>
+            <w:tcMar>
+              <w:top w:w="80" w:type="dxa"/>
+              <w:left w:w="120" w:type="dxa"/>
+              <w:bottom w:w="80" w:type="dxa"/>
+              <w:right w:w="120" w:type="dxa"/>
+            </w:tcMar>
+          </w:tcPr>
+          <w:p>
+            <w:pPr>
+              <w:pStyle w:val="Compact"/>
+              <w:spacing w:before="20" w:beforeAutospacing="1" w:after="20" w:afterAutospacing="1" w:line="276" w:lineRule="auto"/>
+              <w:ind w:left="0" w:right="0"/>
+            </w:pPr>
+            <w:r>
+              <w:rPr>
+                <w:rFonts w:ascii="Segoe UI" w:hAnsi="Segoe UI" w:cs="Segoe UI" w:eastAsia="Segoe UI"/>
+                <w:b w:val="0"/>
+                <w:color w:val="0A192F"/>
+                <w:sz w:val="24"/>
+                <w:szCs w:val="20"/>
+                <w:lang w:val="fr-FR"/>
+              </w:rPr>
               <w:t xml:space="preserve">Domaine Physique vide</w:t>
             </w:r>
           </w:p>
@@ -14745,7 +15023,7 @@
           <w:tcPr>
             <w:tcW w:w="1721" w:type="dxa"/>
             <w:hideMark/>
-            <w:shd w:val="clear" w:color="auto" w:fill="FFFFFF"/>
+            <w:shd w:val="clear" w:color="auto" w:fill="F3ECDA"/>
             <w:tcMar>
               <w:top w:w="80" w:type="dxa"/>
               <w:left w:w="120" w:type="dxa"/>
@@ -14776,7 +15054,7 @@
           <w:tcPr>
             <w:tcW w:w="4476" w:type="dxa"/>
             <w:hideMark/>
-            <w:shd w:val="clear" w:color="auto" w:fill="FFFFFF"/>
+            <w:shd w:val="clear" w:color="auto" w:fill="F3ECDA"/>
             <w:tcMar>
               <w:top w:w="80" w:type="dxa"/>
               <w:left w:w="120" w:type="dxa"/>
@@ -19109,7 +19387,26 @@
           <w:color w:val="0A192F"/>
           <w:sz w:val="26"/>
         </w:rPr>
-        <w:t xml:space="preserve"> pour l’automatiser). Les fichiers uploadés de l’archive sont remis en place ; ceux ajoutés depuis restent.</w:t>
+        <w:t xml:space="preserve"> pour l’automatiser). Les fichiers uploadés de l’archive sont remis en place ; ceux ajoutés depuis restent. Le back redémarre à la fin : le mot de passe du compte de démo redevient celui du </w:t>
+      </w:r>
+      <w:r>
+        <w:rPr>
+          <w:rStyle w:val="VerbatimChar"/>
+          <w:rFonts w:ascii="Segoe UI" w:hAnsi="Segoe UI" w:cs="Segoe UI" w:eastAsia="Segoe UI"/>
+          <w:b w:val="0"/>
+          <w:color w:val="0A192F"/>
+          <w:sz w:val="26"/>
+        </w:rPr>
+        <w:t xml:space="preserve">.env</w:t>
+      </w:r>
+      <w:r>
+        <w:rPr>
+          <w:rFonts w:ascii="Segoe UI" w:hAnsi="Segoe UI" w:cs="Segoe UI" w:eastAsia="Segoe UI"/>
+          <w:b w:val="0"/>
+          <w:color w:val="0A192F"/>
+          <w:sz w:val="26"/>
+        </w:rPr>
+        <w:t xml:space="preserve"> actuel, et les migrations s’appliquent si l’archive vient d’une version plus ancienne.</w:t>
       </w:r>
     </w:p>
     <w:p>
@@ -20087,6 +20384,45 @@
           <w:sz w:val="26"/>
         </w:rPr>
         <w:t xml:space="preserve">, une clé ou un certificat, et GitHub refuse le push d’un secret connu.</w:t>
+      </w:r>
+    </w:p>
+    <w:p>
+      <w:pPr>
+        <w:pStyle w:val="Compact"/>
+        <w:numPr>
+          <w:ilvl w:val="0"/>
+          <w:numId w:val="2"/>
+        </w:numPr>
+        <w:spacing w:before="20" w:after="80" w:line="312" w:lineRule="auto"/>
+        <w:ind w:left="170" w:right="0"/>
+      </w:pPr>
+      <w:r>
+        <w:rPr>
+          <w:rFonts w:ascii="Segoe UI" w:hAnsi="Segoe UI" w:cs="Segoe UI" w:eastAsia="Segoe UI"/>
+          <w:b w:val="0"/>
+          <w:color w:val="0A192F"/>
+          <w:sz w:val="26"/>
+        </w:rPr>
+        <w:t xml:space="preserve">Garder une copie du </w:t>
+      </w:r>
+      <w:r>
+        <w:rPr>
+          <w:rStyle w:val="VerbatimChar"/>
+          <w:rFonts w:ascii="Segoe UI" w:hAnsi="Segoe UI" w:cs="Segoe UI" w:eastAsia="Segoe UI"/>
+          <w:b w:val="0"/>
+          <w:color w:val="0A192F"/>
+          <w:sz w:val="26"/>
+        </w:rPr>
+        <w:t xml:space="preserve">.env</w:t>
+      </w:r>
+      <w:r>
+        <w:rPr>
+          <w:rFonts w:ascii="Segoe UI" w:hAnsi="Segoe UI" w:cs="Segoe UI" w:eastAsia="Segoe UI"/>
+          <w:b w:val="0"/>
+          <w:color w:val="0A192F"/>
+          <w:sz w:val="26"/>
+        </w:rPr>
+        <w:t xml:space="preserve"> hors du serveur, à part des sauvegardes. Sans lui, la base existante n’est plus accessible ; une sauvegarde se restaure en revanche sur une installation neuve.</w:t>
       </w:r>
     </w:p>
     <w:p>

</xml_diff>

<commit_message>
docs(passation): docx aligné, sans mention des fichiers locaux hors dépôt
Pendant Word de la PR #28 : section « À ne pas prendre pour le produit »
supprimée (et son entrée de table des matières), lignes .srt et archives
retirées de « Non remis ». Paragraphe du protocole de revue (chapitre 06)
aligné sur le md : protocole installé localement, non versionné.
</commit_message>
<xml_diff>
--- a/docs/passation/Lab-Horizon-dossier-de-passation.docx
+++ b/docs/passation/Lab-Horizon-dossier-de-passation.docx
@@ -271,38 +271,6 @@
               <w:noProof/>
             </w:rPr>
           </w:pPr>
-          <w:hyperlink w:anchor="_Toc243379725" w:history="1">
-            <w:r>
-              <w:rPr>
-                <w:rStyle w:val="Lienhypertexte"/>
-                <w:noProof/>
-              </w:rPr>
-              <w:t>À ne pas prendre pour le produit</w:t>
-            </w:r>
-            <w:r>
-              <w:rPr>
-                <w:noProof/>
-                <w:webHidden/>
-              </w:rPr>
-              <w:tab/>
-              <w:fldChar w:fldCharType="begin"/>
-              <w:instrText xml:space="preserve"> PAGEREF _Toc243379725 \h </w:instrText>
-              <w:fldChar w:fldCharType="separate"/>
-              <w:t>4</w:t>
-              <w:fldChar w:fldCharType="end"/>
-            </w:r>
-          </w:hyperlink>
-        </w:p>
-        <w:p>
-          <w:pPr>
-            <w:pStyle w:val="TM2"/>
-            <w:tabs>
-              <w:tab w:val="right" w:leader="dot" w:pos="9396"/>
-            </w:tabs>
-            <w:rPr>
-              <w:noProof/>
-            </w:rPr>
-          </w:pPr>
           <w:hyperlink w:anchor="_Toc243379726" w:history="1">
             <w:r>
               <w:rPr>
@@ -1598,7 +1566,7 @@
                 <w:szCs w:val="20"/>
                 <w:lang w:val="fr-FR"/>
               </w:rPr>
-              <w:t>Où est le code, pourquoi ce dossier existe, quels fichiers ignorer</w:t>
+              <w:t>Où est le code, pourquoi ce dossier existe</w:t>
             </w:r>
           </w:p>
         </w:tc>
@@ -4401,473 +4369,11 @@
         <w:spacing w:before="280" w:after="120" w:line="276" w:lineRule="auto"/>
         <w:ind w:left="0" w:right="0"/>
       </w:pPr>
-      <w:r>
-        <w:rPr>
-          <w:rFonts w:ascii="Segoe UI" w:hAnsi="Segoe UI" w:cs="Segoe UI" w:eastAsia="Segoe UI"/>
-          <w:b/>
-          <w:color w:val="007A8C"/>
-          <w:sz w:val="32"/>
-        </w:rPr>
-        <w:t>À ne pas prendre pour le produit</w:t>
-      </w:r>
-    </w:p>
-    <w:tbl>
-      <w:tblPr>
-        <w:tblW w:w="5000" w:type="pct"/>
-        <w:tblLayout w:type="autofit"/>
-        <w:tblLook w:val="0020" w:firstRow="1" w:lastRow="0" w:firstColumn="0" w:lastColumn="0" w:noHBand="0" w:noVBand="0"/>
-        <w:tblBorders>
-          <w:top w:val="single" w:sz="6" w:space="0" w:color="C5CED6"/>
-          <w:left w:val="single" w:sz="6" w:space="0" w:color="C5CED6"/>
-          <w:bottom w:val="single" w:sz="6" w:space="0" w:color="C5CED6"/>
-          <w:right w:val="single" w:sz="6" w:space="0" w:color="C5CED6"/>
-          <w:insideH w:val="single" w:sz="6" w:space="0" w:color="C5CED6"/>
-          <w:insideV w:val="single" w:sz="6" w:space="0" w:color="C5CED6"/>
-        </w:tblBorders>
-      </w:tblPr>
-      <w:tblGrid>
-        <w:gridCol w:w="4988"/>
-        <w:gridCol w:w="4988"/>
-      </w:tblGrid>
-      <w:tr>
-        <w:trPr>
-          <w:tblHeader/>
-        </w:trPr>
-        <w:tc>
-          <w:tcPr>
-            <w:tcW w:w="3960" w:type="dxa"/>
-            <w:shd w:val="clear" w:color="auto" w:fill="02223F"/>
-            <w:tcMar>
-              <w:top w:w="80" w:type="dxa"/>
-              <w:left w:w="120" w:type="dxa"/>
-              <w:bottom w:w="80" w:type="dxa"/>
-              <w:right w:w="120" w:type="dxa"/>
-            </w:tcMar>
-          </w:tcPr>
-          <w:p>
-            <w:pPr>
-              <w:pStyle w:val="Compact"/>
-              <w:spacing w:before="20" w:after="20" w:line="276" w:lineRule="auto"/>
-              <w:ind w:left="0" w:right="0"/>
-              <w:rPr>
-                <w:kern w:val="2"/>
-                <w:lang w:val="fr-NC" w:eastAsia="fr-NC"/>
-                <w14:ligatures w14:val="standardContextual"/>
-              </w:rPr>
-            </w:pPr>
-            <w:bookmarkStart w:id="16" w:name="docker-qui-parle-à-qui"/>
-            <w:bookmarkStart w:id="17" w:name="_Toc243379728"/>
-            <w:bookmarkStart w:id="18" w:name="backend-points-utiles"/>
-            <w:bookmarkStart w:id="19" w:name="_Toc243379727"/>
-            <w:bookmarkEnd w:id="14"/>
-            <w:r>
-              <w:rPr>
-                <w:rFonts w:ascii="Segoe UI" w:hAnsi="Segoe UI" w:cs="Segoe UI" w:eastAsia="Segoe UI"/>
-                <w:b/>
-                <w:color w:val="FFFFFF"/>
-                <w:sz w:val="24"/>
-                <w:szCs w:val="20"/>
-                <w:lang w:val="fr-FR"/>
-              </w:rPr>
-              <w:t>Chemin</w:t>
-            </w:r>
-          </w:p>
-        </w:tc>
-        <w:tc>
-          <w:tcPr>
-            <w:tcW w:w="3960" w:type="dxa"/>
-            <w:shd w:val="clear" w:color="auto" w:fill="02223F"/>
-            <w:tcMar>
-              <w:top w:w="80" w:type="dxa"/>
-              <w:left w:w="120" w:type="dxa"/>
-              <w:bottom w:w="80" w:type="dxa"/>
-              <w:right w:w="120" w:type="dxa"/>
-            </w:tcMar>
-          </w:tcPr>
-          <w:p>
-            <w:pPr>
-              <w:pStyle w:val="Compact"/>
-              <w:spacing w:before="20" w:after="20" w:line="276" w:lineRule="auto"/>
-              <w:ind w:left="0" w:right="0"/>
-              <w:rPr>
-                <w:kern w:val="2"/>
-                <w:lang w:val="fr-NC" w:eastAsia="fr-NC"/>
-                <w14:ligatures w14:val="standardContextual"/>
-              </w:rPr>
-            </w:pPr>
-            <w:r>
-              <w:rPr>
-                <w:rFonts w:ascii="Segoe UI" w:hAnsi="Segoe UI" w:cs="Segoe UI" w:eastAsia="Segoe UI"/>
-                <w:b/>
-                <w:color w:val="FFFFFF"/>
-                <w:sz w:val="24"/>
-                <w:szCs w:val="20"/>
-                <w:lang w:val="fr-FR"/>
-              </w:rPr>
-              <w:t>Nature</w:t>
-            </w:r>
-          </w:p>
-        </w:tc>
-      </w:tr>
-      <w:tr>
-        <w:tc>
-          <w:tcPr>
-            <w:tcW w:w="3960" w:type="dxa"/>
-            <w:hideMark/>
-            <w:shd w:val="clear" w:color="auto" w:fill="FFFFFF"/>
-            <w:tcMar>
-              <w:top w:w="80" w:type="dxa"/>
-              <w:left w:w="120" w:type="dxa"/>
-              <w:bottom w:w="80" w:type="dxa"/>
-              <w:right w:w="120" w:type="dxa"/>
-            </w:tcMar>
-          </w:tcPr>
-          <w:p>
-            <w:pPr>
-              <w:pStyle w:val="Compact"/>
-              <w:spacing w:before="20" w:beforeAutospacing="1" w:after="20" w:afterAutospacing="1" w:line="276" w:lineRule="auto"/>
-              <w:ind w:left="0" w:right="0"/>
-            </w:pPr>
-            <w:r>
-              <w:rPr>
-                <w:rStyle w:val="VerbatimChar"/>
-                <w:rFonts w:ascii="Segoe UI" w:hAnsi="Segoe UI" w:cs="Segoe UI" w:eastAsia="Segoe UI"/>
-                <w:b w:val="0"/>
-                <w:color w:val="0A192F"/>
-                <w:sz w:val="24"/>
-                <w:szCs w:val="19"/>
-                <w:lang w:val="fr-FR"/>
-              </w:rPr>
-              <w:t>docs/archive/</w:t>
-            </w:r>
-          </w:p>
-        </w:tc>
-        <w:tc>
-          <w:tcPr>
-            <w:tcW w:w="3960" w:type="dxa"/>
-            <w:hideMark/>
-            <w:shd w:val="clear" w:color="auto" w:fill="FFFFFF"/>
-            <w:tcMar>
-              <w:top w:w="80" w:type="dxa"/>
-              <w:left w:w="120" w:type="dxa"/>
-              <w:bottom w:w="80" w:type="dxa"/>
-              <w:right w:w="120" w:type="dxa"/>
-            </w:tcMar>
-          </w:tcPr>
-          <w:p>
-            <w:pPr>
-              <w:pStyle w:val="Compact"/>
-              <w:spacing w:before="20" w:beforeAutospacing="1" w:after="20" w:afterAutospacing="1" w:line="276" w:lineRule="auto"/>
-              <w:ind w:left="0" w:right="0"/>
-            </w:pPr>
-            <w:r>
-              <w:rPr>
-                <w:rFonts w:ascii="Segoe UI" w:hAnsi="Segoe UI" w:cs="Segoe UI" w:eastAsia="Segoe UI"/>
-                <w:b w:val="0"/>
-                <w:color w:val="0A192F"/>
-                <w:sz w:val="24"/>
-                <w:szCs w:val="20"/>
-                <w:lang w:val="fr-FR"/>
-              </w:rPr>
-              <w:t>Anciennes maquettes et exports. Référence visuelle seulement.</w:t>
-            </w:r>
-          </w:p>
-        </w:tc>
-      </w:tr>
-      <w:tr>
-        <w:tc>
-          <w:tcPr>
-            <w:tcW w:w="3960" w:type="dxa"/>
-            <w:hideMark/>
-            <w:shd w:val="clear" w:color="auto" w:fill="F3ECDA"/>
-            <w:tcMar>
-              <w:top w:w="80" w:type="dxa"/>
-              <w:left w:w="120" w:type="dxa"/>
-              <w:bottom w:w="80" w:type="dxa"/>
-              <w:right w:w="120" w:type="dxa"/>
-            </w:tcMar>
-          </w:tcPr>
-          <w:p>
-            <w:pPr>
-              <w:pStyle w:val="Compact"/>
-              <w:spacing w:before="20" w:beforeAutospacing="1" w:after="20" w:afterAutospacing="1" w:line="276" w:lineRule="auto"/>
-              <w:ind w:left="0" w:right="0"/>
-            </w:pPr>
-            <w:r>
-              <w:rPr>
-                <w:rStyle w:val="VerbatimChar"/>
-                <w:rFonts w:ascii="Segoe UI" w:hAnsi="Segoe UI" w:cs="Segoe UI" w:eastAsia="Segoe UI"/>
-                <w:b w:val="0"/>
-                <w:color w:val="0A192F"/>
-                <w:sz w:val="24"/>
-                <w:szCs w:val="19"/>
-                <w:lang w:val="fr-FR"/>
-              </w:rPr>
-              <w:t>v2.zip</w:t>
-            </w:r>
-            <w:r>
-              <w:rPr>
-                <w:rFonts w:ascii="Segoe UI" w:hAnsi="Segoe UI" w:cs="Segoe UI" w:eastAsia="Segoe UI"/>
-                <w:b w:val="0"/>
-                <w:color w:val="0A192F"/>
-                <w:sz w:val="24"/>
-                <w:szCs w:val="20"/>
-                <w:lang w:val="fr-FR"/>
-              </w:rPr>
-              <w:t xml:space="preserve">, </w:t>
-            </w:r>
-            <w:r>
-              <w:rPr>
-                <w:rStyle w:val="VerbatimChar"/>
-                <w:rFonts w:ascii="Segoe UI" w:hAnsi="Segoe UI" w:cs="Segoe UI" w:eastAsia="Segoe UI"/>
-                <w:b w:val="0"/>
-                <w:color w:val="0A192F"/>
-                <w:sz w:val="24"/>
-                <w:szCs w:val="19"/>
-                <w:lang w:val="fr-FR"/>
-              </w:rPr>
-              <w:t>redteam-preprod-audit.zip</w:t>
-            </w:r>
-            <w:r>
-              <w:rPr>
-                <w:rFonts w:ascii="Segoe UI" w:hAnsi="Segoe UI" w:cs="Segoe UI" w:eastAsia="Segoe UI"/>
-                <w:b w:val="0"/>
-                <w:color w:val="0A192F"/>
-                <w:sz w:val="24"/>
-                <w:szCs w:val="20"/>
-                <w:lang w:val="fr-FR"/>
-              </w:rPr>
-              <w:t xml:space="preserve">, </w:t>
-            </w:r>
-            <w:r>
-              <w:rPr>
-                <w:rStyle w:val="VerbatimChar"/>
-                <w:rFonts w:ascii="Segoe UI" w:hAnsi="Segoe UI" w:cs="Segoe UI" w:eastAsia="Segoe UI"/>
-                <w:b w:val="0"/>
-                <w:color w:val="0A192F"/>
-                <w:sz w:val="24"/>
-                <w:szCs w:val="19"/>
-                <w:lang w:val="fr-FR"/>
-              </w:rPr>
-              <w:t>v2.1.zip</w:t>
-            </w:r>
-          </w:p>
-        </w:tc>
-        <w:tc>
-          <w:tcPr>
-            <w:tcW w:w="3960" w:type="dxa"/>
-            <w:hideMark/>
-            <w:shd w:val="clear" w:color="auto" w:fill="F3ECDA"/>
-            <w:tcMar>
-              <w:top w:w="80" w:type="dxa"/>
-              <w:left w:w="120" w:type="dxa"/>
-              <w:bottom w:w="80" w:type="dxa"/>
-              <w:right w:w="120" w:type="dxa"/>
-            </w:tcMar>
-          </w:tcPr>
-          <w:p>
-            <w:pPr>
-              <w:pStyle w:val="Compact"/>
-              <w:spacing w:before="20" w:beforeAutospacing="1" w:after="20" w:afterAutospacing="1" w:line="276" w:lineRule="auto"/>
-              <w:ind w:left="0" w:right="0"/>
-            </w:pPr>
-            <w:r>
-              <w:rPr>
-                <w:rFonts w:ascii="Segoe UI" w:hAnsi="Segoe UI" w:cs="Segoe UI" w:eastAsia="Segoe UI"/>
-                <w:b w:val="0"/>
-                <w:color w:val="0A192F"/>
-                <w:sz w:val="24"/>
-                <w:szCs w:val="20"/>
-                <w:lang w:val="fr-FR"/>
-              </w:rPr>
-              <w:t xml:space="preserve">Archives du protocole. La copie active est </w:t>
-            </w:r>
-            <w:r>
-              <w:rPr>
-                <w:rStyle w:val="VerbatimChar"/>
-                <w:rFonts w:ascii="Segoe UI" w:hAnsi="Segoe UI" w:cs="Segoe UI" w:eastAsia="Segoe UI"/>
-                <w:b w:val="0"/>
-                <w:color w:val="0A192F"/>
-                <w:sz w:val="24"/>
-                <w:szCs w:val="19"/>
-                <w:lang w:val="fr-FR"/>
-              </w:rPr>
-              <w:t>.cursor/skills/revue-securite-preprod/</w:t>
-            </w:r>
-            <w:r>
-              <w:rPr>
-                <w:rFonts w:ascii="Segoe UI" w:hAnsi="Segoe UI" w:cs="Segoe UI" w:eastAsia="Segoe UI"/>
-                <w:b w:val="0"/>
-                <w:color w:val="0A192F"/>
-                <w:sz w:val="24"/>
-                <w:szCs w:val="20"/>
-                <w:lang w:val="fr-FR"/>
-              </w:rPr>
-              <w:t>.</w:t>
-            </w:r>
-          </w:p>
-        </w:tc>
-      </w:tr>
-      <w:tr>
-        <w:tc>
-          <w:tcPr>
-            <w:tcW w:w="3960" w:type="dxa"/>
-            <w:hideMark/>
-            <w:shd w:val="clear" w:color="auto" w:fill="FFFFFF"/>
-            <w:tcMar>
-              <w:top w:w="80" w:type="dxa"/>
-              <w:left w:w="120" w:type="dxa"/>
-              <w:bottom w:w="80" w:type="dxa"/>
-              <w:right w:w="120" w:type="dxa"/>
-            </w:tcMar>
-          </w:tcPr>
-          <w:p>
-            <w:pPr>
-              <w:pStyle w:val="Compact"/>
-              <w:spacing w:before="20" w:beforeAutospacing="1" w:after="20" w:afterAutospacing="1" w:line="276" w:lineRule="auto"/>
-              <w:ind w:left="0" w:right="0"/>
-            </w:pPr>
-            <w:r>
-              <w:rPr>
-                <w:rStyle w:val="VerbatimChar"/>
-                <w:rFonts w:ascii="Segoe UI" w:hAnsi="Segoe UI" w:cs="Segoe UI" w:eastAsia="Segoe UI"/>
-                <w:b w:val="0"/>
-                <w:color w:val="0A192F"/>
-                <w:sz w:val="24"/>
-                <w:szCs w:val="19"/>
-                <w:lang w:val="fr-FR"/>
-              </w:rPr>
-              <w:t>*.bundle</w:t>
-            </w:r>
-            <w:r>
-              <w:rPr>
-                <w:rFonts w:ascii="Segoe UI" w:hAnsi="Segoe UI" w:cs="Segoe UI" w:eastAsia="Segoe UI"/>
-                <w:b w:val="0"/>
-                <w:color w:val="0A192F"/>
-                <w:sz w:val="24"/>
-                <w:szCs w:val="20"/>
-                <w:lang w:val="fr-FR"/>
-              </w:rPr>
-              <w:t xml:space="preserve">, </w:t>
-            </w:r>
-            <w:r>
-              <w:rPr>
-                <w:rStyle w:val="VerbatimChar"/>
-                <w:rFonts w:ascii="Segoe UI" w:hAnsi="Segoe UI" w:cs="Segoe UI" w:eastAsia="Segoe UI"/>
-                <w:b w:val="0"/>
-                <w:color w:val="0A192F"/>
-                <w:sz w:val="24"/>
-                <w:szCs w:val="19"/>
-                <w:lang w:val="fr-FR"/>
-              </w:rPr>
-              <w:t>lab_horizon_501.txt</w:t>
-            </w:r>
-          </w:p>
-        </w:tc>
-        <w:tc>
-          <w:tcPr>
-            <w:tcW w:w="3960" w:type="dxa"/>
-            <w:hideMark/>
-            <w:shd w:val="clear" w:color="auto" w:fill="FFFFFF"/>
-            <w:tcMar>
-              <w:top w:w="80" w:type="dxa"/>
-              <w:left w:w="120" w:type="dxa"/>
-              <w:bottom w:w="80" w:type="dxa"/>
-              <w:right w:w="120" w:type="dxa"/>
-            </w:tcMar>
-          </w:tcPr>
-          <w:p>
-            <w:pPr>
-              <w:pStyle w:val="Compact"/>
-              <w:spacing w:before="20" w:beforeAutospacing="1" w:after="20" w:afterAutospacing="1" w:line="276" w:lineRule="auto"/>
-              <w:ind w:left="0" w:right="0"/>
-            </w:pPr>
-            <w:r>
-              <w:rPr>
-                <w:rFonts w:ascii="Segoe UI" w:hAnsi="Segoe UI" w:cs="Segoe UI" w:eastAsia="Segoe UI"/>
-                <w:b w:val="0"/>
-                <w:color w:val="0A192F"/>
-                <w:sz w:val="24"/>
-                <w:szCs w:val="20"/>
-                <w:lang w:val="fr-FR"/>
-              </w:rPr>
-              <w:t>Archives Git ou exports ponctuels.</w:t>
-            </w:r>
-          </w:p>
-        </w:tc>
-      </w:tr>
-      <w:tr>
-        <w:tc>
-          <w:tcPr>
-            <w:tcW w:w="3960" w:type="dxa"/>
-            <w:hideMark/>
-            <w:shd w:val="clear" w:color="auto" w:fill="F3ECDA"/>
-            <w:tcMar>
-              <w:top w:w="80" w:type="dxa"/>
-              <w:left w:w="120" w:type="dxa"/>
-              <w:bottom w:w="80" w:type="dxa"/>
-              <w:right w:w="120" w:type="dxa"/>
-            </w:tcMar>
-          </w:tcPr>
-          <w:p>
-            <w:pPr>
-              <w:pStyle w:val="Compact"/>
-              <w:spacing w:before="20" w:beforeAutospacing="1" w:after="20" w:afterAutospacing="1" w:line="276" w:lineRule="auto"/>
-              <w:ind w:left="0" w:right="0"/>
-            </w:pPr>
-            <w:r>
-              <w:rPr>
-                <w:rStyle w:val="VerbatimChar"/>
-                <w:rFonts w:ascii="Segoe UI" w:hAnsi="Segoe UI" w:cs="Segoe UI" w:eastAsia="Segoe UI"/>
-                <w:b w:val="0"/>
-                <w:color w:val="0A192F"/>
-                <w:sz w:val="24"/>
-                <w:szCs w:val="19"/>
-                <w:lang w:val="fr-FR"/>
-              </w:rPr>
-              <w:t>LEANDRE PPP_3.srt</w:t>
-            </w:r>
-          </w:p>
-        </w:tc>
-        <w:tc>
-          <w:tcPr>
-            <w:tcW w:w="3960" w:type="dxa"/>
-            <w:hideMark/>
-            <w:shd w:val="clear" w:color="auto" w:fill="F3ECDA"/>
-            <w:tcMar>
-              <w:top w:w="80" w:type="dxa"/>
-              <w:left w:w="120" w:type="dxa"/>
-              <w:bottom w:w="80" w:type="dxa"/>
-              <w:right w:w="120" w:type="dxa"/>
-            </w:tcMar>
-          </w:tcPr>
-          <w:p>
-            <w:pPr>
-              <w:pStyle w:val="Compact"/>
-              <w:spacing w:before="20" w:beforeAutospacing="1" w:after="20" w:afterAutospacing="1" w:line="276" w:lineRule="auto"/>
-              <w:ind w:left="0" w:right="0"/>
-            </w:pPr>
-            <w:r>
-              <w:rPr>
-                <w:rFonts w:ascii="Segoe UI" w:hAnsi="Segoe UI" w:cs="Segoe UI" w:eastAsia="Segoe UI"/>
-                <w:b w:val="0"/>
-                <w:color w:val="0A192F"/>
-                <w:sz w:val="24"/>
-                <w:szCs w:val="20"/>
-                <w:lang w:val="fr-FR"/>
-              </w:rPr>
-              <w:t>Sous-titres d’une vidéo personnelle, hors projet.</w:t>
-            </w:r>
-          </w:p>
-        </w:tc>
-      </w:tr>
-    </w:tbl>
-    <w:p>
-      <w:pPr>
-        <w:pStyle w:val="Titre2"/>
-        <w:spacing w:before="280" w:after="120" w:line="276" w:lineRule="auto"/>
-        <w:ind w:left="0" w:right="0"/>
-      </w:pPr>
+      <w:bookmarkStart w:id="16" w:name="docker-qui-parle-à-qui"/>
+      <w:bookmarkStart w:id="17" w:name="_Toc243379728"/>
+      <w:bookmarkStart w:id="18" w:name="backend-points-utiles"/>
+      <w:bookmarkStart w:id="19" w:name="_Toc243379727"/>
+      <w:bookmarkEnd w:id="14"/>
       <w:r>
         <w:rPr>
           <w:rFonts w:ascii="Segoe UI" w:hAnsi="Segoe UI" w:cs="Segoe UI" w:eastAsia="Segoe UI"/>
@@ -9016,25 +8522,7 @@
           <w:sz w:val="22"/>
         </w:rPr>
         <w:t xml:space="preserve">git clone https://github.com/Vigourouxleandredesign/Lab_horizon_501.git</w:t>
-      </w:r>
-      <w:r>
-        <w:rPr>
-          <w:rStyle w:val="NormalTok"/>
-          <w:rFonts w:ascii="Consolas" w:hAnsi="Consolas" w:cs="Consolas" w:eastAsia="Consolas"/>
-          <w:b w:val="0"/>
-          <w:color w:val="0A192F"/>
-          <w:sz w:val="22"/>
-        </w:rPr>
         <w:br/>
-      </w:r>
-      <w:r>
-        <w:rPr>
-          <w:rStyle w:val="NormalTok"/>
-          <w:rFonts w:ascii="Consolas" w:hAnsi="Consolas" w:cs="Consolas" w:eastAsia="Consolas"/>
-          <w:b w:val="0"/>
-          <w:color w:val="0A192F"/>
-          <w:sz w:val="22"/>
-        </w:rPr>
         <w:t xml:space="preserve">cd Lab_horizon_501</w:t>
       </w:r>
     </w:p>
@@ -9303,25 +8791,7 @@
           <w:sz w:val="22"/>
         </w:rPr>
         <w:t xml:space="preserve">sh scripts/deploy/init-env.sh https://192.168.1.20</w:t>
-      </w:r>
-      <w:r>
-        <w:rPr>
-          <w:rStyle w:val="NormalTok"/>
-          <w:rFonts w:ascii="Consolas" w:hAnsi="Consolas" w:cs="Consolas" w:eastAsia="Consolas"/>
-          <w:b w:val="0"/>
-          <w:color w:val="0A192F"/>
-          <w:sz w:val="22"/>
-        </w:rPr>
         <w:br/>
-      </w:r>
-      <w:r>
-        <w:rPr>
-          <w:rStyle w:val="NormalTok"/>
-          <w:rFonts w:ascii="Consolas" w:hAnsi="Consolas" w:cs="Consolas" w:eastAsia="Consolas"/>
-          <w:b w:val="0"/>
-          <w:color w:val="0A192F"/>
-          <w:sz w:val="22"/>
-        </w:rPr>
         <w:t xml:space="preserve">sh scripts/deploy/init-env.sh https://labhorizon.exemple.nc</w:t>
       </w:r>
     </w:p>
@@ -11729,45 +11199,9 @@
           <w:sz w:val="22"/>
         </w:rPr>
         <w:t xml:space="preserve">docker compose down</w:t>
-      </w:r>
-      <w:r>
-        <w:rPr>
-          <w:rStyle w:val="NormalTok"/>
-          <w:rFonts w:ascii="Consolas" w:hAnsi="Consolas" w:cs="Consolas" w:eastAsia="Consolas"/>
-          <w:b w:val="0"/>
-          <w:color w:val="0A192F"/>
-          <w:sz w:val="22"/>
-        </w:rPr>
         <w:br/>
-      </w:r>
-      <w:r>
-        <w:rPr>
-          <w:rStyle w:val="NormalTok"/>
-          <w:rFonts w:ascii="Consolas" w:hAnsi="Consolas" w:cs="Consolas" w:eastAsia="Consolas"/>
-          <w:b w:val="0"/>
-          <w:color w:val="0A192F"/>
-          <w:sz w:val="22"/>
-        </w:rPr>
         <w:t xml:space="preserve">docker volume rm labhorizon_frontend-certs</w:t>
-      </w:r>
-      <w:r>
-        <w:rPr>
-          <w:rStyle w:val="NormalTok"/>
-          <w:rFonts w:ascii="Consolas" w:hAnsi="Consolas" w:cs="Consolas" w:eastAsia="Consolas"/>
-          <w:b w:val="0"/>
-          <w:color w:val="0A192F"/>
-          <w:sz w:val="22"/>
-        </w:rPr>
         <w:br/>
-      </w:r>
-      <w:r>
-        <w:rPr>
-          <w:rStyle w:val="NormalTok"/>
-          <w:rFonts w:ascii="Consolas" w:hAnsi="Consolas" w:cs="Consolas" w:eastAsia="Consolas"/>
-          <w:b w:val="0"/>
-          <w:color w:val="0A192F"/>
-          <w:sz w:val="22"/>
-        </w:rPr>
         <w:t xml:space="preserve">docker compose up -d</w:t>
       </w:r>
     </w:p>
@@ -11784,25 +11218,7 @@
           <w:color w:val="0A192F"/>
           <w:sz w:val="26"/>
         </w:rPr>
-        <w:t xml:space="preserve">Le jour où un nom de domaine existe, voir « Mettre un vrai certificat » dans </w:t>
-      </w:r>
-      <w:r>
-        <w:rPr>
-          <w:rFonts w:ascii="Segoe UI" w:hAnsi="Segoe UI" w:cs="Segoe UI" w:eastAsia="Segoe UI"/>
-          <w:b w:val="0"/>
-          <w:color w:val="0A192F"/>
-          <w:sz w:val="26"/>
-        </w:rPr>
-        <w:t xml:space="preserve">04 — Plan de maintenance</w:t>
-      </w:r>
-      <w:r>
-        <w:rPr>
-          <w:rFonts w:ascii="Segoe UI" w:hAnsi="Segoe UI" w:cs="Segoe UI" w:eastAsia="Segoe UI"/>
-          <w:b w:val="0"/>
-          <w:color w:val="0A192F"/>
-          <w:sz w:val="26"/>
-        </w:rPr>
-        <w:t xml:space="preserve">.</w:t>
+        <w:t xml:space="preserve">Le jour où un nom de domaine existe, voir « Mettre un vrai certificat » dans 04 — Plan de maintenance.</w:t>
       </w:r>
     </w:p>
     <w:p>
@@ -12114,45 +11530,9 @@
           <w:sz w:val="22"/>
         </w:rPr>
         <w:t xml:space="preserve">sh scripts/deploy/backup.sh          # Windows : scripts\deploy\backup.ps1</w:t>
-      </w:r>
-      <w:r>
-        <w:rPr>
-          <w:rStyle w:val="NormalTok"/>
-          <w:rFonts w:ascii="Consolas" w:hAnsi="Consolas" w:cs="Consolas" w:eastAsia="Consolas"/>
-          <w:b w:val="0"/>
-          <w:color w:val="0A192F"/>
-          <w:sz w:val="22"/>
-        </w:rPr>
         <w:br/>
-      </w:r>
-      <w:r>
-        <w:rPr>
-          <w:rStyle w:val="NormalTok"/>
-          <w:rFonts w:ascii="Consolas" w:hAnsi="Consolas" w:cs="Consolas" w:eastAsia="Consolas"/>
-          <w:b w:val="0"/>
-          <w:color w:val="0A192F"/>
-          <w:sz w:val="22"/>
-        </w:rPr>
         <w:t xml:space="preserve">git pull</w:t>
-      </w:r>
-      <w:r>
-        <w:rPr>
-          <w:rStyle w:val="NormalTok"/>
-          <w:rFonts w:ascii="Consolas" w:hAnsi="Consolas" w:cs="Consolas" w:eastAsia="Consolas"/>
-          <w:b w:val="0"/>
-          <w:color w:val="0A192F"/>
-          <w:sz w:val="22"/>
-        </w:rPr>
         <w:br/>
-      </w:r>
-      <w:r>
-        <w:rPr>
-          <w:rStyle w:val="NormalTok"/>
-          <w:rFonts w:ascii="Consolas" w:hAnsi="Consolas" w:cs="Consolas" w:eastAsia="Consolas"/>
-          <w:b w:val="0"/>
-          <w:color w:val="0A192F"/>
-          <w:sz w:val="22"/>
-        </w:rPr>
         <w:t xml:space="preserve">docker compose up -d --build</w:t>
       </w:r>
     </w:p>
@@ -12169,25 +11549,7 @@
           <w:color w:val="0A192F"/>
           <w:sz w:val="26"/>
         </w:rPr>
-        <w:t xml:space="preserve">Les migrations de base s’appliquent seules au démarrage : d’où la sauvegarde juste avant. Détail et restauration : </w:t>
-      </w:r>
-      <w:r>
-        <w:rPr>
-          <w:rFonts w:ascii="Segoe UI" w:hAnsi="Segoe UI" w:cs="Segoe UI" w:eastAsia="Segoe UI"/>
-          <w:b w:val="0"/>
-          <w:color w:val="0A192F"/>
-          <w:sz w:val="26"/>
-        </w:rPr>
-        <w:t xml:space="preserve">04 — Plan de maintenance</w:t>
-      </w:r>
-      <w:r>
-        <w:rPr>
-          <w:rFonts w:ascii="Segoe UI" w:hAnsi="Segoe UI" w:cs="Segoe UI" w:eastAsia="Segoe UI"/>
-          <w:b w:val="0"/>
-          <w:color w:val="0A192F"/>
-          <w:sz w:val="26"/>
-        </w:rPr>
-        <w:t xml:space="preserve">.</w:t>
+        <w:t xml:space="preserve">Les migrations de base s’appliquent seules au démarrage : d’où la sauvegarde juste avant. Détail et restauration : 04 — Plan de maintenance.</w:t>
       </w:r>
     </w:p>
     <w:p>
@@ -12225,65 +11587,11 @@
           <w:sz w:val="22"/>
         </w:rPr>
         <w:t xml:space="preserve">docker compose stop          # garde les volumes (base, PDF uploadés, certificat, config LM)</w:t>
-      </w:r>
-      <w:r>
-        <w:rPr>
-          <w:rStyle w:val="NormalTok"/>
-          <w:rFonts w:ascii="Consolas" w:hAnsi="Consolas" w:cs="Consolas" w:eastAsia="Consolas"/>
-          <w:b w:val="0"/>
-          <w:color w:val="0A192F"/>
-          <w:sz w:val="22"/>
-        </w:rPr>
         <w:br/>
-      </w:r>
-      <w:r>
-        <w:rPr>
-          <w:rStyle w:val="NormalTok"/>
-          <w:rFonts w:ascii="Consolas" w:hAnsi="Consolas" w:cs="Consolas" w:eastAsia="Consolas"/>
-          <w:b w:val="0"/>
-          <w:color w:val="0A192F"/>
-          <w:sz w:val="22"/>
-        </w:rPr>
         <w:t xml:space="preserve">docker compose start         # reprend les mêmes données</w:t>
-      </w:r>
-      <w:r>
-        <w:rPr>
-          <w:rStyle w:val="NormalTok"/>
-          <w:rFonts w:ascii="Consolas" w:hAnsi="Consolas" w:cs="Consolas" w:eastAsia="Consolas"/>
-          <w:b w:val="0"/>
-          <w:color w:val="0A192F"/>
-          <w:sz w:val="22"/>
-        </w:rPr>
         <w:br/>
-      </w:r>
-      <w:r>
-        <w:rPr>
-          <w:rStyle w:val="NormalTok"/>
-          <w:rFonts w:ascii="Consolas" w:hAnsi="Consolas" w:cs="Consolas" w:eastAsia="Consolas"/>
-          <w:b w:val="0"/>
-          <w:color w:val="0A192F"/>
-          <w:sz w:val="22"/>
-        </w:rPr>
         <w:t xml:space="preserve">docker compose down          # retire les conteneurs, garde les volumes</w:t>
-      </w:r>
-      <w:r>
-        <w:rPr>
-          <w:rStyle w:val="NormalTok"/>
-          <w:rFonts w:ascii="Consolas" w:hAnsi="Consolas" w:cs="Consolas" w:eastAsia="Consolas"/>
-          <w:b w:val="0"/>
-          <w:color w:val="0A192F"/>
-          <w:sz w:val="22"/>
-        </w:rPr>
         <w:br/>
-      </w:r>
-      <w:r>
-        <w:rPr>
-          <w:rStyle w:val="NormalTok"/>
-          <w:rFonts w:ascii="Consolas" w:hAnsi="Consolas" w:cs="Consolas" w:eastAsia="Consolas"/>
-          <w:b w:val="0"/>
-          <w:color w:val="0A192F"/>
-          <w:sz w:val="22"/>
-        </w:rPr>
         <w:t xml:space="preserve">docker compose down -v       # EFFACE aussi MySQL, Redis, PDF, certificat et LM Studio</w:t>
       </w:r>
     </w:p>
@@ -12418,85 +11726,13 @@
           <w:sz w:val="22"/>
         </w:rPr>
         <w:t xml:space="preserve">sh scripts/deploy/init-env.sh                                  # complète l'ancien .env (APP_KEY…)</w:t>
-      </w:r>
-      <w:r>
-        <w:rPr>
-          <w:rStyle w:val="NormalTok"/>
-          <w:rFonts w:ascii="Consolas" w:hAnsi="Consolas" w:cs="Consolas" w:eastAsia="Consolas"/>
-          <w:b w:val="0"/>
-          <w:color w:val="0A192F"/>
-          <w:sz w:val="22"/>
-        </w:rPr>
         <w:br/>
-      </w:r>
-      <w:r>
-        <w:rPr>
-          <w:rStyle w:val="NormalTok"/>
-          <w:rFonts w:ascii="Consolas" w:hAnsi="Consolas" w:cs="Consolas" w:eastAsia="Consolas"/>
-          <w:b w:val="0"/>
-          <w:color w:val="0A192F"/>
-          <w:sz w:val="22"/>
-        </w:rPr>
         <w:t xml:space="preserve">COMPOSE_PROJECT_NAME=projetsae501 sh scripts/deploy/backup.sh  # sauvegarde l'ancienne base</w:t>
-      </w:r>
-      <w:r>
-        <w:rPr>
-          <w:rStyle w:val="NormalTok"/>
-          <w:rFonts w:ascii="Consolas" w:hAnsi="Consolas" w:cs="Consolas" w:eastAsia="Consolas"/>
-          <w:b w:val="0"/>
-          <w:color w:val="0A192F"/>
-          <w:sz w:val="22"/>
-        </w:rPr>
         <w:br/>
-      </w:r>
-      <w:r>
-        <w:rPr>
-          <w:rStyle w:val="NormalTok"/>
-          <w:rFonts w:ascii="Consolas" w:hAnsi="Consolas" w:cs="Consolas" w:eastAsia="Consolas"/>
-          <w:b w:val="0"/>
-          <w:color w:val="0A192F"/>
-          <w:sz w:val="22"/>
-        </w:rPr>
         <w:t xml:space="preserve">docker compose -p projetsae501 down                            # arrête l'ancienne installation</w:t>
-      </w:r>
-      <w:r>
-        <w:rPr>
-          <w:rStyle w:val="NormalTok"/>
-          <w:rFonts w:ascii="Consolas" w:hAnsi="Consolas" w:cs="Consolas" w:eastAsia="Consolas"/>
-          <w:b w:val="0"/>
-          <w:color w:val="0A192F"/>
-          <w:sz w:val="22"/>
-        </w:rPr>
         <w:br/>
-      </w:r>
-      <w:r>
-        <w:rPr>
-          <w:rStyle w:val="NormalTok"/>
-          <w:rFonts w:ascii="Consolas" w:hAnsi="Consolas" w:cs="Consolas" w:eastAsia="Consolas"/>
-          <w:b w:val="0"/>
-          <w:color w:val="0A192F"/>
-          <w:sz w:val="22"/>
-        </w:rPr>
         <w:t xml:space="preserve">docker compose up -d --build</w:t>
-      </w:r>
-      <w:r>
-        <w:rPr>
-          <w:rStyle w:val="NormalTok"/>
-          <w:rFonts w:ascii="Consolas" w:hAnsi="Consolas" w:cs="Consolas" w:eastAsia="Consolas"/>
-          <w:b w:val="0"/>
-          <w:color w:val="0A192F"/>
-          <w:sz w:val="22"/>
-        </w:rPr>
         <w:br/>
-      </w:r>
-      <w:r>
-        <w:rPr>
-          <w:rStyle w:val="NormalTok"/>
-          <w:rFonts w:ascii="Consolas" w:hAnsi="Consolas" w:cs="Consolas" w:eastAsia="Consolas"/>
-          <w:b w:val="0"/>
-          <w:color w:val="0A192F"/>
-          <w:sz w:val="22"/>
-        </w:rPr>
         <w:t xml:space="preserve">sh scripts/deploy/restore.sh backups/labhorizon-&lt;date&gt;.tar.gz</w:t>
       </w:r>
     </w:p>
@@ -12535,85 +11771,13 @@
           <w:sz w:val="22"/>
         </w:rPr>
         <w:t xml:space="preserve">powershell -ExecutionPolicy Bypass -File scripts\deploy\init-env.ps1</w:t>
-      </w:r>
-      <w:r>
-        <w:rPr>
-          <w:rStyle w:val="NormalTok"/>
-          <w:rFonts w:ascii="Consolas" w:hAnsi="Consolas" w:cs="Consolas" w:eastAsia="Consolas"/>
-          <w:b w:val="0"/>
-          <w:color w:val="0A192F"/>
-          <w:sz w:val="22"/>
-        </w:rPr>
         <w:br/>
-      </w:r>
-      <w:r>
-        <w:rPr>
-          <w:rStyle w:val="NormalTok"/>
-          <w:rFonts w:ascii="Consolas" w:hAnsi="Consolas" w:cs="Consolas" w:eastAsia="Consolas"/>
-          <w:b w:val="0"/>
-          <w:color w:val="0A192F"/>
-          <w:sz w:val="22"/>
-        </w:rPr>
         <w:t xml:space="preserve">$env:COMPOSE_PROJECT_NAME = 'projetsae501'; powershell -ExecutionPolicy Bypass -File scripts\deploy\backup.ps1; Remove-Item Env:COMPOSE_PROJECT_NAME</w:t>
-      </w:r>
-      <w:r>
-        <w:rPr>
-          <w:rStyle w:val="NormalTok"/>
-          <w:rFonts w:ascii="Consolas" w:hAnsi="Consolas" w:cs="Consolas" w:eastAsia="Consolas"/>
-          <w:b w:val="0"/>
-          <w:color w:val="0A192F"/>
-          <w:sz w:val="22"/>
-        </w:rPr>
         <w:br/>
-      </w:r>
-      <w:r>
-        <w:rPr>
-          <w:rStyle w:val="NormalTok"/>
-          <w:rFonts w:ascii="Consolas" w:hAnsi="Consolas" w:cs="Consolas" w:eastAsia="Consolas"/>
-          <w:b w:val="0"/>
-          <w:color w:val="0A192F"/>
-          <w:sz w:val="22"/>
-        </w:rPr>
         <w:t xml:space="preserve">docker compose -p projetsae501 down</w:t>
-      </w:r>
-      <w:r>
-        <w:rPr>
-          <w:rStyle w:val="NormalTok"/>
-          <w:rFonts w:ascii="Consolas" w:hAnsi="Consolas" w:cs="Consolas" w:eastAsia="Consolas"/>
-          <w:b w:val="0"/>
-          <w:color w:val="0A192F"/>
-          <w:sz w:val="22"/>
-        </w:rPr>
         <w:br/>
-      </w:r>
-      <w:r>
-        <w:rPr>
-          <w:rStyle w:val="NormalTok"/>
-          <w:rFonts w:ascii="Consolas" w:hAnsi="Consolas" w:cs="Consolas" w:eastAsia="Consolas"/>
-          <w:b w:val="0"/>
-          <w:color w:val="0A192F"/>
-          <w:sz w:val="22"/>
-        </w:rPr>
         <w:t xml:space="preserve">docker compose up -d --build</w:t>
-      </w:r>
-      <w:r>
-        <w:rPr>
-          <w:rStyle w:val="NormalTok"/>
-          <w:rFonts w:ascii="Consolas" w:hAnsi="Consolas" w:cs="Consolas" w:eastAsia="Consolas"/>
-          <w:b w:val="0"/>
-          <w:color w:val="0A192F"/>
-          <w:sz w:val="22"/>
-        </w:rPr>
         <w:br/>
-      </w:r>
-      <w:r>
-        <w:rPr>
-          <w:rStyle w:val="NormalTok"/>
-          <w:rFonts w:ascii="Consolas" w:hAnsi="Consolas" w:cs="Consolas" w:eastAsia="Consolas"/>
-          <w:b w:val="0"/>
-          <w:color w:val="0A192F"/>
-          <w:sz w:val="22"/>
-        </w:rPr>
         <w:t xml:space="preserve">powershell -ExecutionPolicy Bypass -File scripts\deploy\restore.ps1 backups\labhorizon-&lt;date&gt;.tar.gz</w:t>
       </w:r>
     </w:p>
@@ -12773,45 +11937,9 @@
           <w:sz w:val="22"/>
         </w:rPr>
         <w:t xml:space="preserve">docker compose --profile llm up -d lm-studio</w:t>
-      </w:r>
-      <w:r>
-        <w:rPr>
-          <w:rStyle w:val="NormalTok"/>
-          <w:rFonts w:ascii="Consolas" w:hAnsi="Consolas" w:cs="Consolas" w:eastAsia="Consolas"/>
-          <w:b w:val="0"/>
-          <w:color w:val="0A192F"/>
-          <w:sz w:val="22"/>
-        </w:rPr>
         <w:br/>
-      </w:r>
-      <w:r>
-        <w:rPr>
-          <w:rStyle w:val="NormalTok"/>
-          <w:rFonts w:ascii="Consolas" w:hAnsi="Consolas" w:cs="Consolas" w:eastAsia="Consolas"/>
-          <w:b w:val="0"/>
-          <w:color w:val="0A192F"/>
-          <w:sz w:val="22"/>
-        </w:rPr>
         <w:t xml:space="preserve">docker compose exec lm-studio lms get mistral-7b-instruct-v0.3</w:t>
-      </w:r>
-      <w:r>
-        <w:rPr>
-          <w:rStyle w:val="NormalTok"/>
-          <w:rFonts w:ascii="Consolas" w:hAnsi="Consolas" w:cs="Consolas" w:eastAsia="Consolas"/>
-          <w:b w:val="0"/>
-          <w:color w:val="0A192F"/>
-          <w:sz w:val="22"/>
-        </w:rPr>
         <w:br/>
-      </w:r>
-      <w:r>
-        <w:rPr>
-          <w:rStyle w:val="NormalTok"/>
-          <w:rFonts w:ascii="Consolas" w:hAnsi="Consolas" w:cs="Consolas" w:eastAsia="Consolas"/>
-          <w:b w:val="0"/>
-          <w:color w:val="0A192F"/>
-          <w:sz w:val="22"/>
-        </w:rPr>
         <w:t xml:space="preserve">docker compose exec lm-studio lms load mistral-7b-instruct-v0.3</w:t>
       </w:r>
     </w:p>
@@ -13030,25 +12158,7 @@
           <w:color w:val="0A192F"/>
           <w:sz w:val="26"/>
         </w:rPr>
-        <w:t xml:space="preserve"> installe les hooks Git : les contrôles qualité et sécurité tournent ensuite à chaque commit (voir </w:t>
-      </w:r>
-      <w:r>
-        <w:rPr>
-          <w:rFonts w:ascii="Segoe UI" w:hAnsi="Segoe UI" w:cs="Segoe UI" w:eastAsia="Segoe UI"/>
-          <w:b w:val="0"/>
-          <w:color w:val="0A192F"/>
-          <w:sz w:val="26"/>
-        </w:rPr>
-        <w:t xml:space="preserve">04 — Plan de maintenance</w:t>
-      </w:r>
-      <w:r>
-        <w:rPr>
-          <w:rFonts w:ascii="Segoe UI" w:hAnsi="Segoe UI" w:cs="Segoe UI" w:eastAsia="Segoe UI"/>
-          <w:b w:val="0"/>
-          <w:color w:val="0A192F"/>
-          <w:sz w:val="26"/>
-        </w:rPr>
-        <w:t xml:space="preserve">).</w:t>
+        <w:t xml:space="preserve"> installe les hooks Git : les contrôles qualité et sécurité tournent ensuite à chaque commit (voir 04 — Plan de maintenance).</w:t>
       </w:r>
     </w:p>
     <w:p>
@@ -13143,45 +12253,9 @@
           <w:sz w:val="22"/>
         </w:rPr>
         <w:t xml:space="preserve">cd frontend</w:t>
-      </w:r>
-      <w:r>
-        <w:rPr>
-          <w:rStyle w:val="NormalTok"/>
-          <w:rFonts w:ascii="Consolas" w:hAnsi="Consolas" w:cs="Consolas" w:eastAsia="Consolas"/>
-          <w:b w:val="0"/>
-          <w:color w:val="0A192F"/>
-          <w:sz w:val="22"/>
-        </w:rPr>
         <w:br/>
-      </w:r>
-      <w:r>
-        <w:rPr>
-          <w:rStyle w:val="NormalTok"/>
-          <w:rFonts w:ascii="Consolas" w:hAnsi="Consolas" w:cs="Consolas" w:eastAsia="Consolas"/>
-          <w:b w:val="0"/>
-          <w:color w:val="0A192F"/>
-          <w:sz w:val="22"/>
-        </w:rPr>
         <w:t xml:space="preserve">npm install</w:t>
-      </w:r>
-      <w:r>
-        <w:rPr>
-          <w:rStyle w:val="NormalTok"/>
-          <w:rFonts w:ascii="Consolas" w:hAnsi="Consolas" w:cs="Consolas" w:eastAsia="Consolas"/>
-          <w:b w:val="0"/>
-          <w:color w:val="0A192F"/>
-          <w:sz w:val="22"/>
-        </w:rPr>
         <w:br/>
-      </w:r>
-      <w:r>
-        <w:rPr>
-          <w:rStyle w:val="NormalTok"/>
-          <w:rFonts w:ascii="Consolas" w:hAnsi="Consolas" w:cs="Consolas" w:eastAsia="Consolas"/>
-          <w:b w:val="0"/>
-          <w:color w:val="0A192F"/>
-          <w:sz w:val="22"/>
-        </w:rPr>
         <w:t xml:space="preserve">npm run dev</w:t>
       </w:r>
     </w:p>
@@ -17258,61 +16332,7 @@
           <w:color w:val="0A192F"/>
           <w:sz w:val="26"/>
         </w:rPr>
-        <w:t xml:space="preserve">Gestes à faire pour ne pas casser le dépôt. L’objectif de chaque contrôle, pour un évaluateur, est dans </w:t>
-      </w:r>
-      <w:r>
-        <w:rPr>
-          <w:rFonts w:ascii="Segoe UI" w:hAnsi="Segoe UI" w:cs="Segoe UI" w:eastAsia="Segoe UI"/>
-          <w:b w:val="0"/>
-          <w:color w:val="0A192F"/>
-          <w:sz w:val="26"/>
-        </w:rPr>
-        <w:t xml:space="preserve">06 — Contrôles qualité</w:t>
-      </w:r>
-      <w:r>
-        <w:rPr>
-          <w:rFonts w:ascii="Segoe UI" w:hAnsi="Segoe UI" w:cs="Segoe UI" w:eastAsia="Segoe UI"/>
-          <w:b w:val="0"/>
-          <w:color w:val="0A192F"/>
-          <w:sz w:val="26"/>
-        </w:rPr>
-        <w:t xml:space="preserve">. Le détail technique est dans </w:t>
-      </w:r>
-      <w:r>
-        <w:rPr>
-          <w:rFonts w:ascii="Segoe UI" w:hAnsi="Segoe UI" w:cs="Segoe UI" w:eastAsia="Segoe UI"/>
-          <w:b w:val="0"/>
-          <w:color w:val="0A192F"/>
-          <w:sz w:val="26"/>
-        </w:rPr>
-        <w:t xml:space="preserve">docs/TESTING.md</w:t>
-      </w:r>
-      <w:r>
-        <w:rPr>
-          <w:rFonts w:ascii="Segoe UI" w:hAnsi="Segoe UI" w:cs="Segoe UI" w:eastAsia="Segoe UI"/>
-          <w:b w:val="0"/>
-          <w:color w:val="0A192F"/>
-          <w:sz w:val="26"/>
-        </w:rPr>
-        <w:t xml:space="preserve">. Le démarrage pas à pas est dans </w:t>
-      </w:r>
-      <w:r>
-        <w:rPr>
-          <w:rFonts w:ascii="Segoe UI" w:hAnsi="Segoe UI" w:cs="Segoe UI" w:eastAsia="Segoe UI"/>
-          <w:b w:val="0"/>
-          <w:color w:val="0A192F"/>
-          <w:sz w:val="26"/>
-        </w:rPr>
-        <w:t xml:space="preserve">02 — Lancer et relancer</w:t>
-      </w:r>
-      <w:r>
-        <w:rPr>
-          <w:rFonts w:ascii="Segoe UI" w:hAnsi="Segoe UI" w:cs="Segoe UI" w:eastAsia="Segoe UI"/>
-          <w:b w:val="0"/>
-          <w:color w:val="0A192F"/>
-          <w:sz w:val="26"/>
-        </w:rPr>
-        <w:t xml:space="preserve">.</w:t>
+        <w:t xml:space="preserve">Gestes à faire pour ne pas casser le dépôt. L’objectif de chaque contrôle, pour un évaluateur, est dans 06 — Contrôles qualité. Le détail technique est dans docs/TESTING.md. Le démarrage pas à pas est dans 02 — Lancer et relancer.</w:t>
       </w:r>
     </w:p>
     <w:p>
@@ -18419,25 +17439,7 @@
           <w:color w:val="0A192F"/>
           <w:sz w:val="26"/>
         </w:rPr>
-        <w:t xml:space="preserve">Sans domaine, le certificat auto-signé suffit (voir </w:t>
-      </w:r>
-      <w:r>
-        <w:rPr>
-          <w:rFonts w:ascii="Segoe UI" w:hAnsi="Segoe UI" w:cs="Segoe UI" w:eastAsia="Segoe UI"/>
-          <w:b w:val="0"/>
-          <w:color w:val="0A192F"/>
-          <w:sz w:val="26"/>
-        </w:rPr>
-        <w:t xml:space="preserve">02 — Lancer et relancer</w:t>
-      </w:r>
-      <w:r>
-        <w:rPr>
-          <w:rFonts w:ascii="Segoe UI" w:hAnsi="Segoe UI" w:cs="Segoe UI" w:eastAsia="Segoe UI"/>
-          <w:b w:val="0"/>
-          <w:color w:val="0A192F"/>
-          <w:sz w:val="26"/>
-        </w:rPr>
-        <w:t xml:space="preserve">). Avec un domaine :</w:t>
+        <w:t xml:space="preserve">Sans domaine, le certificat auto-signé suffit (voir 02 — Lancer et relancer). Avec un domaine :</w:t>
       </w:r>
     </w:p>
     <w:p>
@@ -18785,45 +17787,9 @@
           <w:sz w:val="22"/>
         </w:rPr>
         <w:t xml:space="preserve">sh scripts/deploy/backup.sh          # Windows : scripts\deploy\backup.ps1</w:t>
-      </w:r>
-      <w:r>
-        <w:rPr>
-          <w:rStyle w:val="NormalTok"/>
-          <w:rFonts w:ascii="Consolas" w:hAnsi="Consolas" w:cs="Consolas" w:eastAsia="Consolas"/>
-          <w:b w:val="0"/>
-          <w:color w:val="0A192F"/>
-          <w:sz w:val="22"/>
-        </w:rPr>
         <w:br/>
-      </w:r>
-      <w:r>
-        <w:rPr>
-          <w:rStyle w:val="NormalTok"/>
-          <w:rFonts w:ascii="Consolas" w:hAnsi="Consolas" w:cs="Consolas" w:eastAsia="Consolas"/>
-          <w:b w:val="0"/>
-          <w:color w:val="0A192F"/>
-          <w:sz w:val="22"/>
-        </w:rPr>
         <w:t xml:space="preserve">git pull</w:t>
-      </w:r>
-      <w:r>
-        <w:rPr>
-          <w:rStyle w:val="NormalTok"/>
-          <w:rFonts w:ascii="Consolas" w:hAnsi="Consolas" w:cs="Consolas" w:eastAsia="Consolas"/>
-          <w:b w:val="0"/>
-          <w:color w:val="0A192F"/>
-          <w:sz w:val="22"/>
-        </w:rPr>
         <w:br/>
-      </w:r>
-      <w:r>
-        <w:rPr>
-          <w:rStyle w:val="NormalTok"/>
-          <w:rFonts w:ascii="Consolas" w:hAnsi="Consolas" w:cs="Consolas" w:eastAsia="Consolas"/>
-          <w:b w:val="0"/>
-          <w:color w:val="0A192F"/>
-          <w:sz w:val="22"/>
-        </w:rPr>
         <w:t xml:space="preserve">docker compose up -d --build</w:t>
       </w:r>
     </w:p>
@@ -22031,61 +20997,37 @@
             </w:pPr>
             <w:r>
               <w:rPr>
+                <w:rFonts w:ascii="Segoe UI" w:hAnsi="Segoe UI" w:cs="Segoe UI" w:eastAsia="Segoe UI"/>
+                <w:b w:val="0"/>
+                <w:color w:val="0A192F"/>
+                <w:sz w:val="24"/>
+                <w:szCs w:val="20"/>
+                <w:lang w:val="fr-FR"/>
+              </w:rPr>
+              <w:t xml:space="preserve">Protocole de revue de sécurité (</w:t>
+            </w:r>
+            <w:r>
+              <w:rPr>
                 <w:rStyle w:val="VerbatimChar"/>
                 <w:rFonts w:ascii="Segoe UI" w:hAnsi="Segoe UI" w:cs="Segoe UI" w:eastAsia="Segoe UI"/>
                 <w:b w:val="0"/>
                 <w:color w:val="0A192F"/>
                 <w:sz w:val="24"/>
-                <w:szCs w:val="19"/>
-                <w:lang w:val="fr-FR"/>
-              </w:rPr>
-              <w:t>v2.zip</w:t>
-            </w:r>
-            <w:r>
-              <w:rPr>
-                <w:rFonts w:ascii="Segoe UI" w:hAnsi="Segoe UI" w:cs="Segoe UI" w:eastAsia="Segoe UI"/>
-                <w:b w:val="0"/>
-                <w:color w:val="0A192F"/>
-                <w:sz w:val="24"/>
-                <w:szCs w:val="20"/>
-                <w:lang w:val="fr-FR"/>
-              </w:rPr>
-              <w:t xml:space="preserve">, </w:t>
-            </w:r>
-            <w:r>
-              <w:rPr>
-                <w:rStyle w:val="VerbatimChar"/>
-                <w:rFonts w:ascii="Segoe UI" w:hAnsi="Segoe UI" w:cs="Segoe UI" w:eastAsia="Segoe UI"/>
-                <w:b w:val="0"/>
-                <w:color w:val="0A192F"/>
-                <w:sz w:val="24"/>
-                <w:szCs w:val="19"/>
-                <w:lang w:val="fr-FR"/>
-              </w:rPr>
-              <w:t>redteam-preprod-audit.zip</w:t>
-            </w:r>
-            <w:r>
-              <w:rPr>
-                <w:rFonts w:ascii="Segoe UI" w:hAnsi="Segoe UI" w:cs="Segoe UI" w:eastAsia="Segoe UI"/>
-                <w:b w:val="0"/>
-                <w:color w:val="0A192F"/>
-                <w:sz w:val="24"/>
-                <w:szCs w:val="20"/>
-                <w:lang w:val="fr-FR"/>
-              </w:rPr>
-              <w:t xml:space="preserve">, </w:t>
-            </w:r>
-            <w:r>
-              <w:rPr>
-                <w:rStyle w:val="VerbatimChar"/>
-                <w:rFonts w:ascii="Segoe UI" w:hAnsi="Segoe UI" w:cs="Segoe UI" w:eastAsia="Segoe UI"/>
-                <w:b w:val="0"/>
-                <w:color w:val="0A192F"/>
-                <w:sz w:val="24"/>
-                <w:szCs w:val="19"/>
-                <w:lang w:val="fr-FR"/>
-              </w:rPr>
-              <w:t>v2.1.zip</w:t>
+                <w:szCs w:val="20"/>
+                <w:lang w:val="fr-FR"/>
+              </w:rPr>
+              <w:t xml:space="preserve">.cursor/skills/revue-securite-preprod/</w:t>
+            </w:r>
+            <w:r>
+              <w:rPr>
+                <w:rFonts w:ascii="Segoe UI" w:hAnsi="Segoe UI" w:cs="Segoe UI" w:eastAsia="Segoe UI"/>
+                <w:b w:val="0"/>
+                <w:color w:val="0A192F"/>
+                <w:sz w:val="24"/>
+                <w:szCs w:val="20"/>
+                <w:lang w:val="fr-FR"/>
+              </w:rPr>
+              <w:t xml:space="preserve">)</w:t>
             </w:r>
           </w:p>
         </w:tc>
@@ -22116,160 +21058,7 @@
                 <w:szCs w:val="20"/>
                 <w:lang w:val="fr-FR"/>
               </w:rPr>
-              <w:t xml:space="preserve">Archives du protocole. La copie à utiliser est le skill versionné</w:t>
-            </w:r>
-          </w:p>
-        </w:tc>
-      </w:tr>
-      <w:tr>
-        <w:tc>
-          <w:tcPr>
-            <w:tcW w:w="3751" w:type="dxa"/>
-            <w:hideMark/>
-            <w:shd w:val="clear" w:color="auto" w:fill="FFFFFF"/>
-            <w:tcMar>
-              <w:top w:w="80" w:type="dxa"/>
-              <w:left w:w="120" w:type="dxa"/>
-              <w:bottom w:w="80" w:type="dxa"/>
-              <w:right w:w="120" w:type="dxa"/>
-            </w:tcMar>
-          </w:tcPr>
-          <w:p>
-            <w:pPr>
-              <w:pStyle w:val="Compact"/>
-              <w:spacing w:before="20" w:beforeAutospacing="1" w:after="20" w:afterAutospacing="1" w:line="276" w:lineRule="auto"/>
-              <w:ind w:left="0" w:right="0"/>
-            </w:pPr>
-            <w:r>
-              <w:rPr>
-                <w:rStyle w:val="VerbatimChar"/>
-                <w:rFonts w:ascii="Segoe UI" w:hAnsi="Segoe UI" w:cs="Segoe UI" w:eastAsia="Segoe UI"/>
-                <w:b w:val="0"/>
-                <w:color w:val="0A192F"/>
-                <w:sz w:val="24"/>
-                <w:szCs w:val="19"/>
-                <w:lang w:val="fr-FR"/>
-              </w:rPr>
-              <w:t>*.bundle</w:t>
-            </w:r>
-            <w:r>
-              <w:rPr>
-                <w:rFonts w:ascii="Segoe UI" w:hAnsi="Segoe UI" w:cs="Segoe UI" w:eastAsia="Segoe UI"/>
-                <w:b w:val="0"/>
-                <w:color w:val="0A192F"/>
-                <w:sz w:val="24"/>
-                <w:szCs w:val="20"/>
-                <w:lang w:val="fr-FR"/>
-              </w:rPr>
-              <w:t xml:space="preserve">, </w:t>
-            </w:r>
-            <w:r>
-              <w:rPr>
-                <w:rStyle w:val="VerbatimChar"/>
-                <w:rFonts w:ascii="Segoe UI" w:hAnsi="Segoe UI" w:cs="Segoe UI" w:eastAsia="Segoe UI"/>
-                <w:b w:val="0"/>
-                <w:color w:val="0A192F"/>
-                <w:sz w:val="24"/>
-                <w:szCs w:val="19"/>
-                <w:lang w:val="fr-FR"/>
-              </w:rPr>
-              <w:t>lab_horizon_501.txt</w:t>
-            </w:r>
-          </w:p>
-        </w:tc>
-        <w:tc>
-          <w:tcPr>
-            <w:tcW w:w="4168" w:type="dxa"/>
-            <w:hideMark/>
-            <w:shd w:val="clear" w:color="auto" w:fill="FFFFFF"/>
-            <w:tcMar>
-              <w:top w:w="80" w:type="dxa"/>
-              <w:left w:w="120" w:type="dxa"/>
-              <w:bottom w:w="80" w:type="dxa"/>
-              <w:right w:w="120" w:type="dxa"/>
-            </w:tcMar>
-          </w:tcPr>
-          <w:p>
-            <w:pPr>
-              <w:pStyle w:val="Compact"/>
-              <w:spacing w:before="20" w:beforeAutospacing="1" w:after="20" w:afterAutospacing="1" w:line="276" w:lineRule="auto"/>
-              <w:ind w:left="0" w:right="0"/>
-            </w:pPr>
-            <w:r>
-              <w:rPr>
-                <w:rFonts w:ascii="Segoe UI" w:hAnsi="Segoe UI" w:cs="Segoe UI" w:eastAsia="Segoe UI"/>
-                <w:b w:val="0"/>
-                <w:color w:val="0A192F"/>
-                <w:sz w:val="24"/>
-                <w:szCs w:val="20"/>
-                <w:lang w:val="fr-FR"/>
-              </w:rPr>
-              <w:t>Archives ou exports ponctuels</w:t>
-            </w:r>
-          </w:p>
-        </w:tc>
-      </w:tr>
-      <w:tr>
-        <w:tc>
-          <w:tcPr>
-            <w:tcW w:w="3751" w:type="dxa"/>
-            <w:hideMark/>
-            <w:shd w:val="clear" w:color="auto" w:fill="F3ECDA"/>
-            <w:tcMar>
-              <w:top w:w="80" w:type="dxa"/>
-              <w:left w:w="120" w:type="dxa"/>
-              <w:bottom w:w="80" w:type="dxa"/>
-              <w:right w:w="120" w:type="dxa"/>
-            </w:tcMar>
-          </w:tcPr>
-          <w:p>
-            <w:pPr>
-              <w:pStyle w:val="Compact"/>
-              <w:spacing w:before="20" w:beforeAutospacing="1" w:after="20" w:afterAutospacing="1" w:line="276" w:lineRule="auto"/>
-              <w:ind w:left="0" w:right="0"/>
-            </w:pPr>
-            <w:r>
-              <w:rPr>
-                <w:rStyle w:val="VerbatimChar"/>
-                <w:rFonts w:ascii="Segoe UI" w:hAnsi="Segoe UI" w:cs="Segoe UI" w:eastAsia="Segoe UI"/>
-                <w:b w:val="0"/>
-                <w:color w:val="0A192F"/>
-                <w:sz w:val="24"/>
-                <w:szCs w:val="19"/>
-                <w:lang w:val="fr-FR"/>
-              </w:rPr>
-              <w:t>LEANDRE PPP_3.srt</w:t>
-            </w:r>
-          </w:p>
-        </w:tc>
-        <w:tc>
-          <w:tcPr>
-            <w:tcW w:w="4168" w:type="dxa"/>
-            <w:hideMark/>
-            <w:shd w:val="clear" w:color="auto" w:fill="F3ECDA"/>
-            <w:tcMar>
-              <w:top w:w="80" w:type="dxa"/>
-              <w:left w:w="120" w:type="dxa"/>
-              <w:bottom w:w="80" w:type="dxa"/>
-              <w:right w:w="120" w:type="dxa"/>
-            </w:tcMar>
-          </w:tcPr>
-          <w:p>
-            <w:pPr>
-              <w:pStyle w:val="Compact"/>
-              <w:spacing w:before="20" w:beforeAutospacing="1" w:after="20" w:afterAutospacing="1" w:line="276" w:lineRule="auto"/>
-              <w:ind w:left="0" w:right="0"/>
-            </w:pPr>
-            <w:r>
-              <w:rPr>
-                <w:rFonts w:ascii="Segoe UI" w:hAnsi="Segoe UI" w:cs="Segoe UI" w:eastAsia="Segoe UI"/>
-                <w:b w:val="0"/>
-                <w:color w:val="0A192F"/>
-                <w:sz w:val="24"/>
-                <w:szCs w:val="20"/>
-                <w:lang w:val="fr-FR"/>
-              </w:rPr>
-              <w:t>Fichier personnel, hors produit</w:t>
+              <w:t xml:space="preserve">Installé localement, non versionné. Son corpus de test ne voyage pas avec le code</w:t>
             </w:r>
           </w:p>
         </w:tc>
@@ -25404,16 +24193,16 @@
           <w:color w:val="0A192F"/>
           <w:sz w:val="26"/>
         </w:rPr>
-        <w:t>revue-securite-preprod</w:t>
-      </w:r>
-      <w:r>
-        <w:rPr>
-          <w:rFonts w:ascii="Segoe UI" w:hAnsi="Segoe UI" w:cs="Segoe UI" w:eastAsia="Segoe UI"/>
-          <w:b w:val="0"/>
-          <w:color w:val="0A192F"/>
-          <w:sz w:val="26"/>
-        </w:rPr>
-        <w:t xml:space="preserve"> 2.1.0 est dans </w:t>
+        <w:t xml:space="preserve">revue-securite-preprod</w:t>
+      </w:r>
+      <w:r>
+        <w:rPr>
+          <w:rFonts w:ascii="Segoe UI" w:hAnsi="Segoe UI" w:cs="Segoe UI" w:eastAsia="Segoe UI"/>
+          <w:b w:val="0"/>
+          <w:color w:val="0A192F"/>
+          <w:sz w:val="26"/>
+        </w:rPr>
+        <w:t xml:space="preserve"> 2.1.0 est installé localement dans </w:t>
       </w:r>
       <w:r>
         <w:rPr>
@@ -25423,73 +24212,16 @@
           <w:color w:val="0A192F"/>
           <w:sz w:val="26"/>
         </w:rPr>
-        <w:t>.cursor/skills/revue-securite-preprod/</w:t>
-      </w:r>
-      <w:r>
-        <w:rPr>
-          <w:rFonts w:ascii="Segoe UI" w:hAnsi="Segoe UI" w:cs="Segoe UI" w:eastAsia="Segoe UI"/>
-          <w:b w:val="0"/>
-          <w:color w:val="0A192F"/>
-          <w:sz w:val="26"/>
-        </w:rPr>
-        <w:t xml:space="preserve">. C’est la copie de </w:t>
-      </w:r>
-      <w:r>
-        <w:rPr>
-          <w:rStyle w:val="VerbatimChar"/>
-          <w:rFonts w:ascii="Segoe UI" w:hAnsi="Segoe UI" w:cs="Segoe UI" w:eastAsia="Segoe UI"/>
-          <w:b w:val="0"/>
-          <w:color w:val="0A192F"/>
-          <w:sz w:val="26"/>
-        </w:rPr>
-        <w:t>v2.1.zip</w:t>
-      </w:r>
-      <w:r>
-        <w:rPr>
-          <w:rFonts w:ascii="Segoe UI" w:hAnsi="Segoe UI" w:cs="Segoe UI" w:eastAsia="Segoe UI"/>
-          <w:b w:val="0"/>
-          <w:color w:val="0A192F"/>
-          <w:sz w:val="26"/>
-        </w:rPr>
-        <w:t xml:space="preserve">, sans modification du texte. Les dossiers </w:t>
-      </w:r>
-      <w:r>
-        <w:rPr>
-          <w:rStyle w:val="VerbatimChar"/>
-          <w:rFonts w:ascii="Segoe UI" w:hAnsi="Segoe UI" w:cs="Segoe UI" w:eastAsia="Segoe UI"/>
-          <w:b w:val="0"/>
-          <w:color w:val="0A192F"/>
-          <w:sz w:val="26"/>
-        </w:rPr>
-        <w:t>v2/</w:t>
-      </w:r>
-      <w:r>
-        <w:rPr>
-          <w:rFonts w:ascii="Segoe UI" w:hAnsi="Segoe UI" w:cs="Segoe UI" w:eastAsia="Segoe UI"/>
-          <w:b w:val="0"/>
-          <w:color w:val="0A192F"/>
-          <w:sz w:val="26"/>
-        </w:rPr>
-        <w:t xml:space="preserve"> et </w:t>
-      </w:r>
-      <w:r>
-        <w:rPr>
-          <w:rStyle w:val="VerbatimChar"/>
-          <w:rFonts w:ascii="Segoe UI" w:hAnsi="Segoe UI" w:cs="Segoe UI" w:eastAsia="Segoe UI"/>
-          <w:b w:val="0"/>
-          <w:color w:val="0A192F"/>
-          <w:sz w:val="26"/>
-        </w:rPr>
-        <w:t>redteam-preprod-audit/</w:t>
-      </w:r>
-      <w:r>
-        <w:rPr>
-          <w:rFonts w:ascii="Segoe UI" w:hAnsi="Segoe UI" w:cs="Segoe UI" w:eastAsia="Segoe UI"/>
-          <w:b w:val="0"/>
-          <w:color w:val="0A192F"/>
-          <w:sz w:val="26"/>
-        </w:rPr>
-        <w:t xml:space="preserve"> restent des archives.</w:t>
+        <w:t xml:space="preserve">.cursor/skills/revue-securite-preprod/</w:t>
+      </w:r>
+      <w:r>
+        <w:rPr>
+          <w:rFonts w:ascii="Segoe UI" w:hAnsi="Segoe UI" w:cs="Segoe UI" w:eastAsia="Segoe UI"/>
+          <w:b w:val="0"/>
+          <w:color w:val="0A192F"/>
+          <w:sz w:val="26"/>
+        </w:rPr>
+        <w:t xml:space="preserve">. Il n’est pas versionné : son corpus de test et ses archives restent hors dépôt. Le texte du protocole n’a pas été modifié.</w:t>
       </w:r>
     </w:p>
     <w:p>

</xml_diff>